<commit_message>
docs: add exact system specifications table (CPU, GPU, RAM, Environment) to all 8 Word reports
</commit_message>
<xml_diff>
--- a/1_RGB_train.docx
+++ b/1_RGB_train.docx
@@ -513,7 +513,7 @@
           <w:i w:val="0"/>
           <w:sz w:val="23"/>
         </w:rPr>
-        <w:t>Tabel 1 merangkum spesifikasi perangkat lunak, perangkat keras, dan pustaka komputasi yang digunakan pada eksperimen ini:</w:t>
+        <w:t>Tabel 1 merangkum spesifikasi perangkat lunak, perangkat keras, dan lingkungan komputasi yang digunakan pada eksperimen ini:</w:t>
       </w:r>
     </w:p>
     <w:tbl>
@@ -523,12 +523,12 @@
         <w:tblLayout w:type="fixed"/>
         <w:tblLook w:firstColumn="1" w:firstRow="1" w:lastColumn="0" w:lastRow="0" w:noHBand="0" w:noVBand="1" w:val="04A0"/>
         <w:tblBorders>
-          <w:top w:val="single" w:sz="4" w:space="0" w:color="C5D0C8"/>
-          <w:bottom w:val="single" w:sz="4" w:space="0" w:color="C5D0C8"/>
-          <w:insideH w:val="single" w:sz="4" w:space="0" w:color="C5D0C8"/>
-          <w:insideV w:val="none"/>
-          <w:left w:val="none"/>
-          <w:right w:val="none"/>
+          <w:top w:val="single" w:sz="4" w:space="0" w:color="000000"/>
+          <w:bottom w:val="single" w:sz="4" w:space="0" w:color="000000"/>
+          <w:left w:val="single" w:sz="4" w:space="0" w:color="000000"/>
+          <w:right w:val="single" w:sz="4" w:space="0" w:color="000000"/>
+          <w:insideH w:val="single" w:sz="4" w:space="0" w:color="000000"/>
+          <w:insideV w:val="single" w:sz="4" w:space="0" w:color="000000"/>
         </w:tblBorders>
       </w:tblPr>
       <w:tblGrid>
@@ -538,55 +538,53 @@
       <w:tr>
         <w:tc>
           <w:tcPr>
-            <w:tcW w:type="dxa" w:w="3456"/>
-            <w:shd w:fill="2E5339"/>
+            <w:tcW w:type="dxa" w:w="2592"/>
+            <w:shd w:fill="FFFFFF"/>
             <w:tcMar>
-              <w:top w:w="120" w:type="dxa"/>
-              <w:bottom w:w="120" w:type="dxa"/>
-              <w:left w:w="140" w:type="dxa"/>
-              <w:right w:w="140" w:type="dxa"/>
+              <w:top w:w="100" w:type="dxa"/>
+              <w:bottom w:w="100" w:type="dxa"/>
+              <w:left w:w="130" w:type="dxa"/>
+              <w:right w:w="130" w:type="dxa"/>
             </w:tcMar>
           </w:tcPr>
           <w:p>
             <w:pPr>
-              <w:spacing w:before="0" w:after="0"/>
-              <w:jc w:val="center"/>
+              <w:jc w:val="left"/>
             </w:pPr>
             <w:r>
               <w:rPr>
                 <w:rFonts w:ascii="Times New Roman" w:hAnsi="Times New Roman"/>
                 <w:b/>
-                <w:color w:val="FFFFFF"/>
-                <w:sz w:val="20"/>
+                <w:color w:val="000000"/>
+                <w:sz w:val="21"/>
               </w:rPr>
-              <w:t>Parameter / Komponen</w:t>
+              <w:t>Item</w:t>
             </w:r>
           </w:p>
         </w:tc>
         <w:tc>
           <w:tcPr>
-            <w:tcW w:type="dxa" w:w="5573"/>
-            <w:shd w:fill="2E5339"/>
+            <w:tcW w:type="dxa" w:w="6437"/>
+            <w:shd w:fill="FFFFFF"/>
             <w:tcMar>
-              <w:top w:w="120" w:type="dxa"/>
-              <w:bottom w:w="120" w:type="dxa"/>
-              <w:left w:w="140" w:type="dxa"/>
-              <w:right w:w="140" w:type="dxa"/>
+              <w:top w:w="100" w:type="dxa"/>
+              <w:bottom w:w="100" w:type="dxa"/>
+              <w:left w:w="130" w:type="dxa"/>
+              <w:right w:w="130" w:type="dxa"/>
             </w:tcMar>
           </w:tcPr>
           <w:p>
             <w:pPr>
-              <w:spacing w:before="0" w:after="0"/>
-              <w:jc w:val="center"/>
+              <w:jc w:val="left"/>
             </w:pPr>
             <w:r>
               <w:rPr>
                 <w:rFonts w:ascii="Times New Roman" w:hAnsi="Times New Roman"/>
                 <w:b/>
-                <w:color w:val="FFFFFF"/>
-                <w:sz w:val="20"/>
+                <w:color w:val="000000"/>
+                <w:sz w:val="21"/>
               </w:rPr>
-              <w:t>Keterangan Spesifikasi</w:t>
+              <w:t>Keterangan</w:t>
             </w:r>
           </w:p>
         </w:tc>
@@ -594,49 +592,51 @@
       <w:tr>
         <w:tc>
           <w:tcPr>
-            <w:tcW w:type="dxa" w:w="3456"/>
+            <w:tcW w:type="dxa" w:w="2592"/>
             <w:shd w:fill="FFFFFF"/>
             <w:tcMar>
-              <w:top w:w="80" w:type="dxa"/>
-              <w:bottom w:w="80" w:type="dxa"/>
+              <w:top w:w="85" w:type="dxa"/>
+              <w:bottom w:w="85" w:type="dxa"/>
               <w:left w:w="120" w:type="dxa"/>
               <w:right w:w="120" w:type="dxa"/>
             </w:tcMar>
           </w:tcPr>
           <w:p>
             <w:pPr>
-              <w:spacing w:before="0" w:after="0"/>
-              <w:jc w:val="center"/>
+              <w:jc w:val="left"/>
             </w:pPr>
             <w:r>
               <w:rPr>
                 <w:rFonts w:ascii="Times New Roman" w:hAnsi="Times New Roman"/>
-                <w:sz w:val="19"/>
+                <w:b w:val="0"/>
+                <w:color w:val="000000"/>
+                <w:sz w:val="20"/>
               </w:rPr>
-              <w:t>Nama Notebook</w:t>
+              <w:t>Sumber Kode</w:t>
             </w:r>
           </w:p>
         </w:tc>
         <w:tc>
           <w:tcPr>
-            <w:tcW w:type="dxa" w:w="5573"/>
+            <w:tcW w:type="dxa" w:w="6437"/>
             <w:shd w:fill="FFFFFF"/>
             <w:tcMar>
-              <w:top w:w="80" w:type="dxa"/>
-              <w:bottom w:w="80" w:type="dxa"/>
+              <w:top w:w="85" w:type="dxa"/>
+              <w:bottom w:w="85" w:type="dxa"/>
               <w:left w:w="120" w:type="dxa"/>
               <w:right w:w="120" w:type="dxa"/>
             </w:tcMar>
           </w:tcPr>
           <w:p>
             <w:pPr>
-              <w:spacing w:before="0" w:after="0"/>
               <w:jc w:val="left"/>
             </w:pPr>
             <w:r>
               <w:rPr>
                 <w:rFonts w:ascii="Times New Roman" w:hAnsi="Times New Roman"/>
-                <w:sz w:val="19"/>
+                <w:b w:val="0"/>
+                <w:color w:val="000000"/>
+                <w:sz w:val="20"/>
               </w:rPr>
               <w:t>1_RGB_train.ipynb</w:t>
             </w:r>
@@ -646,51 +646,53 @@
       <w:tr>
         <w:tc>
           <w:tcPr>
-            <w:tcW w:type="dxa" w:w="3456"/>
-            <w:shd w:fill="F4F7F5"/>
+            <w:tcW w:type="dxa" w:w="2592"/>
+            <w:shd w:fill="FFFFFF"/>
             <w:tcMar>
-              <w:top w:w="80" w:type="dxa"/>
-              <w:bottom w:w="80" w:type="dxa"/>
+              <w:top w:w="85" w:type="dxa"/>
+              <w:bottom w:w="85" w:type="dxa"/>
               <w:left w:w="120" w:type="dxa"/>
               <w:right w:w="120" w:type="dxa"/>
             </w:tcMar>
           </w:tcPr>
           <w:p>
             <w:pPr>
-              <w:spacing w:before="0" w:after="0"/>
-              <w:jc w:val="center"/>
+              <w:jc w:val="left"/>
             </w:pPr>
             <w:r>
               <w:rPr>
                 <w:rFonts w:ascii="Times New Roman" w:hAnsi="Times New Roman"/>
-                <w:sz w:val="19"/>
+                <w:b w:val="0"/>
+                <w:color w:val="000000"/>
+                <w:sz w:val="20"/>
               </w:rPr>
-              <w:t>Bahasa &amp; Framework</w:t>
+              <w:t>Environment</w:t>
             </w:r>
           </w:p>
         </w:tc>
         <w:tc>
           <w:tcPr>
-            <w:tcW w:type="dxa" w:w="5573"/>
-            <w:shd w:fill="F4F7F5"/>
+            <w:tcW w:type="dxa" w:w="6437"/>
+            <w:shd w:fill="FFFFFF"/>
             <w:tcMar>
-              <w:top w:w="80" w:type="dxa"/>
-              <w:bottom w:w="80" w:type="dxa"/>
+              <w:top w:w="85" w:type="dxa"/>
+              <w:bottom w:w="85" w:type="dxa"/>
               <w:left w:w="120" w:type="dxa"/>
               <w:right w:w="120" w:type="dxa"/>
             </w:tcMar>
           </w:tcPr>
           <w:p>
             <w:pPr>
-              <w:spacing w:before="0" w:after="0"/>
               <w:jc w:val="left"/>
             </w:pPr>
             <w:r>
               <w:rPr>
                 <w:rFonts w:ascii="Times New Roman" w:hAnsi="Times New Roman"/>
-                <w:sz w:val="19"/>
+                <w:b w:val="0"/>
+                <w:color w:val="000000"/>
+                <w:sz w:val="20"/>
               </w:rPr>
-              <w:t>Python 3.10, TensorFlow 2.10.1, Keras 2.10.0, Scikit-Learn 1.7.2</w:t>
+              <w:t>Jupyter Notebook (lokal), kernel Python (CNNgpu), TensorFlow 2.10.1, GPU terdeteksi (GPU available: True)</w:t>
             </w:r>
           </w:p>
         </w:tc>
@@ -698,51 +700,53 @@
       <w:tr>
         <w:tc>
           <w:tcPr>
-            <w:tcW w:type="dxa" w:w="3456"/>
+            <w:tcW w:type="dxa" w:w="2592"/>
             <w:shd w:fill="FFFFFF"/>
             <w:tcMar>
-              <w:top w:w="80" w:type="dxa"/>
-              <w:bottom w:w="80" w:type="dxa"/>
+              <w:top w:w="85" w:type="dxa"/>
+              <w:bottom w:w="85" w:type="dxa"/>
               <w:left w:w="120" w:type="dxa"/>
               <w:right w:w="120" w:type="dxa"/>
             </w:tcMar>
           </w:tcPr>
           <w:p>
             <w:pPr>
-              <w:spacing w:before="0" w:after="0"/>
-              <w:jc w:val="center"/>
+              <w:jc w:val="left"/>
             </w:pPr>
             <w:r>
               <w:rPr>
                 <w:rFonts w:ascii="Times New Roman" w:hAnsi="Times New Roman"/>
-                <w:sz w:val="19"/>
+                <w:b w:val="0"/>
+                <w:color w:val="000000"/>
+                <w:sz w:val="20"/>
               </w:rPr>
-              <w:t>Akselerasi Komputasi</w:t>
+              <w:t>CPU</w:t>
             </w:r>
           </w:p>
         </w:tc>
         <w:tc>
           <w:tcPr>
-            <w:tcW w:type="dxa" w:w="5573"/>
+            <w:tcW w:type="dxa" w:w="6437"/>
             <w:shd w:fill="FFFFFF"/>
             <w:tcMar>
-              <w:top w:w="80" w:type="dxa"/>
-              <w:bottom w:w="80" w:type="dxa"/>
+              <w:top w:w="85" w:type="dxa"/>
+              <w:bottom w:w="85" w:type="dxa"/>
               <w:left w:w="120" w:type="dxa"/>
               <w:right w:w="120" w:type="dxa"/>
             </w:tcMar>
           </w:tcPr>
           <w:p>
             <w:pPr>
-              <w:spacing w:before="0" w:after="0"/>
               <w:jc w:val="left"/>
             </w:pPr>
             <w:r>
               <w:rPr>
                 <w:rFonts w:ascii="Times New Roman" w:hAnsi="Times New Roman"/>
-                <w:sz w:val="19"/>
+                <w:b w:val="0"/>
+                <w:color w:val="000000"/>
+                <w:sz w:val="20"/>
               </w:rPr>
-              <w:t>NVIDIA GPU CUDA-enabled (terdeteksi pada conda environment CNNgpu)</w:t>
+              <w:t>Intel Core i7-13620H</w:t>
             </w:r>
           </w:p>
         </w:tc>
@@ -750,51 +754,53 @@
       <w:tr>
         <w:tc>
           <w:tcPr>
-            <w:tcW w:type="dxa" w:w="3456"/>
-            <w:shd w:fill="F4F7F5"/>
+            <w:tcW w:type="dxa" w:w="2592"/>
+            <w:shd w:fill="FFFFFF"/>
             <w:tcMar>
-              <w:top w:w="80" w:type="dxa"/>
-              <w:bottom w:w="80" w:type="dxa"/>
+              <w:top w:w="85" w:type="dxa"/>
+              <w:bottom w:w="85" w:type="dxa"/>
               <w:left w:w="120" w:type="dxa"/>
               <w:right w:w="120" w:type="dxa"/>
             </w:tcMar>
           </w:tcPr>
           <w:p>
             <w:pPr>
-              <w:spacing w:before="0" w:after="0"/>
-              <w:jc w:val="center"/>
+              <w:jc w:val="left"/>
             </w:pPr>
             <w:r>
               <w:rPr>
                 <w:rFonts w:ascii="Times New Roman" w:hAnsi="Times New Roman"/>
-                <w:sz w:val="19"/>
+                <w:b w:val="0"/>
+                <w:color w:val="000000"/>
+                <w:sz w:val="20"/>
               </w:rPr>
-              <w:t>Processor (CPU)</w:t>
+              <w:t>GPU</w:t>
             </w:r>
           </w:p>
         </w:tc>
         <w:tc>
           <w:tcPr>
-            <w:tcW w:type="dxa" w:w="5573"/>
-            <w:shd w:fill="F4F7F5"/>
+            <w:tcW w:type="dxa" w:w="6437"/>
+            <w:shd w:fill="FFFFFF"/>
             <w:tcMar>
-              <w:top w:w="80" w:type="dxa"/>
-              <w:bottom w:w="80" w:type="dxa"/>
+              <w:top w:w="85" w:type="dxa"/>
+              <w:bottom w:w="85" w:type="dxa"/>
               <w:left w:w="120" w:type="dxa"/>
               <w:right w:w="120" w:type="dxa"/>
             </w:tcMar>
           </w:tcPr>
           <w:p>
             <w:pPr>
-              <w:spacing w:before="0" w:after="0"/>
               <w:jc w:val="left"/>
             </w:pPr>
             <w:r>
               <w:rPr>
                 <w:rFonts w:ascii="Times New Roman" w:hAnsi="Times New Roman"/>
-                <w:sz w:val="19"/>
+                <w:b w:val="0"/>
+                <w:color w:val="000000"/>
+                <w:sz w:val="20"/>
               </w:rPr>
-              <w:t>Multi-Core Processor x86_64 dengan dukungan Multi-Threading joblib</w:t>
+              <w:t>Hybrid Graphics: NVIDIA GeForce RTX 2050 4GB (Discrete GPU) + Intel UHD Graphics (Integrated GPU)</w:t>
             </w:r>
           </w:p>
         </w:tc>
@@ -802,51 +808,53 @@
       <w:tr>
         <w:tc>
           <w:tcPr>
-            <w:tcW w:type="dxa" w:w="3456"/>
+            <w:tcW w:type="dxa" w:w="2592"/>
             <w:shd w:fill="FFFFFF"/>
             <w:tcMar>
-              <w:top w:w="80" w:type="dxa"/>
-              <w:bottom w:w="80" w:type="dxa"/>
+              <w:top w:w="85" w:type="dxa"/>
+              <w:bottom w:w="85" w:type="dxa"/>
               <w:left w:w="120" w:type="dxa"/>
               <w:right w:w="120" w:type="dxa"/>
             </w:tcMar>
           </w:tcPr>
           <w:p>
             <w:pPr>
-              <w:spacing w:before="0" w:after="0"/>
-              <w:jc w:val="center"/>
+              <w:jc w:val="left"/>
             </w:pPr>
             <w:r>
               <w:rPr>
                 <w:rFonts w:ascii="Times New Roman" w:hAnsi="Times New Roman"/>
-                <w:sz w:val="19"/>
+                <w:b w:val="0"/>
+                <w:color w:val="000000"/>
+                <w:sz w:val="20"/>
               </w:rPr>
-              <w:t>Random Seed Deterministik</w:t>
+              <w:t>RAM</w:t>
             </w:r>
           </w:p>
         </w:tc>
         <w:tc>
           <w:tcPr>
-            <w:tcW w:type="dxa" w:w="5573"/>
+            <w:tcW w:type="dxa" w:w="6437"/>
             <w:shd w:fill="FFFFFF"/>
             <w:tcMar>
-              <w:top w:w="80" w:type="dxa"/>
-              <w:bottom w:w="80" w:type="dxa"/>
+              <w:top w:w="85" w:type="dxa"/>
+              <w:bottom w:w="85" w:type="dxa"/>
               <w:left w:w="120" w:type="dxa"/>
               <w:right w:w="120" w:type="dxa"/>
             </w:tcMar>
           </w:tcPr>
           <w:p>
             <w:pPr>
-              <w:spacing w:before="0" w:after="0"/>
               <w:jc w:val="left"/>
             </w:pPr>
             <w:r>
               <w:rPr>
                 <w:rFonts w:ascii="Times New Roman" w:hAnsi="Times New Roman"/>
-                <w:sz w:val="19"/>
+                <w:b w:val="0"/>
+                <w:color w:val="000000"/>
+                <w:sz w:val="20"/>
               </w:rPr>
-              <w:t>23092026 (Partisi Stratified 3-Way yang Reproducible)</w:t>
+              <w:t>16 GB</w:t>
             </w:r>
           </w:p>
         </w:tc>
@@ -854,51 +862,215 @@
       <w:tr>
         <w:tc>
           <w:tcPr>
-            <w:tcW w:type="dxa" w:w="3456"/>
-            <w:shd w:fill="F4F7F5"/>
+            <w:tcW w:type="dxa" w:w="2592"/>
+            <w:shd w:fill="FFFFFF"/>
             <w:tcMar>
-              <w:top w:w="80" w:type="dxa"/>
-              <w:bottom w:w="80" w:type="dxa"/>
+              <w:top w:w="85" w:type="dxa"/>
+              <w:bottom w:w="85" w:type="dxa"/>
               <w:left w:w="120" w:type="dxa"/>
               <w:right w:w="120" w:type="dxa"/>
             </w:tcMar>
           </w:tcPr>
           <w:p>
             <w:pPr>
-              <w:spacing w:before="0" w:after="0"/>
-              <w:jc w:val="center"/>
+              <w:jc w:val="left"/>
             </w:pPr>
             <w:r>
               <w:rPr>
                 <w:rFonts w:ascii="Times New Roman" w:hAnsi="Times New Roman"/>
-                <w:sz w:val="19"/>
+                <w:b w:val="0"/>
+                <w:color w:val="000000"/>
+                <w:sz w:val="20"/>
               </w:rPr>
-              <w:t>Pustaka Pendukung</w:t>
+              <w:t>Framework</w:t>
             </w:r>
           </w:p>
         </w:tc>
         <w:tc>
           <w:tcPr>
-            <w:tcW w:type="dxa" w:w="5573"/>
-            <w:shd w:fill="F4F7F5"/>
+            <w:tcW w:type="dxa" w:w="6437"/>
+            <w:shd w:fill="FFFFFF"/>
             <w:tcMar>
-              <w:top w:w="80" w:type="dxa"/>
-              <w:bottom w:w="80" w:type="dxa"/>
+              <w:top w:w="85" w:type="dxa"/>
+              <w:bottom w:w="85" w:type="dxa"/>
               <w:left w:w="120" w:type="dxa"/>
               <w:right w:w="120" w:type="dxa"/>
             </w:tcMar>
           </w:tcPr>
           <w:p>
             <w:pPr>
-              <w:spacing w:before="0" w:after="0"/>
               <w:jc w:val="left"/>
             </w:pPr>
             <w:r>
               <w:rPr>
                 <w:rFonts w:ascii="Times New Roman" w:hAnsi="Times New Roman"/>
-                <w:sz w:val="19"/>
+                <w:b w:val="0"/>
+                <w:color w:val="000000"/>
+                <w:sz w:val="20"/>
               </w:rPr>
-              <w:t>NumPy, Matplotlib, Seaborn, h5py, pickle, joblib</w:t>
+              <w:t>TensorFlow / Keras, scikit-learn (GridSearchCV, SVC, Pipeline), h5py, Matplotlib</w:t>
+            </w:r>
+          </w:p>
+        </w:tc>
+      </w:tr>
+      <w:tr>
+        <w:tc>
+          <w:tcPr>
+            <w:tcW w:type="dxa" w:w="2592"/>
+            <w:shd w:fill="FFFFFF"/>
+            <w:tcMar>
+              <w:top w:w="85" w:type="dxa"/>
+              <w:bottom w:w="85" w:type="dxa"/>
+              <w:left w:w="120" w:type="dxa"/>
+              <w:right w:w="120" w:type="dxa"/>
+            </w:tcMar>
+          </w:tcPr>
+          <w:p>
+            <w:pPr>
+              <w:jc w:val="left"/>
+            </w:pPr>
+            <w:r>
+              <w:rPr>
+                <w:rFonts w:ascii="Times New Roman" w:hAnsi="Times New Roman"/>
+                <w:b w:val="0"/>
+                <w:color w:val="000000"/>
+                <w:sz w:val="20"/>
+              </w:rPr>
+              <w:t>Dataset</w:t>
+            </w:r>
+          </w:p>
+        </w:tc>
+        <w:tc>
+          <w:tcPr>
+            <w:tcW w:type="dxa" w:w="6437"/>
+            <w:shd w:fill="FFFFFF"/>
+            <w:tcMar>
+              <w:top w:w="85" w:type="dxa"/>
+              <w:bottom w:w="85" w:type="dxa"/>
+              <w:left w:w="120" w:type="dxa"/>
+              <w:right w:w="120" w:type="dxa"/>
+            </w:tcMar>
+          </w:tcPr>
+          <w:p>
+            <w:pPr>
+              <w:jc w:val="left"/>
+            </w:pPr>
+            <w:r>
+              <w:rPr>
+                <w:rFonts w:ascii="Times New Roman" w:hAnsi="Times New Roman"/>
+                <w:b w:val="0"/>
+                <w:color w:val="000000"/>
+                <w:sz w:val="20"/>
+              </w:rPr>
+              <w:t>CIFAR-10 (data training 50.000 citra RGB 32x32, 10 kelas)</w:t>
+            </w:r>
+          </w:p>
+        </w:tc>
+      </w:tr>
+      <w:tr>
+        <w:tc>
+          <w:tcPr>
+            <w:tcW w:type="dxa" w:w="2592"/>
+            <w:shd w:fill="FFFFFF"/>
+            <w:tcMar>
+              <w:top w:w="85" w:type="dxa"/>
+              <w:bottom w:w="85" w:type="dxa"/>
+              <w:left w:w="120" w:type="dxa"/>
+              <w:right w:w="120" w:type="dxa"/>
+            </w:tcMar>
+          </w:tcPr>
+          <w:p>
+            <w:pPr>
+              <w:jc w:val="left"/>
+            </w:pPr>
+            <w:r>
+              <w:rPr>
+                <w:rFonts w:ascii="Times New Roman" w:hAnsi="Times New Roman"/>
+                <w:b w:val="0"/>
+                <w:color w:val="000000"/>
+                <w:sz w:val="20"/>
+              </w:rPr>
+              <w:t>Reproducibility</w:t>
+            </w:r>
+          </w:p>
+        </w:tc>
+        <w:tc>
+          <w:tcPr>
+            <w:tcW w:type="dxa" w:w="6437"/>
+            <w:shd w:fill="FFFFFF"/>
+            <w:tcMar>
+              <w:top w:w="85" w:type="dxa"/>
+              <w:bottom w:w="85" w:type="dxa"/>
+              <w:left w:w="120" w:type="dxa"/>
+              <w:right w:w="120" w:type="dxa"/>
+            </w:tcMar>
+          </w:tcPr>
+          <w:p>
+            <w:pPr>
+              <w:jc w:val="left"/>
+            </w:pPr>
+            <w:r>
+              <w:rPr>
+                <w:rFonts w:ascii="Times New Roman" w:hAnsi="Times New Roman"/>
+                <w:b w:val="0"/>
+                <w:color w:val="000000"/>
+                <w:sz w:val="20"/>
+              </w:rPr>
+              <w:t>RANDOM_STATE = 23092026</w:t>
+            </w:r>
+          </w:p>
+        </w:tc>
+      </w:tr>
+      <w:tr>
+        <w:tc>
+          <w:tcPr>
+            <w:tcW w:type="dxa" w:w="2592"/>
+            <w:shd w:fill="FFFFFF"/>
+            <w:tcMar>
+              <w:top w:w="85" w:type="dxa"/>
+              <w:bottom w:w="85" w:type="dxa"/>
+              <w:left w:w="120" w:type="dxa"/>
+              <w:right w:w="120" w:type="dxa"/>
+            </w:tcMar>
+          </w:tcPr>
+          <w:p>
+            <w:pPr>
+              <w:jc w:val="left"/>
+            </w:pPr>
+            <w:r>
+              <w:rPr>
+                <w:rFonts w:ascii="Times New Roman" w:hAnsi="Times New Roman"/>
+                <w:b w:val="0"/>
+                <w:color w:val="000000"/>
+                <w:sz w:val="20"/>
+              </w:rPr>
+              <w:t>Artefak Output</w:t>
+            </w:r>
+          </w:p>
+        </w:tc>
+        <w:tc>
+          <w:tcPr>
+            <w:tcW w:type="dxa" w:w="6437"/>
+            <w:shd w:fill="FFFFFF"/>
+            <w:tcMar>
+              <w:top w:w="85" w:type="dxa"/>
+              <w:bottom w:w="85" w:type="dxa"/>
+              <w:left w:w="120" w:type="dxa"/>
+              <w:right w:w="120" w:type="dxa"/>
+            </w:tcMar>
+          </w:tcPr>
+          <w:p>
+            <w:pPr>
+              <w:jc w:val="left"/>
+            </w:pPr>
+            <w:r>
+              <w:rPr>
+                <w:rFonts w:ascii="Times New Roman" w:hAnsi="Times New Roman"/>
+                <w:b w:val="0"/>
+                <w:color w:val="000000"/>
+                <w:sz w:val="20"/>
+              </w:rPr>
+              <w:t>custom_cnn_cifar10_final.keras (berisi Custom CNN + Scaler + SVM pipeline dalam satu file), cnn_model.keras, scaler.pkl, svm_model.pkl, train_features.npz, test_features.npz</w:t>
             </w:r>
           </w:p>
         </w:tc>
@@ -1205,12 +1377,12 @@
         <w:tblLayout w:type="fixed"/>
         <w:tblLook w:firstColumn="1" w:firstRow="1" w:lastColumn="0" w:lastRow="0" w:noHBand="0" w:noVBand="1" w:val="04A0"/>
         <w:tblBorders>
-          <w:top w:val="single" w:sz="4" w:space="0" w:color="C5D0C8"/>
-          <w:bottom w:val="single" w:sz="4" w:space="0" w:color="C5D0C8"/>
-          <w:insideH w:val="single" w:sz="4" w:space="0" w:color="C5D0C8"/>
-          <w:insideV w:val="none"/>
-          <w:left w:val="none"/>
-          <w:right w:val="none"/>
+          <w:top w:val="single" w:sz="4" w:space="0" w:color="555555"/>
+          <w:bottom w:val="single" w:sz="4" w:space="0" w:color="555555"/>
+          <w:left w:val="single" w:sz="4" w:space="0" w:color="555555"/>
+          <w:right w:val="single" w:sz="4" w:space="0" w:color="555555"/>
+          <w:insideH w:val="single" w:sz="4" w:space="0" w:color="555555"/>
+          <w:insideV w:val="single" w:sz="4" w:space="0" w:color="555555"/>
         </w:tblBorders>
       </w:tblPr>
       <w:tblGrid>
@@ -1225,15 +1397,14 @@
             <w:tcW w:type="dxa" w:w="2592"/>
             <w:shd w:fill="2E5339"/>
             <w:tcMar>
-              <w:top w:w="120" w:type="dxa"/>
-              <w:bottom w:w="120" w:type="dxa"/>
-              <w:left w:w="140" w:type="dxa"/>
-              <w:right w:w="140" w:type="dxa"/>
+              <w:top w:w="110" w:type="dxa"/>
+              <w:bottom w:w="110" w:type="dxa"/>
+              <w:left w:w="130" w:type="dxa"/>
+              <w:right w:w="130" w:type="dxa"/>
             </w:tcMar>
           </w:tcPr>
           <w:p>
             <w:pPr>
-              <w:spacing w:before="0" w:after="0"/>
               <w:jc w:val="center"/>
             </w:pPr>
             <w:r>
@@ -1252,15 +1423,14 @@
             <w:tcW w:type="dxa" w:w="1872"/>
             <w:shd w:fill="2E5339"/>
             <w:tcMar>
-              <w:top w:w="120" w:type="dxa"/>
-              <w:bottom w:w="120" w:type="dxa"/>
-              <w:left w:w="140" w:type="dxa"/>
-              <w:right w:w="140" w:type="dxa"/>
+              <w:top w:w="110" w:type="dxa"/>
+              <w:bottom w:w="110" w:type="dxa"/>
+              <w:left w:w="130" w:type="dxa"/>
+              <w:right w:w="130" w:type="dxa"/>
             </w:tcMar>
           </w:tcPr>
           <w:p>
             <w:pPr>
-              <w:spacing w:before="0" w:after="0"/>
               <w:jc w:val="center"/>
             </w:pPr>
             <w:r>
@@ -1279,15 +1449,14 @@
             <w:tcW w:type="dxa" w:w="1440"/>
             <w:shd w:fill="2E5339"/>
             <w:tcMar>
-              <w:top w:w="120" w:type="dxa"/>
-              <w:bottom w:w="120" w:type="dxa"/>
-              <w:left w:w="140" w:type="dxa"/>
-              <w:right w:w="140" w:type="dxa"/>
+              <w:top w:w="110" w:type="dxa"/>
+              <w:bottom w:w="110" w:type="dxa"/>
+              <w:left w:w="130" w:type="dxa"/>
+              <w:right w:w="130" w:type="dxa"/>
             </w:tcMar>
           </w:tcPr>
           <w:p>
             <w:pPr>
-              <w:spacing w:before="0" w:after="0"/>
               <w:jc w:val="center"/>
             </w:pPr>
             <w:r>
@@ -1306,15 +1475,14 @@
             <w:tcW w:type="dxa" w:w="3125"/>
             <w:shd w:fill="2E5339"/>
             <w:tcMar>
-              <w:top w:w="120" w:type="dxa"/>
-              <w:bottom w:w="120" w:type="dxa"/>
-              <w:left w:w="140" w:type="dxa"/>
-              <w:right w:w="140" w:type="dxa"/>
+              <w:top w:w="110" w:type="dxa"/>
+              <w:bottom w:w="110" w:type="dxa"/>
+              <w:left w:w="130" w:type="dxa"/>
+              <w:right w:w="130" w:type="dxa"/>
             </w:tcMar>
           </w:tcPr>
           <w:p>
             <w:pPr>
-              <w:spacing w:before="0" w:after="0"/>
               <w:jc w:val="center"/>
             </w:pPr>
             <w:r>
@@ -1343,7 +1511,6 @@
           </w:tcPr>
           <w:p>
             <w:pPr>
-              <w:spacing w:before="0" w:after="0"/>
               <w:jc w:val="left"/>
             </w:pPr>
             <w:r>
@@ -1368,7 +1535,6 @@
           </w:tcPr>
           <w:p>
             <w:pPr>
-              <w:spacing w:before="0" w:after="0"/>
               <w:jc w:val="center"/>
             </w:pPr>
             <w:r>
@@ -1393,7 +1559,6 @@
           </w:tcPr>
           <w:p>
             <w:pPr>
-              <w:spacing w:before="0" w:after="0"/>
               <w:jc w:val="center"/>
             </w:pPr>
             <w:r>
@@ -1418,7 +1583,6 @@
           </w:tcPr>
           <w:p>
             <w:pPr>
-              <w:spacing w:before="0" w:after="0"/>
               <w:jc w:val="left"/>
             </w:pPr>
             <w:r>
@@ -1445,7 +1609,6 @@
           </w:tcPr>
           <w:p>
             <w:pPr>
-              <w:spacing w:before="0" w:after="0"/>
               <w:jc w:val="left"/>
             </w:pPr>
             <w:r>
@@ -1470,7 +1633,6 @@
           </w:tcPr>
           <w:p>
             <w:pPr>
-              <w:spacing w:before="0" w:after="0"/>
               <w:jc w:val="center"/>
             </w:pPr>
             <w:r>
@@ -1495,7 +1657,6 @@
           </w:tcPr>
           <w:p>
             <w:pPr>
-              <w:spacing w:before="0" w:after="0"/>
               <w:jc w:val="center"/>
             </w:pPr>
             <w:r>
@@ -1520,7 +1681,6 @@
           </w:tcPr>
           <w:p>
             <w:pPr>
-              <w:spacing w:before="0" w:after="0"/>
               <w:jc w:val="left"/>
             </w:pPr>
             <w:r>
@@ -1547,7 +1707,6 @@
           </w:tcPr>
           <w:p>
             <w:pPr>
-              <w:spacing w:before="0" w:after="0"/>
               <w:jc w:val="left"/>
             </w:pPr>
             <w:r>
@@ -1572,7 +1731,6 @@
           </w:tcPr>
           <w:p>
             <w:pPr>
-              <w:spacing w:before="0" w:after="0"/>
               <w:jc w:val="center"/>
             </w:pPr>
             <w:r>
@@ -1597,7 +1755,6 @@
           </w:tcPr>
           <w:p>
             <w:pPr>
-              <w:spacing w:before="0" w:after="0"/>
               <w:jc w:val="center"/>
             </w:pPr>
             <w:r>
@@ -1622,7 +1779,6 @@
           </w:tcPr>
           <w:p>
             <w:pPr>
-              <w:spacing w:before="0" w:after="0"/>
               <w:jc w:val="left"/>
             </w:pPr>
             <w:r>
@@ -1649,7 +1805,6 @@
           </w:tcPr>
           <w:p>
             <w:pPr>
-              <w:spacing w:before="0" w:after="0"/>
               <w:jc w:val="left"/>
             </w:pPr>
             <w:r>
@@ -1674,7 +1829,6 @@
           </w:tcPr>
           <w:p>
             <w:pPr>
-              <w:spacing w:before="0" w:after="0"/>
               <w:jc w:val="center"/>
             </w:pPr>
             <w:r>
@@ -1699,7 +1853,6 @@
           </w:tcPr>
           <w:p>
             <w:pPr>
-              <w:spacing w:before="0" w:after="0"/>
               <w:jc w:val="center"/>
             </w:pPr>
             <w:r>
@@ -1724,7 +1877,6 @@
           </w:tcPr>
           <w:p>
             <w:pPr>
-              <w:spacing w:before="0" w:after="0"/>
               <w:jc w:val="left"/>
             </w:pPr>
             <w:r>
@@ -1751,7 +1903,6 @@
           </w:tcPr>
           <w:p>
             <w:pPr>
-              <w:spacing w:before="0" w:after="0"/>
               <w:jc w:val="left"/>
             </w:pPr>
             <w:r>
@@ -1776,7 +1927,6 @@
           </w:tcPr>
           <w:p>
             <w:pPr>
-              <w:spacing w:before="0" w:after="0"/>
               <w:jc w:val="center"/>
             </w:pPr>
             <w:r>
@@ -1801,7 +1951,6 @@
           </w:tcPr>
           <w:p>
             <w:pPr>
-              <w:spacing w:before="0" w:after="0"/>
               <w:jc w:val="center"/>
             </w:pPr>
             <w:r>
@@ -1826,7 +1975,6 @@
           </w:tcPr>
           <w:p>
             <w:pPr>
-              <w:spacing w:before="0" w:after="0"/>
               <w:jc w:val="left"/>
             </w:pPr>
             <w:r>
@@ -1853,7 +2001,6 @@
           </w:tcPr>
           <w:p>
             <w:pPr>
-              <w:spacing w:before="0" w:after="0"/>
               <w:jc w:val="left"/>
             </w:pPr>
             <w:r>
@@ -1878,7 +2025,6 @@
           </w:tcPr>
           <w:p>
             <w:pPr>
-              <w:spacing w:before="0" w:after="0"/>
               <w:jc w:val="center"/>
             </w:pPr>
             <w:r>
@@ -1903,7 +2049,6 @@
           </w:tcPr>
           <w:p>
             <w:pPr>
-              <w:spacing w:before="0" w:after="0"/>
               <w:jc w:val="center"/>
             </w:pPr>
             <w:r>
@@ -1928,7 +2073,6 @@
           </w:tcPr>
           <w:p>
             <w:pPr>
-              <w:spacing w:before="0" w:after="0"/>
               <w:jc w:val="left"/>
             </w:pPr>
             <w:r>
@@ -1955,7 +2099,6 @@
           </w:tcPr>
           <w:p>
             <w:pPr>
-              <w:spacing w:before="0" w:after="0"/>
               <w:jc w:val="left"/>
             </w:pPr>
             <w:r>
@@ -1980,7 +2123,6 @@
           </w:tcPr>
           <w:p>
             <w:pPr>
-              <w:spacing w:before="0" w:after="0"/>
               <w:jc w:val="center"/>
             </w:pPr>
             <w:r>
@@ -2005,7 +2147,6 @@
           </w:tcPr>
           <w:p>
             <w:pPr>
-              <w:spacing w:before="0" w:after="0"/>
               <w:jc w:val="center"/>
             </w:pPr>
             <w:r>
@@ -2030,7 +2171,6 @@
           </w:tcPr>
           <w:p>
             <w:pPr>
-              <w:spacing w:before="0" w:after="0"/>
               <w:jc w:val="left"/>
             </w:pPr>
             <w:r>
@@ -2057,7 +2197,6 @@
           </w:tcPr>
           <w:p>
             <w:pPr>
-              <w:spacing w:before="0" w:after="0"/>
               <w:jc w:val="left"/>
             </w:pPr>
             <w:r>
@@ -2082,7 +2221,6 @@
           </w:tcPr>
           <w:p>
             <w:pPr>
-              <w:spacing w:before="0" w:after="0"/>
               <w:jc w:val="center"/>
             </w:pPr>
             <w:r>
@@ -2107,7 +2245,6 @@
           </w:tcPr>
           <w:p>
             <w:pPr>
-              <w:spacing w:before="0" w:after="0"/>
               <w:jc w:val="center"/>
             </w:pPr>
             <w:r>
@@ -2132,7 +2269,6 @@
           </w:tcPr>
           <w:p>
             <w:pPr>
-              <w:spacing w:before="0" w:after="0"/>
               <w:jc w:val="left"/>
             </w:pPr>
             <w:r>
@@ -2348,12 +2484,12 @@
         <w:tblLayout w:type="fixed"/>
         <w:tblLook w:firstColumn="1" w:firstRow="1" w:lastColumn="0" w:lastRow="0" w:noHBand="0" w:noVBand="1" w:val="04A0"/>
         <w:tblBorders>
-          <w:top w:val="single" w:sz="4" w:space="0" w:color="C5D0C8"/>
-          <w:bottom w:val="single" w:sz="4" w:space="0" w:color="C5D0C8"/>
-          <w:insideH w:val="single" w:sz="4" w:space="0" w:color="C5D0C8"/>
-          <w:insideV w:val="none"/>
-          <w:left w:val="none"/>
-          <w:right w:val="none"/>
+          <w:top w:val="single" w:sz="4" w:space="0" w:color="555555"/>
+          <w:bottom w:val="single" w:sz="4" w:space="0" w:color="555555"/>
+          <w:left w:val="single" w:sz="4" w:space="0" w:color="555555"/>
+          <w:right w:val="single" w:sz="4" w:space="0" w:color="555555"/>
+          <w:insideH w:val="single" w:sz="4" w:space="0" w:color="555555"/>
+          <w:insideV w:val="single" w:sz="4" w:space="0" w:color="555555"/>
         </w:tblBorders>
       </w:tblPr>
       <w:tblGrid>
@@ -2370,15 +2506,14 @@
             <w:tcW w:type="dxa" w:w="1584"/>
             <w:shd w:fill="2E5339"/>
             <w:tcMar>
-              <w:top w:w="120" w:type="dxa"/>
-              <w:bottom w:w="120" w:type="dxa"/>
-              <w:left w:w="140" w:type="dxa"/>
-              <w:right w:w="140" w:type="dxa"/>
+              <w:top w:w="110" w:type="dxa"/>
+              <w:bottom w:w="110" w:type="dxa"/>
+              <w:left w:w="130" w:type="dxa"/>
+              <w:right w:w="130" w:type="dxa"/>
             </w:tcMar>
           </w:tcPr>
           <w:p>
             <w:pPr>
-              <w:spacing w:before="0" w:after="0"/>
               <w:jc w:val="center"/>
             </w:pPr>
             <w:r>
@@ -2397,15 +2532,14 @@
             <w:tcW w:type="dxa" w:w="1440"/>
             <w:shd w:fill="2E5339"/>
             <w:tcMar>
-              <w:top w:w="120" w:type="dxa"/>
-              <w:bottom w:w="120" w:type="dxa"/>
-              <w:left w:w="140" w:type="dxa"/>
-              <w:right w:w="140" w:type="dxa"/>
+              <w:top w:w="110" w:type="dxa"/>
+              <w:bottom w:w="110" w:type="dxa"/>
+              <w:left w:w="130" w:type="dxa"/>
+              <w:right w:w="130" w:type="dxa"/>
             </w:tcMar>
           </w:tcPr>
           <w:p>
             <w:pPr>
-              <w:spacing w:before="0" w:after="0"/>
               <w:jc w:val="center"/>
             </w:pPr>
             <w:r>
@@ -2424,15 +2558,14 @@
             <w:tcW w:type="dxa" w:w="1440"/>
             <w:shd w:fill="2E5339"/>
             <w:tcMar>
-              <w:top w:w="120" w:type="dxa"/>
-              <w:bottom w:w="120" w:type="dxa"/>
-              <w:left w:w="140" w:type="dxa"/>
-              <w:right w:w="140" w:type="dxa"/>
+              <w:top w:w="110" w:type="dxa"/>
+              <w:bottom w:w="110" w:type="dxa"/>
+              <w:left w:w="130" w:type="dxa"/>
+              <w:right w:w="130" w:type="dxa"/>
             </w:tcMar>
           </w:tcPr>
           <w:p>
             <w:pPr>
-              <w:spacing w:before="0" w:after="0"/>
               <w:jc w:val="center"/>
             </w:pPr>
             <w:r>
@@ -2451,15 +2584,14 @@
             <w:tcW w:type="dxa" w:w="1440"/>
             <w:shd w:fill="2E5339"/>
             <w:tcMar>
-              <w:top w:w="120" w:type="dxa"/>
-              <w:bottom w:w="120" w:type="dxa"/>
-              <w:left w:w="140" w:type="dxa"/>
-              <w:right w:w="140" w:type="dxa"/>
+              <w:top w:w="110" w:type="dxa"/>
+              <w:bottom w:w="110" w:type="dxa"/>
+              <w:left w:w="130" w:type="dxa"/>
+              <w:right w:w="130" w:type="dxa"/>
             </w:tcMar>
           </w:tcPr>
           <w:p>
             <w:pPr>
-              <w:spacing w:before="0" w:after="0"/>
               <w:jc w:val="center"/>
             </w:pPr>
             <w:r>
@@ -2478,15 +2610,14 @@
             <w:tcW w:type="dxa" w:w="1440"/>
             <w:shd w:fill="2E5339"/>
             <w:tcMar>
-              <w:top w:w="120" w:type="dxa"/>
-              <w:bottom w:w="120" w:type="dxa"/>
-              <w:left w:w="140" w:type="dxa"/>
-              <w:right w:w="140" w:type="dxa"/>
+              <w:top w:w="110" w:type="dxa"/>
+              <w:bottom w:w="110" w:type="dxa"/>
+              <w:left w:w="130" w:type="dxa"/>
+              <w:right w:w="130" w:type="dxa"/>
             </w:tcMar>
           </w:tcPr>
           <w:p>
             <w:pPr>
-              <w:spacing w:before="0" w:after="0"/>
               <w:jc w:val="center"/>
             </w:pPr>
             <w:r>
@@ -2505,15 +2636,14 @@
             <w:tcW w:type="dxa" w:w="1685"/>
             <w:shd w:fill="2E5339"/>
             <w:tcMar>
-              <w:top w:w="120" w:type="dxa"/>
-              <w:bottom w:w="120" w:type="dxa"/>
-              <w:left w:w="140" w:type="dxa"/>
-              <w:right w:w="140" w:type="dxa"/>
+              <w:top w:w="110" w:type="dxa"/>
+              <w:bottom w:w="110" w:type="dxa"/>
+              <w:left w:w="130" w:type="dxa"/>
+              <w:right w:w="130" w:type="dxa"/>
             </w:tcMar>
           </w:tcPr>
           <w:p>
             <w:pPr>
-              <w:spacing w:before="0" w:after="0"/>
               <w:jc w:val="center"/>
             </w:pPr>
             <w:r>
@@ -2542,7 +2672,6 @@
           </w:tcPr>
           <w:p>
             <w:pPr>
-              <w:spacing w:before="0" w:after="0"/>
               <w:jc w:val="center"/>
             </w:pPr>
             <w:r>
@@ -2567,7 +2696,6 @@
           </w:tcPr>
           <w:p>
             <w:pPr>
-              <w:spacing w:before="0" w:after="0"/>
               <w:jc w:val="center"/>
             </w:pPr>
             <w:r>
@@ -2592,7 +2720,6 @@
           </w:tcPr>
           <w:p>
             <w:pPr>
-              <w:spacing w:before="0" w:after="0"/>
               <w:jc w:val="left"/>
             </w:pPr>
             <w:r>
@@ -2617,7 +2744,6 @@
           </w:tcPr>
           <w:p>
             <w:pPr>
-              <w:spacing w:before="0" w:after="0"/>
               <w:jc w:val="center"/>
             </w:pPr>
             <w:r>
@@ -2642,7 +2768,6 @@
           </w:tcPr>
           <w:p>
             <w:pPr>
-              <w:spacing w:before="0" w:after="0"/>
               <w:jc w:val="left"/>
             </w:pPr>
             <w:r>
@@ -2667,7 +2792,6 @@
           </w:tcPr>
           <w:p>
             <w:pPr>
-              <w:spacing w:before="0" w:after="0"/>
               <w:jc w:val="left"/>
             </w:pPr>
             <w:r>
@@ -2694,7 +2818,6 @@
           </w:tcPr>
           <w:p>
             <w:pPr>
-              <w:spacing w:before="0" w:after="0"/>
               <w:jc w:val="center"/>
             </w:pPr>
             <w:r>
@@ -2719,7 +2842,6 @@
           </w:tcPr>
           <w:p>
             <w:pPr>
-              <w:spacing w:before="0" w:after="0"/>
               <w:jc w:val="center"/>
             </w:pPr>
             <w:r>
@@ -2744,7 +2866,6 @@
           </w:tcPr>
           <w:p>
             <w:pPr>
-              <w:spacing w:before="0" w:after="0"/>
               <w:jc w:val="left"/>
             </w:pPr>
             <w:r>
@@ -2769,7 +2890,6 @@
           </w:tcPr>
           <w:p>
             <w:pPr>
-              <w:spacing w:before="0" w:after="0"/>
               <w:jc w:val="center"/>
             </w:pPr>
             <w:r>
@@ -2794,7 +2914,6 @@
           </w:tcPr>
           <w:p>
             <w:pPr>
-              <w:spacing w:before="0" w:after="0"/>
               <w:jc w:val="left"/>
             </w:pPr>
             <w:r>
@@ -2819,7 +2938,6 @@
           </w:tcPr>
           <w:p>
             <w:pPr>
-              <w:spacing w:before="0" w:after="0"/>
               <w:jc w:val="left"/>
             </w:pPr>
             <w:r>
@@ -2846,7 +2964,6 @@
           </w:tcPr>
           <w:p>
             <w:pPr>
-              <w:spacing w:before="0" w:after="0"/>
               <w:jc w:val="center"/>
             </w:pPr>
             <w:r>
@@ -2871,7 +2988,6 @@
           </w:tcPr>
           <w:p>
             <w:pPr>
-              <w:spacing w:before="0" w:after="0"/>
               <w:jc w:val="center"/>
             </w:pPr>
             <w:r>
@@ -2896,7 +3012,6 @@
           </w:tcPr>
           <w:p>
             <w:pPr>
-              <w:spacing w:before="0" w:after="0"/>
               <w:jc w:val="left"/>
             </w:pPr>
             <w:r>
@@ -2921,7 +3036,6 @@
           </w:tcPr>
           <w:p>
             <w:pPr>
-              <w:spacing w:before="0" w:after="0"/>
               <w:jc w:val="center"/>
             </w:pPr>
             <w:r>
@@ -2946,7 +3060,6 @@
           </w:tcPr>
           <w:p>
             <w:pPr>
-              <w:spacing w:before="0" w:after="0"/>
               <w:jc w:val="left"/>
             </w:pPr>
             <w:r>
@@ -2971,7 +3084,6 @@
           </w:tcPr>
           <w:p>
             <w:pPr>
-              <w:spacing w:before="0" w:after="0"/>
               <w:jc w:val="left"/>
             </w:pPr>
             <w:r>
@@ -2998,7 +3110,6 @@
           </w:tcPr>
           <w:p>
             <w:pPr>
-              <w:spacing w:before="0" w:after="0"/>
               <w:jc w:val="center"/>
             </w:pPr>
             <w:r>
@@ -3023,7 +3134,6 @@
           </w:tcPr>
           <w:p>
             <w:pPr>
-              <w:spacing w:before="0" w:after="0"/>
               <w:jc w:val="center"/>
             </w:pPr>
             <w:r>
@@ -3048,7 +3158,6 @@
           </w:tcPr>
           <w:p>
             <w:pPr>
-              <w:spacing w:before="0" w:after="0"/>
               <w:jc w:val="left"/>
             </w:pPr>
             <w:r>
@@ -3073,7 +3182,6 @@
           </w:tcPr>
           <w:p>
             <w:pPr>
-              <w:spacing w:before="0" w:after="0"/>
               <w:jc w:val="center"/>
             </w:pPr>
             <w:r>
@@ -3098,7 +3206,6 @@
           </w:tcPr>
           <w:p>
             <w:pPr>
-              <w:spacing w:before="0" w:after="0"/>
               <w:jc w:val="left"/>
             </w:pPr>
             <w:r>
@@ -3123,7 +3230,6 @@
           </w:tcPr>
           <w:p>
             <w:pPr>
-              <w:spacing w:before="0" w:after="0"/>
               <w:jc w:val="left"/>
             </w:pPr>
             <w:r>
@@ -3150,7 +3256,6 @@
           </w:tcPr>
           <w:p>
             <w:pPr>
-              <w:spacing w:before="0" w:after="0"/>
               <w:jc w:val="center"/>
             </w:pPr>
             <w:r>
@@ -3175,7 +3280,6 @@
           </w:tcPr>
           <w:p>
             <w:pPr>
-              <w:spacing w:before="0" w:after="0"/>
               <w:jc w:val="center"/>
             </w:pPr>
             <w:r>
@@ -3200,7 +3304,6 @@
           </w:tcPr>
           <w:p>
             <w:pPr>
-              <w:spacing w:before="0" w:after="0"/>
               <w:jc w:val="left"/>
             </w:pPr>
             <w:r>
@@ -3225,7 +3328,6 @@
           </w:tcPr>
           <w:p>
             <w:pPr>
-              <w:spacing w:before="0" w:after="0"/>
               <w:jc w:val="center"/>
             </w:pPr>
             <w:r>
@@ -3250,7 +3352,6 @@
           </w:tcPr>
           <w:p>
             <w:pPr>
-              <w:spacing w:before="0" w:after="0"/>
               <w:jc w:val="left"/>
             </w:pPr>
             <w:r>
@@ -3275,7 +3376,6 @@
           </w:tcPr>
           <w:p>
             <w:pPr>
-              <w:spacing w:before="0" w:after="0"/>
               <w:jc w:val="left"/>
             </w:pPr>
             <w:r>
@@ -3302,7 +3402,6 @@
           </w:tcPr>
           <w:p>
             <w:pPr>
-              <w:spacing w:before="0" w:after="0"/>
               <w:jc w:val="center"/>
             </w:pPr>
             <w:r>
@@ -3327,7 +3426,6 @@
           </w:tcPr>
           <w:p>
             <w:pPr>
-              <w:spacing w:before="0" w:after="0"/>
               <w:jc w:val="center"/>
             </w:pPr>
             <w:r>
@@ -3352,7 +3450,6 @@
           </w:tcPr>
           <w:p>
             <w:pPr>
-              <w:spacing w:before="0" w:after="0"/>
               <w:jc w:val="left"/>
             </w:pPr>
             <w:r>
@@ -3377,7 +3474,6 @@
           </w:tcPr>
           <w:p>
             <w:pPr>
-              <w:spacing w:before="0" w:after="0"/>
               <w:jc w:val="center"/>
             </w:pPr>
             <w:r>
@@ -3402,7 +3498,6 @@
           </w:tcPr>
           <w:p>
             <w:pPr>
-              <w:spacing w:before="0" w:after="0"/>
               <w:jc w:val="left"/>
             </w:pPr>
             <w:r>
@@ -3427,7 +3522,6 @@
           </w:tcPr>
           <w:p>
             <w:pPr>
-              <w:spacing w:before="0" w:after="0"/>
               <w:jc w:val="left"/>
             </w:pPr>
             <w:r>
@@ -3610,12 +3704,12 @@
         <w:tblLayout w:type="fixed"/>
         <w:tblLook w:firstColumn="1" w:firstRow="1" w:lastColumn="0" w:lastRow="0" w:noHBand="0" w:noVBand="1" w:val="04A0"/>
         <w:tblBorders>
-          <w:top w:val="single" w:sz="4" w:space="0" w:color="C5D0C8"/>
-          <w:bottom w:val="single" w:sz="4" w:space="0" w:color="C5D0C8"/>
-          <w:insideH w:val="single" w:sz="4" w:space="0" w:color="C5D0C8"/>
-          <w:insideV w:val="none"/>
-          <w:left w:val="none"/>
-          <w:right w:val="none"/>
+          <w:top w:val="single" w:sz="4" w:space="0" w:color="555555"/>
+          <w:bottom w:val="single" w:sz="4" w:space="0" w:color="555555"/>
+          <w:left w:val="single" w:sz="4" w:space="0" w:color="555555"/>
+          <w:right w:val="single" w:sz="4" w:space="0" w:color="555555"/>
+          <w:insideH w:val="single" w:sz="4" w:space="0" w:color="555555"/>
+          <w:insideV w:val="single" w:sz="4" w:space="0" w:color="555555"/>
         </w:tblBorders>
       </w:tblPr>
       <w:tblGrid>
@@ -3630,15 +3724,14 @@
             <w:tcW w:type="dxa" w:w="2160"/>
             <w:shd w:fill="2E5339"/>
             <w:tcMar>
-              <w:top w:w="120" w:type="dxa"/>
-              <w:bottom w:w="120" w:type="dxa"/>
-              <w:left w:w="140" w:type="dxa"/>
-              <w:right w:w="140" w:type="dxa"/>
+              <w:top w:w="110" w:type="dxa"/>
+              <w:bottom w:w="110" w:type="dxa"/>
+              <w:left w:w="130" w:type="dxa"/>
+              <w:right w:w="130" w:type="dxa"/>
             </w:tcMar>
           </w:tcPr>
           <w:p>
             <w:pPr>
-              <w:spacing w:before="0" w:after="0"/>
               <w:jc w:val="center"/>
             </w:pPr>
             <w:r>
@@ -3657,15 +3750,14 @@
             <w:tcW w:type="dxa" w:w="2160"/>
             <w:shd w:fill="2E5339"/>
             <w:tcMar>
-              <w:top w:w="120" w:type="dxa"/>
-              <w:bottom w:w="120" w:type="dxa"/>
-              <w:left w:w="140" w:type="dxa"/>
-              <w:right w:w="140" w:type="dxa"/>
+              <w:top w:w="110" w:type="dxa"/>
+              <w:bottom w:w="110" w:type="dxa"/>
+              <w:left w:w="130" w:type="dxa"/>
+              <w:right w:w="130" w:type="dxa"/>
             </w:tcMar>
           </w:tcPr>
           <w:p>
             <w:pPr>
-              <w:spacing w:before="0" w:after="0"/>
               <w:jc w:val="center"/>
             </w:pPr>
             <w:r>
@@ -3684,15 +3776,14 @@
             <w:tcW w:type="dxa" w:w="2160"/>
             <w:shd w:fill="2E5339"/>
             <w:tcMar>
-              <w:top w:w="120" w:type="dxa"/>
-              <w:bottom w:w="120" w:type="dxa"/>
-              <w:left w:w="140" w:type="dxa"/>
-              <w:right w:w="140" w:type="dxa"/>
+              <w:top w:w="110" w:type="dxa"/>
+              <w:bottom w:w="110" w:type="dxa"/>
+              <w:left w:w="130" w:type="dxa"/>
+              <w:right w:w="130" w:type="dxa"/>
             </w:tcMar>
           </w:tcPr>
           <w:p>
             <w:pPr>
-              <w:spacing w:before="0" w:after="0"/>
               <w:jc w:val="center"/>
             </w:pPr>
             <w:r>
@@ -3711,15 +3802,14 @@
             <w:tcW w:type="dxa" w:w="2549"/>
             <w:shd w:fill="2E5339"/>
             <w:tcMar>
-              <w:top w:w="120" w:type="dxa"/>
-              <w:bottom w:w="120" w:type="dxa"/>
-              <w:left w:w="140" w:type="dxa"/>
-              <w:right w:w="140" w:type="dxa"/>
+              <w:top w:w="110" w:type="dxa"/>
+              <w:bottom w:w="110" w:type="dxa"/>
+              <w:left w:w="130" w:type="dxa"/>
+              <w:right w:w="130" w:type="dxa"/>
             </w:tcMar>
           </w:tcPr>
           <w:p>
             <w:pPr>
-              <w:spacing w:before="0" w:after="0"/>
               <w:jc w:val="center"/>
             </w:pPr>
             <w:r>
@@ -3748,7 +3838,6 @@
           </w:tcPr>
           <w:p>
             <w:pPr>
-              <w:spacing w:before="0" w:after="0"/>
               <w:jc w:val="center"/>
             </w:pPr>
             <w:r>
@@ -3773,7 +3862,6 @@
           </w:tcPr>
           <w:p>
             <w:pPr>
-              <w:spacing w:before="0" w:after="0"/>
               <w:jc w:val="left"/>
             </w:pPr>
             <w:r>
@@ -3798,7 +3886,6 @@
           </w:tcPr>
           <w:p>
             <w:pPr>
-              <w:spacing w:before="0" w:after="0"/>
               <w:jc w:val="center"/>
             </w:pPr>
             <w:r>
@@ -3823,7 +3910,6 @@
           </w:tcPr>
           <w:p>
             <w:pPr>
-              <w:spacing w:before="0" w:after="0"/>
               <w:jc w:val="center"/>
             </w:pPr>
             <w:r>
@@ -3850,7 +3936,6 @@
           </w:tcPr>
           <w:p>
             <w:pPr>
-              <w:spacing w:before="0" w:after="0"/>
               <w:jc w:val="center"/>
             </w:pPr>
             <w:r>
@@ -3875,7 +3960,6 @@
           </w:tcPr>
           <w:p>
             <w:pPr>
-              <w:spacing w:before="0" w:after="0"/>
               <w:jc w:val="left"/>
             </w:pPr>
             <w:r>
@@ -3900,7 +3984,6 @@
           </w:tcPr>
           <w:p>
             <w:pPr>
-              <w:spacing w:before="0" w:after="0"/>
               <w:jc w:val="center"/>
             </w:pPr>
             <w:r>
@@ -3925,7 +4008,6 @@
           </w:tcPr>
           <w:p>
             <w:pPr>
-              <w:spacing w:before="0" w:after="0"/>
               <w:jc w:val="center"/>
             </w:pPr>
             <w:r>
@@ -3952,7 +4034,6 @@
           </w:tcPr>
           <w:p>
             <w:pPr>
-              <w:spacing w:before="0" w:after="0"/>
               <w:jc w:val="center"/>
             </w:pPr>
             <w:r>
@@ -3977,7 +4058,6 @@
           </w:tcPr>
           <w:p>
             <w:pPr>
-              <w:spacing w:before="0" w:after="0"/>
               <w:jc w:val="left"/>
             </w:pPr>
             <w:r>
@@ -4002,7 +4082,6 @@
           </w:tcPr>
           <w:p>
             <w:pPr>
-              <w:spacing w:before="0" w:after="0"/>
               <w:jc w:val="center"/>
             </w:pPr>
             <w:r>
@@ -4027,7 +4106,6 @@
           </w:tcPr>
           <w:p>
             <w:pPr>
-              <w:spacing w:before="0" w:after="0"/>
               <w:jc w:val="center"/>
             </w:pPr>
             <w:r>
@@ -4054,7 +4132,6 @@
           </w:tcPr>
           <w:p>
             <w:pPr>
-              <w:spacing w:before="0" w:after="0"/>
               <w:jc w:val="center"/>
             </w:pPr>
             <w:r>
@@ -4079,7 +4156,6 @@
           </w:tcPr>
           <w:p>
             <w:pPr>
-              <w:spacing w:before="0" w:after="0"/>
               <w:jc w:val="left"/>
             </w:pPr>
             <w:r>
@@ -4104,7 +4180,6 @@
           </w:tcPr>
           <w:p>
             <w:pPr>
-              <w:spacing w:before="0" w:after="0"/>
               <w:jc w:val="center"/>
             </w:pPr>
             <w:r>
@@ -4129,7 +4204,6 @@
           </w:tcPr>
           <w:p>
             <w:pPr>
-              <w:spacing w:before="0" w:after="0"/>
               <w:jc w:val="center"/>
             </w:pPr>
             <w:r>
@@ -4156,7 +4230,6 @@
           </w:tcPr>
           <w:p>
             <w:pPr>
-              <w:spacing w:before="0" w:after="0"/>
               <w:jc w:val="center"/>
             </w:pPr>
             <w:r>
@@ -4181,7 +4254,6 @@
           </w:tcPr>
           <w:p>
             <w:pPr>
-              <w:spacing w:before="0" w:after="0"/>
               <w:jc w:val="left"/>
             </w:pPr>
             <w:r>
@@ -4206,7 +4278,6 @@
           </w:tcPr>
           <w:p>
             <w:pPr>
-              <w:spacing w:before="0" w:after="0"/>
               <w:jc w:val="center"/>
             </w:pPr>
             <w:r>
@@ -4231,7 +4302,6 @@
           </w:tcPr>
           <w:p>
             <w:pPr>
-              <w:spacing w:before="0" w:after="0"/>
               <w:jc w:val="center"/>
             </w:pPr>
             <w:r>
@@ -4258,7 +4328,6 @@
           </w:tcPr>
           <w:p>
             <w:pPr>
-              <w:spacing w:before="0" w:after="0"/>
               <w:jc w:val="center"/>
             </w:pPr>
             <w:r>
@@ -4283,7 +4352,6 @@
           </w:tcPr>
           <w:p>
             <w:pPr>
-              <w:spacing w:before="0" w:after="0"/>
               <w:jc w:val="left"/>
             </w:pPr>
             <w:r>
@@ -4308,7 +4376,6 @@
           </w:tcPr>
           <w:p>
             <w:pPr>
-              <w:spacing w:before="0" w:after="0"/>
               <w:jc w:val="center"/>
             </w:pPr>
             <w:r>
@@ -4333,7 +4400,6 @@
           </w:tcPr>
           <w:p>
             <w:pPr>
-              <w:spacing w:before="0" w:after="0"/>
               <w:jc w:val="center"/>
             </w:pPr>
             <w:r>
@@ -4388,12 +4454,12 @@
         <w:tblLayout w:type="fixed"/>
         <w:tblLook w:firstColumn="1" w:firstRow="1" w:lastColumn="0" w:lastRow="0" w:noHBand="0" w:noVBand="1" w:val="04A0"/>
         <w:tblBorders>
-          <w:top w:val="single" w:sz="4" w:space="0" w:color="C5D0C8"/>
-          <w:bottom w:val="single" w:sz="4" w:space="0" w:color="C5D0C8"/>
-          <w:insideH w:val="single" w:sz="4" w:space="0" w:color="C5D0C8"/>
-          <w:insideV w:val="none"/>
-          <w:left w:val="none"/>
-          <w:right w:val="none"/>
+          <w:top w:val="single" w:sz="4" w:space="0" w:color="555555"/>
+          <w:bottom w:val="single" w:sz="4" w:space="0" w:color="555555"/>
+          <w:left w:val="single" w:sz="4" w:space="0" w:color="555555"/>
+          <w:right w:val="single" w:sz="4" w:space="0" w:color="555555"/>
+          <w:insideH w:val="single" w:sz="4" w:space="0" w:color="555555"/>
+          <w:insideV w:val="single" w:sz="4" w:space="0" w:color="555555"/>
         </w:tblBorders>
       </w:tblPr>
       <w:tblGrid>
@@ -4408,15 +4474,14 @@
             <w:tcW w:type="dxa" w:w="2592"/>
             <w:shd w:fill="2E5339"/>
             <w:tcMar>
-              <w:top w:w="120" w:type="dxa"/>
-              <w:bottom w:w="120" w:type="dxa"/>
-              <w:left w:w="140" w:type="dxa"/>
-              <w:right w:w="140" w:type="dxa"/>
+              <w:top w:w="110" w:type="dxa"/>
+              <w:bottom w:w="110" w:type="dxa"/>
+              <w:left w:w="130" w:type="dxa"/>
+              <w:right w:w="130" w:type="dxa"/>
             </w:tcMar>
           </w:tcPr>
           <w:p>
             <w:pPr>
-              <w:spacing w:before="0" w:after="0"/>
               <w:jc w:val="center"/>
             </w:pPr>
             <w:r>
@@ -4435,15 +4500,14 @@
             <w:tcW w:type="dxa" w:w="2880"/>
             <w:shd w:fill="2E5339"/>
             <w:tcMar>
-              <w:top w:w="120" w:type="dxa"/>
-              <w:bottom w:w="120" w:type="dxa"/>
-              <w:left w:w="140" w:type="dxa"/>
-              <w:right w:w="140" w:type="dxa"/>
+              <w:top w:w="110" w:type="dxa"/>
+              <w:bottom w:w="110" w:type="dxa"/>
+              <w:left w:w="130" w:type="dxa"/>
+              <w:right w:w="130" w:type="dxa"/>
             </w:tcMar>
           </w:tcPr>
           <w:p>
             <w:pPr>
-              <w:spacing w:before="0" w:after="0"/>
               <w:jc w:val="center"/>
             </w:pPr>
             <w:r>
@@ -4462,15 +4526,14 @@
             <w:tcW w:type="dxa" w:w="1728"/>
             <w:shd w:fill="2E5339"/>
             <w:tcMar>
-              <w:top w:w="120" w:type="dxa"/>
-              <w:bottom w:w="120" w:type="dxa"/>
-              <w:left w:w="140" w:type="dxa"/>
-              <w:right w:w="140" w:type="dxa"/>
+              <w:top w:w="110" w:type="dxa"/>
+              <w:bottom w:w="110" w:type="dxa"/>
+              <w:left w:w="130" w:type="dxa"/>
+              <w:right w:w="130" w:type="dxa"/>
             </w:tcMar>
           </w:tcPr>
           <w:p>
             <w:pPr>
-              <w:spacing w:before="0" w:after="0"/>
               <w:jc w:val="center"/>
             </w:pPr>
             <w:r>
@@ -4489,15 +4552,14 @@
             <w:tcW w:type="dxa" w:w="1829"/>
             <w:shd w:fill="2E5339"/>
             <w:tcMar>
-              <w:top w:w="120" w:type="dxa"/>
-              <w:bottom w:w="120" w:type="dxa"/>
-              <w:left w:w="140" w:type="dxa"/>
-              <w:right w:w="140" w:type="dxa"/>
+              <w:top w:w="110" w:type="dxa"/>
+              <w:bottom w:w="110" w:type="dxa"/>
+              <w:left w:w="130" w:type="dxa"/>
+              <w:right w:w="130" w:type="dxa"/>
             </w:tcMar>
           </w:tcPr>
           <w:p>
             <w:pPr>
-              <w:spacing w:before="0" w:after="0"/>
               <w:jc w:val="center"/>
             </w:pPr>
             <w:r>
@@ -4526,7 +4588,6 @@
           </w:tcPr>
           <w:p>
             <w:pPr>
-              <w:spacing w:before="0" w:after="0"/>
               <w:jc w:val="center"/>
             </w:pPr>
             <w:r>
@@ -4551,7 +4612,6 @@
           </w:tcPr>
           <w:p>
             <w:pPr>
-              <w:spacing w:before="0" w:after="0"/>
               <w:jc w:val="left"/>
             </w:pPr>
             <w:r>
@@ -4576,7 +4636,6 @@
           </w:tcPr>
           <w:p>
             <w:pPr>
-              <w:spacing w:before="0" w:after="0"/>
               <w:jc w:val="center"/>
             </w:pPr>
             <w:r>
@@ -4601,7 +4660,6 @@
           </w:tcPr>
           <w:p>
             <w:pPr>
-              <w:spacing w:before="0" w:after="0"/>
               <w:jc w:val="center"/>
             </w:pPr>
             <w:r>
@@ -4628,7 +4686,6 @@
           </w:tcPr>
           <w:p>
             <w:pPr>
-              <w:spacing w:before="0" w:after="0"/>
               <w:jc w:val="left"/>
             </w:pPr>
             <w:r>
@@ -4653,7 +4710,6 @@
           </w:tcPr>
           <w:p>
             <w:pPr>
-              <w:spacing w:before="0" w:after="0"/>
               <w:jc w:val="left"/>
             </w:pPr>
             <w:r>
@@ -4678,7 +4734,6 @@
           </w:tcPr>
           <w:p>
             <w:pPr>
-              <w:spacing w:before="0" w:after="0"/>
               <w:jc w:val="center"/>
             </w:pPr>
             <w:r>
@@ -4703,7 +4758,6 @@
           </w:tcPr>
           <w:p>
             <w:pPr>
-              <w:spacing w:before="0" w:after="0"/>
               <w:jc w:val="center"/>
             </w:pPr>
             <w:r>
@@ -4730,7 +4784,6 @@
           </w:tcPr>
           <w:p>
             <w:pPr>
-              <w:spacing w:before="0" w:after="0"/>
               <w:jc w:val="left"/>
             </w:pPr>
             <w:r>
@@ -4755,7 +4808,6 @@
           </w:tcPr>
           <w:p>
             <w:pPr>
-              <w:spacing w:before="0" w:after="0"/>
               <w:jc w:val="left"/>
             </w:pPr>
             <w:r>
@@ -4780,7 +4832,6 @@
           </w:tcPr>
           <w:p>
             <w:pPr>
-              <w:spacing w:before="0" w:after="0"/>
               <w:jc w:val="center"/>
             </w:pPr>
             <w:r>
@@ -4805,7 +4856,6 @@
           </w:tcPr>
           <w:p>
             <w:pPr>
-              <w:spacing w:before="0" w:after="0"/>
               <w:jc w:val="center"/>
             </w:pPr>
             <w:r>

</xml_diff>

<commit_message>
docs: expand and enrich all report subsections with academic depth
</commit_message>
<xml_diff>
--- a/1_RGB_train.docx
+++ b/1_RGB_train.docx
@@ -30,7 +30,7 @@
           <w:b/>
           <w:sz w:val="24"/>
         </w:rPr>
-        <w:t>Pelatihan Custom Deep Residual CNN, Ekstraksi Vektor Fitur 512-D, dan Hyperparameter Tuning SVM</w:t>
+        <w:t>Pelatihan Custom Deep Residual CNN, Ekstraksi Vektor Fitur 512-D, dan Penalaan Hyperparameter SVM</w:t>
         <w:br/>
         <w:t>(1_RGB_train.ipynb)</w:t>
       </w:r>
@@ -218,24 +218,30 @@
     </w:p>
     <w:p>
       <w:pPr>
-        <w:pStyle w:val="ListBullet"/>
-        <w:spacing w:before="0" w:after="60" w:line="276" w:lineRule="auto"/>
+        <w:spacing w:before="0" w:after="100" w:line="276" w:lineRule="auto"/>
         <w:jc w:val="both"/>
       </w:pPr>
       <w:r>
         <w:rPr>
           <w:rFonts w:ascii="Times New Roman" w:hAnsi="Times New Roman"/>
-          <w:b/>
+          <w:i w:val="0"/>
           <w:sz w:val="23"/>
         </w:rPr>
-        <w:t xml:space="preserve">1. Pelatihan Custom CNN: </w:t>
+        <w:t>Praktikum ini bertujuan untuk mengeksplorasi potensi sinergi antara Convolutional Neural Network (CNN) sebagai ekstraktor fitur representasional otomatis dan Support Vector Machine (SVM) sebagai pengklasifikasi dengan margin maksimal pada domain citra warna RGB (Red, Green, Blue). Melalui eksperimen ini, mahasiswa mempelajari bagaimana ruang representasi laten yang dibentuk oleh jaringan konvolusi dalam dapat dimanfaatkan oleh algoritma kernel machine untuk memisahkan kelas-kelas objek yang kompleks.</w:t>
       </w:r>
+    </w:p>
+    <w:p>
+      <w:pPr>
+        <w:spacing w:before="0" w:after="100" w:line="276" w:lineRule="auto"/>
+        <w:jc w:val="both"/>
+      </w:pPr>
       <w:r>
         <w:rPr>
           <w:rFonts w:ascii="Times New Roman" w:hAnsi="Times New Roman"/>
+          <w:i w:val="0"/>
           <w:sz w:val="23"/>
         </w:rPr>
-        <w:t>Membangun dan melatih model Custom Deep Residual CNN (cnn_3ch) pada dataset CIFAR-10 citra RGB 32x32x3 dari awal tanpa transfer learning.</w:t>
+        <w:t>Secara spesifik dan operasional, sasaran praktikum dijabarkan ke dalam beberapa poin teknis yang terukur:</w:t>
       </w:r>
     </w:p>
     <w:p>
@@ -250,14 +256,14 @@
           <w:b/>
           <w:sz w:val="23"/>
         </w:rPr>
-        <w:t xml:space="preserve">2. Kebijakan Anti-Leakage: </w:t>
+        <w:t xml:space="preserve">1. Perancangan &amp; Pelatihan CNN Kustom: </w:t>
       </w:r>
       <w:r>
         <w:rPr>
           <w:rFonts w:ascii="Times New Roman" w:hAnsi="Times New Roman"/>
           <w:sz w:val="23"/>
         </w:rPr>
-        <w:t>Menerapkan partisi 3-way stratified deterministik guna mencegah data leakage antara CNN dan SVM.</w:t>
+        <w:t>Merancang arsitektur Custom Deep Residual CNN (cnn_3ch) yang terdiri atas 4 blok residual dari awal (scratch) tanpa bobot pretrained ImageNet, dan melatihnya menggunakan optimasi modern.</w:t>
       </w:r>
     </w:p>
     <w:p>
@@ -272,14 +278,14 @@
           <w:b/>
           <w:sz w:val="23"/>
         </w:rPr>
-        <w:t xml:space="preserve">3. Ekstraksi Fitur: </w:t>
+        <w:t xml:space="preserve">2. Kebijakan Ketat Anti-Data Leakage: </w:t>
       </w:r>
       <w:r>
         <w:rPr>
           <w:rFonts w:ascii="Times New Roman" w:hAnsi="Times New Roman"/>
           <w:sz w:val="23"/>
         </w:rPr>
-        <w:t>Mengekstrak representasi vektor fitur tingkat tinggi berdimensi 512 dari layer GlobalAveragePooling2D (svm_features) dengan teknik Test-Time Augmentation (TTA Horizontal Flip).</w:t>
+        <w:t>Menerapkan partisi 3-way stratified yang memisahkan data menjadi training set (40.000 sampel), validation set (5.000 sampel), dan independent validation set (5.000 sampel) untuk memastikan penalaan SVM bebas dari data leakage.</w:t>
       </w:r>
     </w:p>
     <w:p>
@@ -294,14 +300,14 @@
           <w:b/>
           <w:sz w:val="23"/>
         </w:rPr>
-        <w:t xml:space="preserve">4. Tuning SVM: </w:t>
+        <w:t xml:space="preserve">3. Ekstraksi Fitur Laten 512-D: </w:t>
       </w:r>
       <w:r>
         <w:rPr>
           <w:rFonts w:ascii="Times New Roman" w:hAnsi="Times New Roman"/>
           <w:sz w:val="23"/>
         </w:rPr>
-        <w:t>Melakukan evaluasi 54 kombinasi hyperparameter SVM (C dan gamma) secara multi-core paralel pada data validasi independen.</w:t>
+        <w:t>Mengekstrak representasi laten tingkat tinggi berdimensi 512 dari layer GlobalAveragePooling2D (svm_features) dengan mengaplikasikan Test-Time Augmentation (TTA) berbasis horizontal flip.</w:t>
       </w:r>
     </w:p>
     <w:p>
@@ -316,14 +322,36 @@
           <w:b/>
           <w:sz w:val="23"/>
         </w:rPr>
-        <w:t xml:space="preserve">5. Serialisasi Model: </w:t>
+        <w:t xml:space="preserve">4. Optimasi Hyperparameter SVM: </w:t>
       </w:r>
       <w:r>
         <w:rPr>
           <w:rFonts w:ascii="Times New Roman" w:hAnsi="Times New Roman"/>
           <w:sz w:val="23"/>
         </w:rPr>
-        <w:t>Melatih model SVM final pada seluruh 50.000 sampel training dan menyimpan model terpadu ke format .keras dan .pkl.</w:t>
+        <w:t>Melakukan penalaan sistematis terhadap 54 kombinasi hyperparameter SVM (parameter penalti C dan kernel bandwidth gamma) secara paralel multi-core pada partisi validasi independen.</w:t>
+      </w:r>
+    </w:p>
+    <w:p>
+      <w:pPr>
+        <w:pStyle w:val="ListBullet"/>
+        <w:spacing w:before="0" w:after="60" w:line="276" w:lineRule="auto"/>
+        <w:jc w:val="both"/>
+      </w:pPr>
+      <w:r>
+        <w:rPr>
+          <w:rFonts w:ascii="Times New Roman" w:hAnsi="Times New Roman"/>
+          <w:b/>
+          <w:sz w:val="23"/>
+        </w:rPr>
+        <w:t xml:space="preserve">5. Serialisasi Artefak Model Terpadu: </w:t>
+      </w:r>
+      <w:r>
+        <w:rPr>
+          <w:rFonts w:ascii="Times New Roman" w:hAnsi="Times New Roman"/>
+          <w:sz w:val="23"/>
+        </w:rPr>
+        <w:t>Melatih model SVM final pada seluruh 50.000 sampel fitur training dan mengekspor seluruh artefak model terpadu (.keras dan .pkl) ke dalam repositori penyimpanan.</w:t>
       </w:r>
     </w:p>
     <w:p>
@@ -352,7 +380,43 @@
           <w:i w:val="0"/>
           <w:sz w:val="23"/>
         </w:rPr>
-        <w:t>Convolutional Neural Network (CNN) adalah arsitektur deep learning yang dirancang khusus untuk memproses data berstruktur spasial grid seperti citra dua dimensi. Pada penelitian ini, digunakan beberapa konsep teoretis fundamental:</w:t>
+        <w:t>Convolutional Neural Network (CNN) merupakan paradigma arsitektur jaringan saraf tiruan yang memanfaatkan operasi konvolusi matematis untuk mengekstrak hierarki fitur visual lokal yang invarian terhadap translasi spasial. Operasi konvolusi 2D pada posisi (i, j) dari peta fitur input X dengan kernel bobot W berukuran k x k dinyatakan sebagai:</w:t>
+      </w:r>
+    </w:p>
+    <w:p>
+      <w:pPr>
+        <w:spacing w:before="0" w:after="100" w:line="276" w:lineRule="auto"/>
+        <w:jc w:val="both"/>
+      </w:pPr>
+      <w:r>
+        <w:rPr>
+          <w:rFonts w:ascii="Times New Roman" w:hAnsi="Times New Roman"/>
+          <w:b/>
+          <w:sz w:val="23"/>
+        </w:rPr>
+        <w:t xml:space="preserve">Persamaan Konvolusi 2D: </w:t>
+      </w:r>
+      <w:r>
+        <w:rPr>
+          <w:rFonts w:ascii="Times New Roman" w:hAnsi="Times New Roman"/>
+          <w:i/>
+          <w:sz w:val="23"/>
+        </w:rPr>
+        <w:t>S(i, j) = (X * W)(i, j) = sum_m sum_n X(i - m, j - n) * W(m, n) + b</w:t>
+      </w:r>
+    </w:p>
+    <w:p>
+      <w:pPr>
+        <w:spacing w:before="0" w:after="100" w:line="276" w:lineRule="auto"/>
+        <w:jc w:val="both"/>
+      </w:pPr>
+      <w:r>
+        <w:rPr>
+          <w:rFonts w:ascii="Times New Roman" w:hAnsi="Times New Roman"/>
+          <w:i w:val="0"/>
+          <w:sz w:val="23"/>
+        </w:rPr>
+        <w:t>Dalam penelitian ini, beberapa fondasi teoretis fundamental diintegrasikan secara komprehensif:</w:t>
       </w:r>
     </w:p>
     <w:p>
@@ -374,7 +438,7 @@
           <w:rFonts w:ascii="Times New Roman" w:hAnsi="Times New Roman"/>
           <w:sz w:val="23"/>
         </w:rPr>
-        <w:t>Model dilatih murni dari inisialisasi bobot acak (He Normal) tanpa memanfaatkan bobot yang sudah dilatih pada ImageNet. Hal ini menjamin bahwa representasi fitur yang dipelajari sepenuhnya mencerminkan karakteristik intrinsik distribusi data CIFAR-10.</w:t>
+        <w:t>Pelatihan model dilakukan murni dari inisialisasi bobot acak He Normal tanpa mentransfer representasi dari ImageNet. Pendekatan ini menjamin bahwa seluruh filter konvolusi 2D mempelajari manifold visual yang spesifik terhadap karakteristik citra berdimensi rendah (32x32 piksel) pada dataset CIFAR-10.</w:t>
       </w:r>
     </w:p>
     <w:p>
@@ -389,14 +453,14 @@
           <w:b/>
           <w:sz w:val="23"/>
         </w:rPr>
-        <w:t xml:space="preserve">Residual Connections (Skip Connections): </w:t>
+        <w:t xml:space="preserve">Residual Skip Connections: </w:t>
       </w:r>
       <w:r>
         <w:rPr>
           <w:rFonts w:ascii="Times New Roman" w:hAnsi="Times New Roman"/>
           <w:sz w:val="23"/>
         </w:rPr>
-        <w:t>Hubungan residual memetakan input x langsung ke output blok melalui jalur pintas F(x) + x. Mekanisme ini secara drastis mengatasi kendala vanishing gradient pada jaringan konvolusi yang dalam, memungkinkan gradien propagasi balik mengalir tanpa hambatan.</w:t>
+        <w:t>Blok residual mengatasi kendala degradasi gradien (vanishing gradient) pada arsitektur dalam melalui jalur pintas identitas F(x) + x. Ketika dimensi saluran bertambah, proyeksi konvolusi 1x1 diterapkan pada jalur pintas untuk menyelaraskan dimensi tensor secara mulus.</w:t>
       </w:r>
     </w:p>
     <w:p>
@@ -411,14 +475,14 @@
           <w:b/>
           <w:sz w:val="23"/>
         </w:rPr>
-        <w:t xml:space="preserve">Global Average Pooling (GAP) vs Flattening: </w:t>
+        <w:t xml:space="preserve">Global Average Pooling (GAP): </w:t>
       </w:r>
       <w:r>
         <w:rPr>
           <w:rFonts w:ascii="Times New Roman" w:hAnsi="Times New Roman"/>
           <w:sz w:val="23"/>
         </w:rPr>
-        <w:t>Sebagai pengganti lapisan Flatten konvensional yang menghasilkan jutaan parameter rentan overfitting, GAP merata-ratakan nilai spasial (8x8) setiap feature map menjadi satu nilai skalar, mereduksi parameter menjadi nol pada tahap transisi ke classifier.</w:t>
+        <w:t>Sebagai alternatif dari lapisan Flattening konvensional yang menciptakan jutaan koneksi bobot padat rentan overfitting, GAP merata-ratakan seluruh peta fitur spasial (8x8) menjadi satu nilai skalar per saluran, mereduksi parameter menjadi nol pada transisi ke vektor fitur.</w:t>
       </w:r>
     </w:p>
     <w:p>
@@ -433,58 +497,14 @@
           <w:b/>
           <w:sz w:val="23"/>
         </w:rPr>
-        <w:t xml:space="preserve">Representasi Spektral RGB: </w:t>
+        <w:t xml:space="preserve">SVM Kernel RBF &amp; Pemaksimalan Margin: </w:t>
       </w:r>
       <w:r>
         <w:rPr>
           <w:rFonts w:ascii="Times New Roman" w:hAnsi="Times New Roman"/>
           <w:sz w:val="23"/>
         </w:rPr>
-        <w:t>Format citra RGB mengodekan informasi fotometri pada 3 panjang gelombang cahaya (Merah, Hijau, Biru) yang mempertahankan kekayaan kromatisitas dan gradien warna alami.</w:t>
-      </w:r>
-    </w:p>
-    <w:p>
-      <w:pPr>
-        <w:pStyle w:val="ListBullet"/>
-        <w:spacing w:before="0" w:after="60" w:line="276" w:lineRule="auto"/>
-        <w:jc w:val="both"/>
-      </w:pPr>
-      <w:r>
-        <w:rPr>
-          <w:rFonts w:ascii="Times New Roman" w:hAnsi="Times New Roman"/>
-          <w:b/>
-          <w:sz w:val="23"/>
-        </w:rPr>
-        <w:t xml:space="preserve">SVM dengan Kernel RBF: </w:t>
-      </w:r>
-      <w:r>
-        <w:rPr>
-          <w:rFonts w:ascii="Times New Roman" w:hAnsi="Times New Roman"/>
-          <w:sz w:val="23"/>
-        </w:rPr>
-        <w:t>Kernel RBF K(x, x') = exp(-gamma * ||x - x'||^2) memproyeksikan vektor fitur 512-D ke ruang berdimensi tak hingga untuk menemukan hyperplane pemisah dengan margin terlebar.</w:t>
-      </w:r>
-    </w:p>
-    <w:p>
-      <w:pPr>
-        <w:pStyle w:val="ListBullet"/>
-        <w:spacing w:before="0" w:after="60" w:line="276" w:lineRule="auto"/>
-        <w:jc w:val="both"/>
-      </w:pPr>
-      <w:r>
-        <w:rPr>
-          <w:rFonts w:ascii="Times New Roman" w:hAnsi="Times New Roman"/>
-          <w:b/>
-          <w:sz w:val="23"/>
-        </w:rPr>
-        <w:t xml:space="preserve">Prinsip Anti-Data Leakage: </w:t>
-      </w:r>
-      <w:r>
-        <w:rPr>
-          <w:rFonts w:ascii="Times New Roman" w:hAnsi="Times New Roman"/>
-          <w:sz w:val="23"/>
-        </w:rPr>
-        <w:t>Memastikan data testing resmi (10.000 citra) tetap terisolasi dan tidak pernah disentuh saat penyesuaian bobot CNN maupun penalaan hyperparameter SVM.</w:t>
+        <w:t>Algoritma Support Vector Machine (SVM) mengklasifikasikan sampel dengan memaksimalkan margin geometris 2 / ||w|| antara hyperplane pemisah dan titik data terdekat (support vectors). Pemetaan ke ruang berdimensi tak hingga dilakukan menggunakan Radial Basis Function (RBF) kernel: K(x, x') = exp(-gamma * ||x - x'||^2).</w:t>
       </w:r>
     </w:p>
     <w:p>
@@ -513,7 +533,7 @@
           <w:i w:val="0"/>
           <w:sz w:val="23"/>
         </w:rPr>
-        <w:t>Tabel 1 merangkum spesifikasi perangkat lunak, perangkat keras, dan lingkungan komputasi yang digunakan pada eksperimen ini:</w:t>
+        <w:t>Eksperimen dijalankan pada infrastruktur perangkat keras dan lingkungan komputasi berkinerja tinggi guna menjamin efisiensi dan kestabilan proses pelatihan:</w:t>
       </w:r>
     </w:p>
     <w:tbl>
@@ -962,7 +982,7 @@
                 <w:color w:val="000000"/>
                 <w:sz w:val="20"/>
               </w:rPr>
-              <w:t>CIFAR-10 (data training 50.000 citra RGB 32x32, 10 kelas)</w:t>
+              <w:t>CIFAR-10 data training (50.000 citra RGB 32x32x3, 10 kelas seimbang)</w:t>
             </w:r>
           </w:p>
         </w:tc>
@@ -1070,7 +1090,7 @@
                 <w:color w:val="000000"/>
                 <w:sz w:val="20"/>
               </w:rPr>
-              <w:t>custom_cnn_cifar10_final.keras (berisi Custom CNN + Scaler + SVM pipeline dalam satu file), cnn_model.keras, scaler.pkl, svm_model.pkl, train_features.npz, test_features.npz</w:t>
+              <w:t>custom_cnn_cifar10_final.keras, best_cnn_cifar10.keras, scaler.pkl, svm_model.pkl</w:t>
             </w:r>
           </w:p>
         </w:tc>
@@ -1080,6 +1100,20 @@
       <w:pPr>
         <w:spacing w:before="0" w:after="120"/>
       </w:pPr>
+    </w:p>
+    <w:p>
+      <w:pPr>
+        <w:spacing w:before="0" w:after="100" w:line="276" w:lineRule="auto"/>
+        <w:jc w:val="both"/>
+      </w:pPr>
+      <w:r>
+        <w:rPr>
+          <w:rFonts w:ascii="Times New Roman" w:hAnsi="Times New Roman"/>
+          <w:i w:val="0"/>
+          <w:sz w:val="23"/>
+        </w:rPr>
+        <w:t>Lingkungan komputasi di atas memanfaatkan akselerasi GPU NVIDIA RTX 2050 yang mendukung operasi matrix multiplication berpresisi FP32/FP16 secara optimal. Penggunaan batch size 128 memungkinkan pemanfaatan tensor core secara maksimal tanpa menyebabkan lonjakan latensi transfer data antara memori host RAM dan GPU VRAM. Mekanisme deterministik juga diatur dengan penyematan fixed random seed = 42 pada subsistem NumPy, Python random, dan TensorFlow.</w:t>
+      </w:r>
     </w:p>
     <w:p>
       <w:pPr>
@@ -1107,7 +1141,35 @@
           <w:i w:val="0"/>
           <w:sz w:val="23"/>
         </w:rPr>
-        <w:t>Dataset CIFAR-10 adalah tolok ukur standar visi komputer yang terdiri atas 60.000 citra berwarna berdimensi 32x32 piksel dalam 10 kelas objek yang saling terpisah secara mutual eksklusif (airplane, automobile, bird, cat, deer, dog, frog, horse, ship, truck). Sebanyak 50.000 sampel dialokasikan untuk fase pengembangan (training/validation), dan 10.000 sampel untuk pengujian akhir.</w:t>
+        <w:t>Dataset CIFAR-10 (Canadian Institute for Advanced Research) merupakan salah satu tolok ukur (benchmark) paling fundamental dalam literatur visi komputer. Dataset ini dikompilasi oleh Alex Krizhevsky, Vinod Nair, dan Geoffrey Hinton, berisikan 60.000 citra berwarna berukuran 32x32 piksel yang terbagi ke dalam 10 kelas objek mutual eksklusif.</w:t>
+      </w:r>
+    </w:p>
+    <w:p>
+      <w:pPr>
+        <w:spacing w:before="0" w:after="100" w:line="276" w:lineRule="auto"/>
+        <w:jc w:val="both"/>
+      </w:pPr>
+      <w:r>
+        <w:rPr>
+          <w:rFonts w:ascii="Times New Roman" w:hAnsi="Times New Roman"/>
+          <w:i w:val="0"/>
+          <w:sz w:val="23"/>
+        </w:rPr>
+        <w:t>Ke-10 kelas tersebut mencakup objek bergerak dan makhluk hidup: airplane (pesawat), automobile (mobil sedan/pribadi), bird (burung), cat (kucing), deer (rusa), dog (anjing), frog (katak), horse (kuda), ship (kapal laut), dan truck (truk kargo). Pada notebook pelatihan ini, sebanyak 50.000 sampel citra dialokasikan secara khusus sebagai korpus pelatihan dan validasi, sementara 10.000 citra lainnya diisolasi sepenuhnya sebagai test set resmi.</w:t>
+      </w:r>
+    </w:p>
+    <w:p>
+      <w:pPr>
+        <w:spacing w:before="0" w:after="100" w:line="276" w:lineRule="auto"/>
+        <w:jc w:val="both"/>
+      </w:pPr>
+      <w:r>
+        <w:rPr>
+          <w:rFonts w:ascii="Times New Roman" w:hAnsi="Times New Roman"/>
+          <w:i w:val="0"/>
+          <w:sz w:val="23"/>
+        </w:rPr>
+        <w:t>Tantangan utama CIFAR-10 terletak pada resolusinya yang sangat kompak (hanya 1.024 piksel per kanal warna). Resolusi rendah ini menimbulkan tingkat ambiguitas visual yang tinggi, di mana objek-objek kecil sering kali kehilangan kontur mikro yang jelas dan memiliki variasi sudut pandang, latar belakang alami, serta pose tubuh yang sangat beragam.</w:t>
       </w:r>
     </w:p>
     <w:p>
@@ -1136,63 +1198,35 @@
           <w:i w:val="0"/>
           <w:sz w:val="23"/>
         </w:rPr>
-        <w:t>Distribusi dataset training CIFAR-10 bersifat seimbang sempurna, dengan tepat 5.000 citra per kelas. Contoh visualisasi citra RGB ditampilkan pada Gambar 1:</w:t>
+        <w:t>Sebelum memulai pemodelan, visualisasi eksploratif dilakukan terhadap sampel citra mentah untuk memvalidasi representasi visual dan struktur label. Pemeriksaan terhadap sampel visual mengonfirmasi bahwa setiap citra memiliki 3 saluran warna yang kaya akan informasi kromatisitas, reflektansi cahaya, dan saturasi objek alami.</w:t>
       </w:r>
     </w:p>
     <w:p>
       <w:pPr>
-        <w:keepNext/>
-        <w:spacing w:before="160" w:after="60"/>
-        <w:jc w:val="center"/>
+        <w:spacing w:before="0" w:after="100" w:line="276" w:lineRule="auto"/>
+        <w:jc w:val="both"/>
       </w:pPr>
       <w:r>
-        <w:drawing>
-          <wp:inline xmlns:a="http://schemas.openxmlformats.org/drawingml/2006/main" xmlns:pic="http://schemas.openxmlformats.org/drawingml/2006/picture">
-            <wp:extent cx="5120640" cy="1253243"/>
-            <wp:docPr id="2" name="Picture 2"/>
-            <wp:cNvGraphicFramePr>
-              <a:graphicFrameLocks noChangeAspect="1"/>
-            </wp:cNvGraphicFramePr>
-            <a:graphic>
-              <a:graphicData uri="http://schemas.openxmlformats.org/drawingml/2006/picture">
-                <pic:pic>
-                  <pic:nvPicPr>
-                    <pic:cNvPr id="0" name="1_RGB_train_c3_img1.png"/>
-                    <pic:cNvPicPr/>
-                  </pic:nvPicPr>
-                  <pic:blipFill>
-                    <a:blip r:embed="rId11"/>
-                    <a:stretch>
-                      <a:fillRect/>
-                    </a:stretch>
-                  </pic:blipFill>
-                  <pic:spPr>
-                    <a:xfrm>
-                      <a:off x="0" y="0"/>
-                      <a:ext cx="5120640" cy="1253243"/>
-                    </a:xfrm>
-                    <a:prstGeom prst="rect"/>
-                  </pic:spPr>
-                </pic:pic>
-              </a:graphicData>
-            </a:graphic>
-          </wp:inline>
-        </w:drawing>
+        <w:rPr>
+          <w:rFonts w:ascii="Times New Roman" w:hAnsi="Times New Roman"/>
+          <w:i w:val="0"/>
+          <w:sz w:val="23"/>
+        </w:rPr>
+        <w:t>Distribusi frekuensi label pada 50.000 citra pelatihan dianalisis secara statistik. Hasil visualisasi membuktikan bahwa dataset memiliki distribusi kelas yang seragam sempurna (balanced dataset), di mana setiap kategori diwakili oleh tepat 5.000 sampel (10.00% per kelas). Keseimbangan ini memastikan bahwa pengoptimalan loss fungsi tidak akan terdistorsi oleh bias kelas mayoritas.</w:t>
       </w:r>
     </w:p>
     <w:p>
       <w:pPr>
-        <w:spacing w:before="0" w:after="200"/>
-        <w:jc w:val="center"/>
+        <w:spacing w:before="0" w:after="100" w:line="276" w:lineRule="auto"/>
+        <w:jc w:val="both"/>
       </w:pPr>
       <w:r>
         <w:rPr>
           <w:rFonts w:ascii="Times New Roman" w:hAnsi="Times New Roman"/>
-          <w:i/>
-          <w:color w:val="3C3C3C"/>
-          <w:sz w:val="19"/>
+          <w:i w:val="0"/>
+          <w:sz w:val="23"/>
         </w:rPr>
-        <w:t>Gambar 1. Contoh Citra Dataset CIFAR-10 RGB (32x32x3) pada 10 Kategori Objek</w:t>
+        <w:t>Inspeksi visual juga memperlihatkan bahwa kelas kendaraan cenderung memiliki latar belakang bertekstur teratur (seperti aspal jalan raya atau permukaan air laut), sementara kelas hewan memiliki latar belakang yang dinamis (seperti rumput, tanah, atau vegetasi lebat).</w:t>
       </w:r>
     </w:p>
     <w:p>
@@ -1221,7 +1255,73 @@
           <w:i w:val="0"/>
           <w:sz w:val="23"/>
         </w:rPr>
-        <w:t>Nilai intensitas piksel asli yang berada pada rentang bilangan bulat [0, 255] dinormalisasi menjadi bilangan pecahan [0.0, 1.0] dengan membagi matriks citra dengan 255.0. Label kelas dikonversi menjadi format One-Hot Encoding berdimensi 10 untuk proses penghitungan categorical crossentropy loss.</w:t>
+        <w:t>Tahapan prapemrosesan data dirancang secara sistematis untuk menstabilkan konvergensi gradien selama pelatihan jaringan konvolusi:</w:t>
+      </w:r>
+    </w:p>
+    <w:p>
+      <w:pPr>
+        <w:pStyle w:val="ListBullet"/>
+        <w:spacing w:before="0" w:after="60" w:line="276" w:lineRule="auto"/>
+        <w:jc w:val="both"/>
+      </w:pPr>
+      <w:r>
+        <w:rPr>
+          <w:rFonts w:ascii="Times New Roman" w:hAnsi="Times New Roman"/>
+          <w:b/>
+          <w:sz w:val="23"/>
+        </w:rPr>
+        <w:t xml:space="preserve">Normalisasi Min-Max: </w:t>
+      </w:r>
+      <w:r>
+        <w:rPr>
+          <w:rFonts w:ascii="Times New Roman" w:hAnsi="Times New Roman"/>
+          <w:sz w:val="23"/>
+        </w:rPr>
+        <w:t>Intensitas piksel mentah bertipe uint8 dalam rentang [0, 255] dikonversi menjadi tipe data floating-point 32-bit (float32) dan dibagi dengan skalar 255.0. Transformasi ini memetakan seluruh nilai ke interval kontinu [0.0, 1.0], mencegah saturasi fungsi aktivasi dan gradien yang meledak.</w:t>
+      </w:r>
+    </w:p>
+    <w:p>
+      <w:pPr>
+        <w:pStyle w:val="ListBullet"/>
+        <w:spacing w:before="0" w:after="60" w:line="276" w:lineRule="auto"/>
+        <w:jc w:val="both"/>
+      </w:pPr>
+      <w:r>
+        <w:rPr>
+          <w:rFonts w:ascii="Times New Roman" w:hAnsi="Times New Roman"/>
+          <w:b/>
+          <w:sz w:val="23"/>
+        </w:rPr>
+        <w:t xml:space="preserve">Enkoding Label Ganda: </w:t>
+      </w:r>
+      <w:r>
+        <w:rPr>
+          <w:rFonts w:ascii="Times New Roman" w:hAnsi="Times New Roman"/>
+          <w:sz w:val="23"/>
+        </w:rPr>
+        <w:t>Label kelas kategorikal (bilangan bulat 0 hingga 9) dienkode ke dalam format one-hot representation berdimensi 10 untuk pelatihan CNN berbasis Categorical Cross-Entropy, serta dipertahankan dalam format integer 1-D untuk pelatihan SVM multiclass.</w:t>
+      </w:r>
+    </w:p>
+    <w:p>
+      <w:pPr>
+        <w:pStyle w:val="ListBullet"/>
+        <w:spacing w:before="0" w:after="60" w:line="276" w:lineRule="auto"/>
+        <w:jc w:val="both"/>
+      </w:pPr>
+      <w:r>
+        <w:rPr>
+          <w:rFonts w:ascii="Times New Roman" w:hAnsi="Times New Roman"/>
+          <w:b/>
+          <w:sz w:val="23"/>
+        </w:rPr>
+        <w:t xml:space="preserve">Optimalisasi Pipeline Data: </w:t>
+      </w:r>
+      <w:r>
+        <w:rPr>
+          <w:rFonts w:ascii="Times New Roman" w:hAnsi="Times New Roman"/>
+          <w:sz w:val="23"/>
+        </w:rPr>
+        <w:t>Pipeline tf.data.Dataset diimplementasikan dengan buffer prefetching (AUTOTUNE) dan batch shuffling berukuran 10.000 untuk mengeliminasi bottleneck I/O antara disk penyimpanan dan memori akselerator GPU.</w:t>
       </w:r>
     </w:p>
     <w:p>
@@ -1250,7 +1350,7 @@
           <w:i w:val="0"/>
           <w:sz w:val="23"/>
         </w:rPr>
-        <w:t>Untuk menjamin kepatuhan metodologis yang valid dan mencegah data leakage, 50.000 data training dibagi menjadi 3 partisi terpisah:</w:t>
+        <w:t>Penerapan metodologi ilmiah yang valid menuntut isolasi data yang ketat guna mencegah terjadinya data leakage (kebocoran informasi). Pada praktikum ini, pembagian dataset dirancang dengan arsitektur 3-way stratified partition:</w:t>
       </w:r>
     </w:p>
     <w:p>
@@ -1265,14 +1365,14 @@
           <w:b/>
           <w:sz w:val="23"/>
         </w:rPr>
-        <w:t xml:space="preserve">1. CNN Training Set: </w:t>
+        <w:t xml:space="preserve">1. Training Set CNN (40.000 sampel, 80%): </w:t>
       </w:r>
       <w:r>
         <w:rPr>
           <w:rFonts w:ascii="Times New Roman" w:hAnsi="Times New Roman"/>
           <w:sz w:val="23"/>
         </w:rPr>
-        <w:t>40.000 sampel (80%) digunakan murni untuk melatih bobot konvolusi CNN.</w:t>
+        <w:t>Sebanyak 40.000 citra dialokasikan murni untuk melatih bobot konvolusi Custom CNN dari awal hingga konvergen.</w:t>
       </w:r>
     </w:p>
     <w:p>
@@ -1287,14 +1387,14 @@
           <w:b/>
           <w:sz w:val="23"/>
         </w:rPr>
-        <w:t xml:space="preserve">2. CNN Validation Set: </w:t>
+        <w:t xml:space="preserve">2. CNN Validation Set (5.000 sampel, 10%): </w:t>
       </w:r>
       <w:r>
         <w:rPr>
           <w:rFonts w:ascii="Times New Roman" w:hAnsi="Times New Roman"/>
           <w:sz w:val="23"/>
         </w:rPr>
-        <w:t>5.000 sampel (10%) digunakan sebagai evaluasi validasi internal saat training CNN dan penentuan checkpoint bobot terbaik.</w:t>
+        <w:t>Sebanyak 5.000 citra digunakan secara eksklusif untuk mengevaluasi loss validasi selama pelatihan CNN dan menentukan kriteria Early Stopping.</w:t>
       </w:r>
     </w:p>
     <w:p>
@@ -1309,14 +1409,57 @@
           <w:b/>
           <w:sz w:val="23"/>
         </w:rPr>
-        <w:t xml:space="preserve">3. Independent SVM Validation Set: </w:t>
+        <w:t xml:space="preserve">3. Independent SVM Tuning Set (5.000 sampel, 10%): </w:t>
       </w:r>
       <w:r>
         <w:rPr>
           <w:rFonts w:ascii="Times New Roman" w:hAnsi="Times New Roman"/>
           <w:sz w:val="23"/>
         </w:rPr>
-        <w:t>5.000 sampel (10%) disimpan terisolasi dan unseen oleh CNN, khusus digunakan untuk pencarian hyperparameter SVM.</w:t>
+        <w:t>Sebanyak 5.000 citra lainnya diisolasi sepenuhnya selama pelatihan CNN, dan hanya digunakan untuk melakukan pencarian hyperparameter terbaik bagi SVM Classifier (C dan gamma).</w:t>
+      </w:r>
+    </w:p>
+    <w:p>
+      <w:pPr>
+        <w:spacing w:before="0" w:after="100" w:line="276" w:lineRule="auto"/>
+        <w:jc w:val="both"/>
+      </w:pPr>
+      <w:r>
+        <w:rPr>
+          <w:rFonts w:ascii="Times New Roman" w:hAnsi="Times New Roman"/>
+          <w:i w:val="0"/>
+          <w:sz w:val="23"/>
+        </w:rPr>
+        <w:t>Pemisahan antara set validasi CNN dan set penalaan SVM menjamin bahwa hyperparameter SVM tidak dipilih berdasarkan representasi fitur yang sudah dioverfit oleh metrik validasi CNN. Selain itu, 10.000 data test resmi CIFAR-10 sama sekali tidak disentuh pada notebook ini, menjamin integritas pengujian independen pada tahap selanjutnya.</w:t>
+      </w:r>
+    </w:p>
+    <w:p>
+      <w:pPr>
+        <w:keepNext/>
+        <w:spacing w:before="280" w:after="80"/>
+      </w:pPr>
+      <w:r>
+        <w:rPr>
+          <w:rFonts w:ascii="Times New Roman" w:hAnsi="Times New Roman"/>
+          <w:b/>
+          <w:color w:val="2E5339"/>
+          <w:sz w:val="26"/>
+        </w:rPr>
+        <w:t>8. Model Building (Custom CNN: cnn_3ch)</w:t>
+      </w:r>
+    </w:p>
+    <w:p>
+      <w:pPr>
+        <w:spacing w:before="0" w:after="100" w:line="276" w:lineRule="auto"/>
+        <w:jc w:val="both"/>
+      </w:pPr>
+      <w:r>
+        <w:rPr>
+          <w:rFonts w:ascii="Times New Roman" w:hAnsi="Times New Roman"/>
+          <w:i w:val="0"/>
+          <w:sz w:val="23"/>
+        </w:rPr>
+        <w:t>Arsitektur Custom Deep Residual CNN (cnn_3ch) dirancang khusus untuk dataset CIFAR-10 dengan mengintegrasikan 4 blok residual bertingkat, Batch Normalization, aktivasi ReLU, Spatial Dropout, dan Global Average Pooling:</w:t>
       </w:r>
     </w:p>
     <w:p>
@@ -1331,29 +1474,146 @@
           <w:b/>
           <w:sz w:val="23"/>
         </w:rPr>
-        <w:t xml:space="preserve">4. Official Test Set: </w:t>
+        <w:t xml:space="preserve">Stem Layer: </w:t>
       </w:r>
       <w:r>
         <w:rPr>
           <w:rFonts w:ascii="Times New Roman" w:hAnsi="Times New Roman"/>
           <w:sz w:val="23"/>
         </w:rPr>
-        <w:t>10.000 sampel yang disimpan murni untuk pengujian akhir dan tidak disentuh sama sekali pada fase pelatihan ini.</w:t>
+        <w:t>Menerima input tensor (32, 32, 3), melalui lapisan Conv2D 3x3 dengan 64 filter, diikuti Batch Normalization dan ReLU untuk mengekstrak primitif visual dasar.</w:t>
       </w:r>
     </w:p>
     <w:p>
       <w:pPr>
-        <w:keepNext/>
-        <w:spacing w:before="280" w:after="80"/>
+        <w:pStyle w:val="ListBullet"/>
+        <w:spacing w:before="0" w:after="60" w:line="276" w:lineRule="auto"/>
+        <w:jc w:val="both"/>
       </w:pPr>
       <w:r>
         <w:rPr>
           <w:rFonts w:ascii="Times New Roman" w:hAnsi="Times New Roman"/>
           <w:b/>
-          <w:color w:val="2E5339"/>
-          <w:sz w:val="26"/>
+          <w:sz w:val="23"/>
         </w:rPr>
-        <w:t>8. Model Building (Custom Deep Residual CNN: cnn_3ch)</w:t>
+        <w:t xml:space="preserve">Residual Block 1 (64 filter): </w:t>
+      </w:r>
+      <w:r>
+        <w:rPr>
+          <w:rFonts w:ascii="Times New Roman" w:hAnsi="Times New Roman"/>
+          <w:sz w:val="23"/>
+        </w:rPr>
+        <w:t>Terdiri atas 2 lapisan konvolusi 3x3 dengan 64 filter, Batch Normalization, ReLU, dan jalur pintas identitas F(x) + x.</w:t>
+      </w:r>
+    </w:p>
+    <w:p>
+      <w:pPr>
+        <w:pStyle w:val="ListBullet"/>
+        <w:spacing w:before="0" w:after="60" w:line="276" w:lineRule="auto"/>
+        <w:jc w:val="both"/>
+      </w:pPr>
+      <w:r>
+        <w:rPr>
+          <w:rFonts w:ascii="Times New Roman" w:hAnsi="Times New Roman"/>
+          <w:b/>
+          <w:sz w:val="23"/>
+        </w:rPr>
+        <w:t xml:space="preserve">Residual Block 2 (128 filter): </w:t>
+      </w:r>
+      <w:r>
+        <w:rPr>
+          <w:rFonts w:ascii="Times New Roman" w:hAnsi="Times New Roman"/>
+          <w:sz w:val="23"/>
+        </w:rPr>
+        <w:t>Menggandakan kapasitas fitur menjadi 128 filter dengan resolusi spasial direduksi melalui MaxPooling2D 2x2. Jalur pintas menggunakan Conv2D 1x1 untuk menyelaraskan dimensi saluran.</w:t>
+      </w:r>
+    </w:p>
+    <w:p>
+      <w:pPr>
+        <w:pStyle w:val="ListBullet"/>
+        <w:spacing w:before="0" w:after="60" w:line="276" w:lineRule="auto"/>
+        <w:jc w:val="both"/>
+      </w:pPr>
+      <w:r>
+        <w:rPr>
+          <w:rFonts w:ascii="Times New Roman" w:hAnsi="Times New Roman"/>
+          <w:b/>
+          <w:sz w:val="23"/>
+        </w:rPr>
+        <w:t xml:space="preserve">Residual Block 3 (256 filter): </w:t>
+      </w:r>
+      <w:r>
+        <w:rPr>
+          <w:rFonts w:ascii="Times New Roman" w:hAnsi="Times New Roman"/>
+          <w:sz w:val="23"/>
+        </w:rPr>
+        <w:t>Memperdalam representasi menjadi 256 filter, dilengkapi Spatial Dropout 0.25 untuk mencegah ko-adaptasi fitur antar saluran konvolusi.</w:t>
+      </w:r>
+    </w:p>
+    <w:p>
+      <w:pPr>
+        <w:pStyle w:val="ListBullet"/>
+        <w:spacing w:before="0" w:after="60" w:line="276" w:lineRule="auto"/>
+        <w:jc w:val="both"/>
+      </w:pPr>
+      <w:r>
+        <w:rPr>
+          <w:rFonts w:ascii="Times New Roman" w:hAnsi="Times New Roman"/>
+          <w:b/>
+          <w:sz w:val="23"/>
+        </w:rPr>
+        <w:t xml:space="preserve">Residual Block 4 (512 filter): </w:t>
+      </w:r>
+      <w:r>
+        <w:rPr>
+          <w:rFonts w:ascii="Times New Roman" w:hAnsi="Times New Roman"/>
+          <w:sz w:val="23"/>
+        </w:rPr>
+        <w:t>Blok representasi paling abstrak dengan 512 filter, mengekstrak semantik visual tingkat tinggi dari objek citra.</w:t>
+      </w:r>
+    </w:p>
+    <w:p>
+      <w:pPr>
+        <w:pStyle w:val="ListBullet"/>
+        <w:spacing w:before="0" w:after="60" w:line="276" w:lineRule="auto"/>
+        <w:jc w:val="both"/>
+      </w:pPr>
+      <w:r>
+        <w:rPr>
+          <w:rFonts w:ascii="Times New Roman" w:hAnsi="Times New Roman"/>
+          <w:b/>
+          <w:sz w:val="23"/>
+        </w:rPr>
+        <w:t xml:space="preserve">GlobalAveragePooling2D: </w:t>
+      </w:r>
+      <w:r>
+        <w:rPr>
+          <w:rFonts w:ascii="Times New Roman" w:hAnsi="Times New Roman"/>
+          <w:sz w:val="23"/>
+        </w:rPr>
+        <w:t>Mengekstrak rata-rata spasial dari setiap peta fitur 8x8 menjadi vektor representasi 1-D berdimensi 512. Lapisan ini diberi nama eksplisit 'svm_features' sebagai titik penetrasi fitur laten.</w:t>
+      </w:r>
+    </w:p>
+    <w:p>
+      <w:pPr>
+        <w:pStyle w:val="ListBullet"/>
+        <w:spacing w:before="0" w:after="60" w:line="276" w:lineRule="auto"/>
+        <w:jc w:val="both"/>
+      </w:pPr>
+      <w:r>
+        <w:rPr>
+          <w:rFonts w:ascii="Times New Roman" w:hAnsi="Times New Roman"/>
+          <w:b/>
+          <w:sz w:val="23"/>
+        </w:rPr>
+        <w:t xml:space="preserve">Classification Head: </w:t>
+      </w:r>
+      <w:r>
+        <w:rPr>
+          <w:rFonts w:ascii="Times New Roman" w:hAnsi="Times New Roman"/>
+          <w:sz w:val="23"/>
+        </w:rPr>
+        <w:t>Lapisan Dense 10-unit dengan aktivasi Softmax untuk inferensi baseline klasifikasi 10 kelas.</w:t>
       </w:r>
     </w:p>
     <w:p>
@@ -1367,938 +1627,7 @@
           <w:i w:val="0"/>
           <w:sz w:val="23"/>
         </w:rPr>
-        <w:t>Arsitektur model dibangun secara kustom dengan 4 blok residual bertingkat. Rincian layer disajikan pada Tabel 2:</w:t>
-      </w:r>
-    </w:p>
-    <w:tbl>
-      <w:tblPr>
-        <w:tblW w:type="auto" w:w="0"/>
-        <w:jc w:val="center"/>
-        <w:tblLayout w:type="fixed"/>
-        <w:tblLook w:firstColumn="1" w:firstRow="1" w:lastColumn="0" w:lastRow="0" w:noHBand="0" w:noVBand="1" w:val="04A0"/>
-        <w:tblBorders>
-          <w:top w:val="single" w:sz="4" w:space="0" w:color="555555"/>
-          <w:bottom w:val="single" w:sz="4" w:space="0" w:color="555555"/>
-          <w:left w:val="single" w:sz="4" w:space="0" w:color="555555"/>
-          <w:right w:val="single" w:sz="4" w:space="0" w:color="555555"/>
-          <w:insideH w:val="single" w:sz="4" w:space="0" w:color="555555"/>
-          <w:insideV w:val="single" w:sz="4" w:space="0" w:color="555555"/>
-        </w:tblBorders>
-      </w:tblPr>
-      <w:tblGrid>
-        <w:gridCol w:w="2257"/>
-        <w:gridCol w:w="2257"/>
-        <w:gridCol w:w="2257"/>
-        <w:gridCol w:w="2257"/>
-      </w:tblGrid>
-      <w:tr>
-        <w:tc>
-          <w:tcPr>
-            <w:tcW w:type="dxa" w:w="2592"/>
-            <w:shd w:fill="2E5339"/>
-            <w:tcMar>
-              <w:top w:w="110" w:type="dxa"/>
-              <w:bottom w:w="110" w:type="dxa"/>
-              <w:left w:w="130" w:type="dxa"/>
-              <w:right w:w="130" w:type="dxa"/>
-            </w:tcMar>
-          </w:tcPr>
-          <w:p>
-            <w:pPr>
-              <w:jc w:val="center"/>
-            </w:pPr>
-            <w:r>
-              <w:rPr>
-                <w:rFonts w:ascii="Times New Roman" w:hAnsi="Times New Roman"/>
-                <w:b/>
-                <w:color w:val="FFFFFF"/>
-                <w:sz w:val="20"/>
-              </w:rPr>
-              <w:t>Layer / Blok</w:t>
-            </w:r>
-          </w:p>
-        </w:tc>
-        <w:tc>
-          <w:tcPr>
-            <w:tcW w:type="dxa" w:w="1872"/>
-            <w:shd w:fill="2E5339"/>
-            <w:tcMar>
-              <w:top w:w="110" w:type="dxa"/>
-              <w:bottom w:w="110" w:type="dxa"/>
-              <w:left w:w="130" w:type="dxa"/>
-              <w:right w:w="130" w:type="dxa"/>
-            </w:tcMar>
-          </w:tcPr>
-          <w:p>
-            <w:pPr>
-              <w:jc w:val="center"/>
-            </w:pPr>
-            <w:r>
-              <w:rPr>
-                <w:rFonts w:ascii="Times New Roman" w:hAnsi="Times New Roman"/>
-                <w:b/>
-                <w:color w:val="FFFFFF"/>
-                <w:sz w:val="20"/>
-              </w:rPr>
-              <w:t>Output Shape</w:t>
-            </w:r>
-          </w:p>
-        </w:tc>
-        <w:tc>
-          <w:tcPr>
-            <w:tcW w:type="dxa" w:w="1440"/>
-            <w:shd w:fill="2E5339"/>
-            <w:tcMar>
-              <w:top w:w="110" w:type="dxa"/>
-              <w:bottom w:w="110" w:type="dxa"/>
-              <w:left w:w="130" w:type="dxa"/>
-              <w:right w:w="130" w:type="dxa"/>
-            </w:tcMar>
-          </w:tcPr>
-          <w:p>
-            <w:pPr>
-              <w:jc w:val="center"/>
-            </w:pPr>
-            <w:r>
-              <w:rPr>
-                <w:rFonts w:ascii="Times New Roman" w:hAnsi="Times New Roman"/>
-                <w:b/>
-                <w:color w:val="FFFFFF"/>
-                <w:sz w:val="20"/>
-              </w:rPr>
-              <w:t>Parameter</w:t>
-            </w:r>
-          </w:p>
-        </w:tc>
-        <w:tc>
-          <w:tcPr>
-            <w:tcW w:type="dxa" w:w="3125"/>
-            <w:shd w:fill="2E5339"/>
-            <w:tcMar>
-              <w:top w:w="110" w:type="dxa"/>
-              <w:bottom w:w="110" w:type="dxa"/>
-              <w:left w:w="130" w:type="dxa"/>
-              <w:right w:w="130" w:type="dxa"/>
-            </w:tcMar>
-          </w:tcPr>
-          <w:p>
-            <w:pPr>
-              <w:jc w:val="center"/>
-            </w:pPr>
-            <w:r>
-              <w:rPr>
-                <w:rFonts w:ascii="Times New Roman" w:hAnsi="Times New Roman"/>
-                <w:b/>
-                <w:color w:val="FFFFFF"/>
-                <w:sz w:val="20"/>
-              </w:rPr>
-              <w:t>Fungsi</w:t>
-            </w:r>
-          </w:p>
-        </w:tc>
-      </w:tr>
-      <w:tr>
-        <w:tc>
-          <w:tcPr>
-            <w:tcW w:type="dxa" w:w="2592"/>
-            <w:shd w:fill="FFFFFF"/>
-            <w:tcMar>
-              <w:top w:w="80" w:type="dxa"/>
-              <w:bottom w:w="80" w:type="dxa"/>
-              <w:left w:w="120" w:type="dxa"/>
-              <w:right w:w="120" w:type="dxa"/>
-            </w:tcMar>
-          </w:tcPr>
-          <w:p>
-            <w:pPr>
-              <w:jc w:val="left"/>
-            </w:pPr>
-            <w:r>
-              <w:rPr>
-                <w:rFonts w:ascii="Times New Roman" w:hAnsi="Times New Roman"/>
-                <w:sz w:val="19"/>
-              </w:rPr>
-              <w:t>input_image (InputLayer)</w:t>
-            </w:r>
-          </w:p>
-        </w:tc>
-        <w:tc>
-          <w:tcPr>
-            <w:tcW w:type="dxa" w:w="1872"/>
-            <w:shd w:fill="FFFFFF"/>
-            <w:tcMar>
-              <w:top w:w="80" w:type="dxa"/>
-              <w:bottom w:w="80" w:type="dxa"/>
-              <w:left w:w="120" w:type="dxa"/>
-              <w:right w:w="120" w:type="dxa"/>
-            </w:tcMar>
-          </w:tcPr>
-          <w:p>
-            <w:pPr>
-              <w:jc w:val="center"/>
-            </w:pPr>
-            <w:r>
-              <w:rPr>
-                <w:rFonts w:ascii="Times New Roman" w:hAnsi="Times New Roman"/>
-                <w:sz w:val="19"/>
-              </w:rPr>
-              <w:t>(Batch, 32, 32, 3)</w:t>
-            </w:r>
-          </w:p>
-        </w:tc>
-        <w:tc>
-          <w:tcPr>
-            <w:tcW w:type="dxa" w:w="1440"/>
-            <w:shd w:fill="FFFFFF"/>
-            <w:tcMar>
-              <w:top w:w="80" w:type="dxa"/>
-              <w:bottom w:w="80" w:type="dxa"/>
-              <w:left w:w="120" w:type="dxa"/>
-              <w:right w:w="120" w:type="dxa"/>
-            </w:tcMar>
-          </w:tcPr>
-          <w:p>
-            <w:pPr>
-              <w:jc w:val="center"/>
-            </w:pPr>
-            <w:r>
-              <w:rPr>
-                <w:rFonts w:ascii="Times New Roman" w:hAnsi="Times New Roman"/>
-                <w:sz w:val="19"/>
-              </w:rPr>
-              <w:t>0</w:t>
-            </w:r>
-          </w:p>
-        </w:tc>
-        <w:tc>
-          <w:tcPr>
-            <w:tcW w:type="dxa" w:w="3125"/>
-            <w:shd w:fill="FFFFFF"/>
-            <w:tcMar>
-              <w:top w:w="80" w:type="dxa"/>
-              <w:bottom w:w="80" w:type="dxa"/>
-              <w:left w:w="120" w:type="dxa"/>
-              <w:right w:w="120" w:type="dxa"/>
-            </w:tcMar>
-          </w:tcPr>
-          <w:p>
-            <w:pPr>
-              <w:jc w:val="left"/>
-            </w:pPr>
-            <w:r>
-              <w:rPr>
-                <w:rFonts w:ascii="Times New Roman" w:hAnsi="Times New Roman"/>
-                <w:sz w:val="19"/>
-              </w:rPr>
-              <w:t>Menerima citra RGB 3 saluran</w:t>
-            </w:r>
-          </w:p>
-        </w:tc>
-      </w:tr>
-      <w:tr>
-        <w:tc>
-          <w:tcPr>
-            <w:tcW w:type="dxa" w:w="2592"/>
-            <w:shd w:fill="F4F7F5"/>
-            <w:tcMar>
-              <w:top w:w="80" w:type="dxa"/>
-              <w:bottom w:w="80" w:type="dxa"/>
-              <w:left w:w="120" w:type="dxa"/>
-              <w:right w:w="120" w:type="dxa"/>
-            </w:tcMar>
-          </w:tcPr>
-          <w:p>
-            <w:pPr>
-              <w:jc w:val="left"/>
-            </w:pPr>
-            <w:r>
-              <w:rPr>
-                <w:rFonts w:ascii="Times New Roman" w:hAnsi="Times New Roman"/>
-                <w:sz w:val="19"/>
-              </w:rPr>
-              <w:t>Blok 1 (Conv + Res)</w:t>
-            </w:r>
-          </w:p>
-        </w:tc>
-        <w:tc>
-          <w:tcPr>
-            <w:tcW w:type="dxa" w:w="1872"/>
-            <w:shd w:fill="F4F7F5"/>
-            <w:tcMar>
-              <w:top w:w="80" w:type="dxa"/>
-              <w:bottom w:w="80" w:type="dxa"/>
-              <w:left w:w="120" w:type="dxa"/>
-              <w:right w:w="120" w:type="dxa"/>
-            </w:tcMar>
-          </w:tcPr>
-          <w:p>
-            <w:pPr>
-              <w:jc w:val="center"/>
-            </w:pPr>
-            <w:r>
-              <w:rPr>
-                <w:rFonts w:ascii="Times New Roman" w:hAnsi="Times New Roman"/>
-                <w:sz w:val="19"/>
-              </w:rPr>
-              <w:t>(Batch, 16, 16, 64)</w:t>
-            </w:r>
-          </w:p>
-        </w:tc>
-        <w:tc>
-          <w:tcPr>
-            <w:tcW w:type="dxa" w:w="1440"/>
-            <w:shd w:fill="F4F7F5"/>
-            <w:tcMar>
-              <w:top w:w="80" w:type="dxa"/>
-              <w:bottom w:w="80" w:type="dxa"/>
-              <w:left w:w="120" w:type="dxa"/>
-              <w:right w:w="120" w:type="dxa"/>
-            </w:tcMar>
-          </w:tcPr>
-          <w:p>
-            <w:pPr>
-              <w:jc w:val="center"/>
-            </w:pPr>
-            <w:r>
-              <w:rPr>
-                <w:rFonts w:ascii="Times New Roman" w:hAnsi="Times New Roman"/>
-                <w:sz w:val="19"/>
-              </w:rPr>
-              <w:t>75.776</w:t>
-            </w:r>
-          </w:p>
-        </w:tc>
-        <w:tc>
-          <w:tcPr>
-            <w:tcW w:type="dxa" w:w="3125"/>
-            <w:shd w:fill="F4F7F5"/>
-            <w:tcMar>
-              <w:top w:w="80" w:type="dxa"/>
-              <w:bottom w:w="80" w:type="dxa"/>
-              <w:left w:w="120" w:type="dxa"/>
-              <w:right w:w="120" w:type="dxa"/>
-            </w:tcMar>
-          </w:tcPr>
-          <w:p>
-            <w:pPr>
-              <w:jc w:val="left"/>
-            </w:pPr>
-            <w:r>
-              <w:rPr>
-                <w:rFonts w:ascii="Times New Roman" w:hAnsi="Times New Roman"/>
-                <w:sz w:val="19"/>
-              </w:rPr>
-              <w:t>Ekstraksi tepi dasar &amp; downsampling 2x2</w:t>
-            </w:r>
-          </w:p>
-        </w:tc>
-      </w:tr>
-      <w:tr>
-        <w:tc>
-          <w:tcPr>
-            <w:tcW w:type="dxa" w:w="2592"/>
-            <w:shd w:fill="FFFFFF"/>
-            <w:tcMar>
-              <w:top w:w="80" w:type="dxa"/>
-              <w:bottom w:w="80" w:type="dxa"/>
-              <w:left w:w="120" w:type="dxa"/>
-              <w:right w:w="120" w:type="dxa"/>
-            </w:tcMar>
-          </w:tcPr>
-          <w:p>
-            <w:pPr>
-              <w:jc w:val="left"/>
-            </w:pPr>
-            <w:r>
-              <w:rPr>
-                <w:rFonts w:ascii="Times New Roman" w:hAnsi="Times New Roman"/>
-                <w:sz w:val="19"/>
-              </w:rPr>
-              <w:t>Blok 2 (Conv + Res)</w:t>
-            </w:r>
-          </w:p>
-        </w:tc>
-        <w:tc>
-          <w:tcPr>
-            <w:tcW w:type="dxa" w:w="1872"/>
-            <w:shd w:fill="FFFFFF"/>
-            <w:tcMar>
-              <w:top w:w="80" w:type="dxa"/>
-              <w:bottom w:w="80" w:type="dxa"/>
-              <w:left w:w="120" w:type="dxa"/>
-              <w:right w:w="120" w:type="dxa"/>
-            </w:tcMar>
-          </w:tcPr>
-          <w:p>
-            <w:pPr>
-              <w:jc w:val="center"/>
-            </w:pPr>
-            <w:r>
-              <w:rPr>
-                <w:rFonts w:ascii="Times New Roman" w:hAnsi="Times New Roman"/>
-                <w:sz w:val="19"/>
-              </w:rPr>
-              <w:t>(Batch, 8, 8, 128)</w:t>
-            </w:r>
-          </w:p>
-        </w:tc>
-        <w:tc>
-          <w:tcPr>
-            <w:tcW w:type="dxa" w:w="1440"/>
-            <w:shd w:fill="FFFFFF"/>
-            <w:tcMar>
-              <w:top w:w="80" w:type="dxa"/>
-              <w:bottom w:w="80" w:type="dxa"/>
-              <w:left w:w="120" w:type="dxa"/>
-              <w:right w:w="120" w:type="dxa"/>
-            </w:tcMar>
-          </w:tcPr>
-          <w:p>
-            <w:pPr>
-              <w:jc w:val="center"/>
-            </w:pPr>
-            <w:r>
-              <w:rPr>
-                <w:rFonts w:ascii="Times New Roman" w:hAnsi="Times New Roman"/>
-                <w:sz w:val="19"/>
-              </w:rPr>
-              <w:t>301.568</w:t>
-            </w:r>
-          </w:p>
-        </w:tc>
-        <w:tc>
-          <w:tcPr>
-            <w:tcW w:type="dxa" w:w="3125"/>
-            <w:shd w:fill="FFFFFF"/>
-            <w:tcMar>
-              <w:top w:w="80" w:type="dxa"/>
-              <w:bottom w:w="80" w:type="dxa"/>
-              <w:left w:w="120" w:type="dxa"/>
-              <w:right w:w="120" w:type="dxa"/>
-            </w:tcMar>
-          </w:tcPr>
-          <w:p>
-            <w:pPr>
-              <w:jc w:val="left"/>
-            </w:pPr>
-            <w:r>
-              <w:rPr>
-                <w:rFonts w:ascii="Times New Roman" w:hAnsi="Times New Roman"/>
-                <w:sz w:val="19"/>
-              </w:rPr>
-              <w:t>Deteksi pola tekstur &amp; sudut lokal</w:t>
-            </w:r>
-          </w:p>
-        </w:tc>
-      </w:tr>
-      <w:tr>
-        <w:tc>
-          <w:tcPr>
-            <w:tcW w:type="dxa" w:w="2592"/>
-            <w:shd w:fill="F4F7F5"/>
-            <w:tcMar>
-              <w:top w:w="80" w:type="dxa"/>
-              <w:bottom w:w="80" w:type="dxa"/>
-              <w:left w:w="120" w:type="dxa"/>
-              <w:right w:w="120" w:type="dxa"/>
-            </w:tcMar>
-          </w:tcPr>
-          <w:p>
-            <w:pPr>
-              <w:jc w:val="left"/>
-            </w:pPr>
-            <w:r>
-              <w:rPr>
-                <w:rFonts w:ascii="Times New Roman" w:hAnsi="Times New Roman"/>
-                <w:sz w:val="19"/>
-              </w:rPr>
-              <w:t>Blok 3 (Conv + Res)</w:t>
-            </w:r>
-          </w:p>
-        </w:tc>
-        <w:tc>
-          <w:tcPr>
-            <w:tcW w:type="dxa" w:w="1872"/>
-            <w:shd w:fill="F4F7F5"/>
-            <w:tcMar>
-              <w:top w:w="80" w:type="dxa"/>
-              <w:bottom w:w="80" w:type="dxa"/>
-              <w:left w:w="120" w:type="dxa"/>
-              <w:right w:w="120" w:type="dxa"/>
-            </w:tcMar>
-          </w:tcPr>
-          <w:p>
-            <w:pPr>
-              <w:jc w:val="center"/>
-            </w:pPr>
-            <w:r>
-              <w:rPr>
-                <w:rFonts w:ascii="Times New Roman" w:hAnsi="Times New Roman"/>
-                <w:sz w:val="19"/>
-              </w:rPr>
-              <w:t>(Batch, 8, 8, 256)</w:t>
-            </w:r>
-          </w:p>
-        </w:tc>
-        <w:tc>
-          <w:tcPr>
-            <w:tcW w:type="dxa" w:w="1440"/>
-            <w:shd w:fill="F4F7F5"/>
-            <w:tcMar>
-              <w:top w:w="80" w:type="dxa"/>
-              <w:bottom w:w="80" w:type="dxa"/>
-              <w:left w:w="120" w:type="dxa"/>
-              <w:right w:w="120" w:type="dxa"/>
-            </w:tcMar>
-          </w:tcPr>
-          <w:p>
-            <w:pPr>
-              <w:jc w:val="center"/>
-            </w:pPr>
-            <w:r>
-              <w:rPr>
-                <w:rFonts w:ascii="Times New Roman" w:hAnsi="Times New Roman"/>
-                <w:sz w:val="19"/>
-              </w:rPr>
-              <w:t>1.188.864</w:t>
-            </w:r>
-          </w:p>
-        </w:tc>
-        <w:tc>
-          <w:tcPr>
-            <w:tcW w:type="dxa" w:w="3125"/>
-            <w:shd w:fill="F4F7F5"/>
-            <w:tcMar>
-              <w:top w:w="80" w:type="dxa"/>
-              <w:bottom w:w="80" w:type="dxa"/>
-              <w:left w:w="120" w:type="dxa"/>
-              <w:right w:w="120" w:type="dxa"/>
-            </w:tcMar>
-          </w:tcPr>
-          <w:p>
-            <w:pPr>
-              <w:jc w:val="left"/>
-            </w:pPr>
-            <w:r>
-              <w:rPr>
-                <w:rFonts w:ascii="Times New Roman" w:hAnsi="Times New Roman"/>
-                <w:sz w:val="19"/>
-              </w:rPr>
-              <w:t>Representasi bentuk kompleks objek</w:t>
-            </w:r>
-          </w:p>
-        </w:tc>
-      </w:tr>
-      <w:tr>
-        <w:tc>
-          <w:tcPr>
-            <w:tcW w:type="dxa" w:w="2592"/>
-            <w:shd w:fill="FFFFFF"/>
-            <w:tcMar>
-              <w:top w:w="80" w:type="dxa"/>
-              <w:bottom w:w="80" w:type="dxa"/>
-              <w:left w:w="120" w:type="dxa"/>
-              <w:right w:w="120" w:type="dxa"/>
-            </w:tcMar>
-          </w:tcPr>
-          <w:p>
-            <w:pPr>
-              <w:jc w:val="left"/>
-            </w:pPr>
-            <w:r>
-              <w:rPr>
-                <w:rFonts w:ascii="Times New Roman" w:hAnsi="Times New Roman"/>
-                <w:sz w:val="19"/>
-              </w:rPr>
-              <w:t>Blok 4 (Conv + Res)</w:t>
-            </w:r>
-          </w:p>
-        </w:tc>
-        <w:tc>
-          <w:tcPr>
-            <w:tcW w:type="dxa" w:w="1872"/>
-            <w:shd w:fill="FFFFFF"/>
-            <w:tcMar>
-              <w:top w:w="80" w:type="dxa"/>
-              <w:bottom w:w="80" w:type="dxa"/>
-              <w:left w:w="120" w:type="dxa"/>
-              <w:right w:w="120" w:type="dxa"/>
-            </w:tcMar>
-          </w:tcPr>
-          <w:p>
-            <w:pPr>
-              <w:jc w:val="center"/>
-            </w:pPr>
-            <w:r>
-              <w:rPr>
-                <w:rFonts w:ascii="Times New Roman" w:hAnsi="Times New Roman"/>
-                <w:sz w:val="19"/>
-              </w:rPr>
-              <w:t>(Batch, 8, 8, 512)</w:t>
-            </w:r>
-          </w:p>
-        </w:tc>
-        <w:tc>
-          <w:tcPr>
-            <w:tcW w:type="dxa" w:w="1440"/>
-            <w:shd w:fill="FFFFFF"/>
-            <w:tcMar>
-              <w:top w:w="80" w:type="dxa"/>
-              <w:bottom w:w="80" w:type="dxa"/>
-              <w:left w:w="120" w:type="dxa"/>
-              <w:right w:w="120" w:type="dxa"/>
-            </w:tcMar>
-          </w:tcPr>
-          <w:p>
-            <w:pPr>
-              <w:jc w:val="center"/>
-            </w:pPr>
-            <w:r>
-              <w:rPr>
-                <w:rFonts w:ascii="Times New Roman" w:hAnsi="Times New Roman"/>
-                <w:sz w:val="19"/>
-              </w:rPr>
-              <w:t>3.563.520</w:t>
-            </w:r>
-          </w:p>
-        </w:tc>
-        <w:tc>
-          <w:tcPr>
-            <w:tcW w:type="dxa" w:w="3125"/>
-            <w:shd w:fill="FFFFFF"/>
-            <w:tcMar>
-              <w:top w:w="80" w:type="dxa"/>
-              <w:bottom w:w="80" w:type="dxa"/>
-              <w:left w:w="120" w:type="dxa"/>
-              <w:right w:w="120" w:type="dxa"/>
-            </w:tcMar>
-          </w:tcPr>
-          <w:p>
-            <w:pPr>
-              <w:jc w:val="left"/>
-            </w:pPr>
-            <w:r>
-              <w:rPr>
-                <w:rFonts w:ascii="Times New Roman" w:hAnsi="Times New Roman"/>
-                <w:sz w:val="19"/>
-              </w:rPr>
-              <w:t>Fitur semantik tingkat tinggi</w:t>
-            </w:r>
-          </w:p>
-        </w:tc>
-      </w:tr>
-      <w:tr>
-        <w:tc>
-          <w:tcPr>
-            <w:tcW w:type="dxa" w:w="2592"/>
-            <w:shd w:fill="F4F7F5"/>
-            <w:tcMar>
-              <w:top w:w="80" w:type="dxa"/>
-              <w:bottom w:w="80" w:type="dxa"/>
-              <w:left w:w="120" w:type="dxa"/>
-              <w:right w:w="120" w:type="dxa"/>
-            </w:tcMar>
-          </w:tcPr>
-          <w:p>
-            <w:pPr>
-              <w:jc w:val="left"/>
-            </w:pPr>
-            <w:r>
-              <w:rPr>
-                <w:rFonts w:ascii="Times New Roman" w:hAnsi="Times New Roman"/>
-                <w:sz w:val="19"/>
-              </w:rPr>
-              <w:t>svm_features (GAP)</w:t>
-            </w:r>
-          </w:p>
-        </w:tc>
-        <w:tc>
-          <w:tcPr>
-            <w:tcW w:type="dxa" w:w="1872"/>
-            <w:shd w:fill="F4F7F5"/>
-            <w:tcMar>
-              <w:top w:w="80" w:type="dxa"/>
-              <w:bottom w:w="80" w:type="dxa"/>
-              <w:left w:w="120" w:type="dxa"/>
-              <w:right w:w="120" w:type="dxa"/>
-            </w:tcMar>
-          </w:tcPr>
-          <w:p>
-            <w:pPr>
-              <w:jc w:val="center"/>
-            </w:pPr>
-            <w:r>
-              <w:rPr>
-                <w:rFonts w:ascii="Times New Roman" w:hAnsi="Times New Roman"/>
-                <w:sz w:val="19"/>
-              </w:rPr>
-              <w:t>(Batch, 512)</w:t>
-            </w:r>
-          </w:p>
-        </w:tc>
-        <w:tc>
-          <w:tcPr>
-            <w:tcW w:type="dxa" w:w="1440"/>
-            <w:shd w:fill="F4F7F5"/>
-            <w:tcMar>
-              <w:top w:w="80" w:type="dxa"/>
-              <w:bottom w:w="80" w:type="dxa"/>
-              <w:left w:w="120" w:type="dxa"/>
-              <w:right w:w="120" w:type="dxa"/>
-            </w:tcMar>
-          </w:tcPr>
-          <w:p>
-            <w:pPr>
-              <w:jc w:val="center"/>
-            </w:pPr>
-            <w:r>
-              <w:rPr>
-                <w:rFonts w:ascii="Times New Roman" w:hAnsi="Times New Roman"/>
-                <w:sz w:val="19"/>
-              </w:rPr>
-              <w:t>0</w:t>
-            </w:r>
-          </w:p>
-        </w:tc>
-        <w:tc>
-          <w:tcPr>
-            <w:tcW w:type="dxa" w:w="3125"/>
-            <w:shd w:fill="F4F7F5"/>
-            <w:tcMar>
-              <w:top w:w="80" w:type="dxa"/>
-              <w:bottom w:w="80" w:type="dxa"/>
-              <w:left w:w="120" w:type="dxa"/>
-              <w:right w:w="120" w:type="dxa"/>
-            </w:tcMar>
-          </w:tcPr>
-          <w:p>
-            <w:pPr>
-              <w:jc w:val="left"/>
-            </w:pPr>
-            <w:r>
-              <w:rPr>
-                <w:rFonts w:ascii="Times New Roman" w:hAnsi="Times New Roman"/>
-                <w:sz w:val="19"/>
-              </w:rPr>
-              <w:t>Global Average Pooling ke vektor 512-D</w:t>
-            </w:r>
-          </w:p>
-        </w:tc>
-      </w:tr>
-      <w:tr>
-        <w:tc>
-          <w:tcPr>
-            <w:tcW w:type="dxa" w:w="2592"/>
-            <w:shd w:fill="FFFFFF"/>
-            <w:tcMar>
-              <w:top w:w="80" w:type="dxa"/>
-              <w:bottom w:w="80" w:type="dxa"/>
-              <w:left w:w="120" w:type="dxa"/>
-              <w:right w:w="120" w:type="dxa"/>
-            </w:tcMar>
-          </w:tcPr>
-          <w:p>
-            <w:pPr>
-              <w:jc w:val="left"/>
-            </w:pPr>
-            <w:r>
-              <w:rPr>
-                <w:rFonts w:ascii="Times New Roman" w:hAnsi="Times New Roman"/>
-                <w:sz w:val="19"/>
-              </w:rPr>
-              <w:t>cnn_head_dropout</w:t>
-            </w:r>
-          </w:p>
-        </w:tc>
-        <w:tc>
-          <w:tcPr>
-            <w:tcW w:type="dxa" w:w="1872"/>
-            <w:shd w:fill="FFFFFF"/>
-            <w:tcMar>
-              <w:top w:w="80" w:type="dxa"/>
-              <w:bottom w:w="80" w:type="dxa"/>
-              <w:left w:w="120" w:type="dxa"/>
-              <w:right w:w="120" w:type="dxa"/>
-            </w:tcMar>
-          </w:tcPr>
-          <w:p>
-            <w:pPr>
-              <w:jc w:val="center"/>
-            </w:pPr>
-            <w:r>
-              <w:rPr>
-                <w:rFonts w:ascii="Times New Roman" w:hAnsi="Times New Roman"/>
-                <w:sz w:val="19"/>
-              </w:rPr>
-              <w:t>(Batch, 512)</w:t>
-            </w:r>
-          </w:p>
-        </w:tc>
-        <w:tc>
-          <w:tcPr>
-            <w:tcW w:type="dxa" w:w="1440"/>
-            <w:shd w:fill="FFFFFF"/>
-            <w:tcMar>
-              <w:top w:w="80" w:type="dxa"/>
-              <w:bottom w:w="80" w:type="dxa"/>
-              <w:left w:w="120" w:type="dxa"/>
-              <w:right w:w="120" w:type="dxa"/>
-            </w:tcMar>
-          </w:tcPr>
-          <w:p>
-            <w:pPr>
-              <w:jc w:val="center"/>
-            </w:pPr>
-            <w:r>
-              <w:rPr>
-                <w:rFonts w:ascii="Times New Roman" w:hAnsi="Times New Roman"/>
-                <w:sz w:val="19"/>
-              </w:rPr>
-              <w:t>0</w:t>
-            </w:r>
-          </w:p>
-        </w:tc>
-        <w:tc>
-          <w:tcPr>
-            <w:tcW w:type="dxa" w:w="3125"/>
-            <w:shd w:fill="FFFFFF"/>
-            <w:tcMar>
-              <w:top w:w="80" w:type="dxa"/>
-              <w:bottom w:w="80" w:type="dxa"/>
-              <w:left w:w="120" w:type="dxa"/>
-              <w:right w:w="120" w:type="dxa"/>
-            </w:tcMar>
-          </w:tcPr>
-          <w:p>
-            <w:pPr>
-              <w:jc w:val="left"/>
-            </w:pPr>
-            <w:r>
-              <w:rPr>
-                <w:rFonts w:ascii="Times New Roman" w:hAnsi="Times New Roman"/>
-                <w:sz w:val="19"/>
-              </w:rPr>
-              <w:t>Regularisasi Dropout 0.4</w:t>
-            </w:r>
-          </w:p>
-        </w:tc>
-      </w:tr>
-      <w:tr>
-        <w:tc>
-          <w:tcPr>
-            <w:tcW w:type="dxa" w:w="2592"/>
-            <w:shd w:fill="F4F7F5"/>
-            <w:tcMar>
-              <w:top w:w="80" w:type="dxa"/>
-              <w:bottom w:w="80" w:type="dxa"/>
-              <w:left w:w="120" w:type="dxa"/>
-              <w:right w:w="120" w:type="dxa"/>
-            </w:tcMar>
-          </w:tcPr>
-          <w:p>
-            <w:pPr>
-              <w:jc w:val="left"/>
-            </w:pPr>
-            <w:r>
-              <w:rPr>
-                <w:rFonts w:ascii="Times New Roman" w:hAnsi="Times New Roman"/>
-                <w:sz w:val="19"/>
-              </w:rPr>
-              <w:t>cnn_softmax (Dense)</w:t>
-            </w:r>
-          </w:p>
-        </w:tc>
-        <w:tc>
-          <w:tcPr>
-            <w:tcW w:type="dxa" w:w="1872"/>
-            <w:shd w:fill="F4F7F5"/>
-            <w:tcMar>
-              <w:top w:w="80" w:type="dxa"/>
-              <w:bottom w:w="80" w:type="dxa"/>
-              <w:left w:w="120" w:type="dxa"/>
-              <w:right w:w="120" w:type="dxa"/>
-            </w:tcMar>
-          </w:tcPr>
-          <w:p>
-            <w:pPr>
-              <w:jc w:val="center"/>
-            </w:pPr>
-            <w:r>
-              <w:rPr>
-                <w:rFonts w:ascii="Times New Roman" w:hAnsi="Times New Roman"/>
-                <w:sz w:val="19"/>
-              </w:rPr>
-              <w:t>(Batch, 10)</w:t>
-            </w:r>
-          </w:p>
-        </w:tc>
-        <w:tc>
-          <w:tcPr>
-            <w:tcW w:type="dxa" w:w="1440"/>
-            <w:shd w:fill="F4F7F5"/>
-            <w:tcMar>
-              <w:top w:w="80" w:type="dxa"/>
-              <w:bottom w:w="80" w:type="dxa"/>
-              <w:left w:w="120" w:type="dxa"/>
-              <w:right w:w="120" w:type="dxa"/>
-            </w:tcMar>
-          </w:tcPr>
-          <w:p>
-            <w:pPr>
-              <w:jc w:val="center"/>
-            </w:pPr>
-            <w:r>
-              <w:rPr>
-                <w:rFonts w:ascii="Times New Roman" w:hAnsi="Times New Roman"/>
-                <w:sz w:val="19"/>
-              </w:rPr>
-              <w:t>5.130</w:t>
-            </w:r>
-          </w:p>
-        </w:tc>
-        <w:tc>
-          <w:tcPr>
-            <w:tcW w:type="dxa" w:w="3125"/>
-            <w:shd w:fill="F4F7F5"/>
-            <w:tcMar>
-              <w:top w:w="80" w:type="dxa"/>
-              <w:bottom w:w="80" w:type="dxa"/>
-              <w:left w:w="120" w:type="dxa"/>
-              <w:right w:w="120" w:type="dxa"/>
-            </w:tcMar>
-          </w:tcPr>
-          <w:p>
-            <w:pPr>
-              <w:jc w:val="left"/>
-            </w:pPr>
-            <w:r>
-              <w:rPr>
-                <w:rFonts w:ascii="Times New Roman" w:hAnsi="Times New Roman"/>
-                <w:sz w:val="19"/>
-              </w:rPr>
-              <w:t>Klasifikasi probabilitas 10 kelas</w:t>
-            </w:r>
-          </w:p>
-        </w:tc>
-      </w:tr>
-    </w:tbl>
-    <w:p>
-      <w:pPr>
-        <w:spacing w:before="0" w:after="120"/>
-      </w:pPr>
-    </w:p>
-    <w:p>
-      <w:pPr>
-        <w:spacing w:before="0" w:after="100" w:line="276" w:lineRule="auto"/>
-        <w:jc w:val="both"/>
-      </w:pPr>
-      <w:r>
-        <w:rPr>
-          <w:rFonts w:ascii="Times New Roman" w:hAnsi="Times New Roman"/>
-          <w:i w:val="0"/>
-          <w:sz w:val="23"/>
-        </w:rPr>
-        <w:t>Total parameter model: 5.134.794 parameter (Trainable: 5.129.930 parameter, Non-trainable: 4.864 parameter).</w:t>
+        <w:t>Total parameter arsitektur mencapai 5.134.794 parameter (seluruhnya dilatih dari awal tanpa pembekuan bobot atau transfer dari model luar).</w:t>
       </w:r>
     </w:p>
     <w:p>
@@ -2318,24 +1647,16 @@
     </w:p>
     <w:p>
       <w:pPr>
-        <w:pStyle w:val="ListBullet"/>
-        <w:spacing w:before="0" w:after="60" w:line="276" w:lineRule="auto"/>
+        <w:spacing w:before="0" w:after="100" w:line="276" w:lineRule="auto"/>
         <w:jc w:val="both"/>
       </w:pPr>
       <w:r>
         <w:rPr>
           <w:rFonts w:ascii="Times New Roman" w:hAnsi="Times New Roman"/>
-          <w:b/>
+          <w:i w:val="0"/>
           <w:sz w:val="23"/>
         </w:rPr>
-        <w:t xml:space="preserve">Optimizer: </w:t>
-      </w:r>
-      <w:r>
-        <w:rPr>
-          <w:rFonts w:ascii="Times New Roman" w:hAnsi="Times New Roman"/>
-          <w:sz w:val="23"/>
-        </w:rPr>
-        <w:t>AdamW dengan base learning rate 0.001 dan weight decay 0.0001.</w:t>
+        <w:t>Konfigurasi pelatihan disusun menggunakan protokol modern untuk mencapai konvergensi optimal dan stabilitas numerik:</w:t>
       </w:r>
     </w:p>
     <w:p>
@@ -2350,14 +1671,14 @@
           <w:b/>
           <w:sz w:val="23"/>
         </w:rPr>
-        <w:t xml:space="preserve">Learning Rate Scheduler: </w:t>
+        <w:t xml:space="preserve">Loss Function: Categorical Cross-Entropy: </w:t>
       </w:r>
       <w:r>
         <w:rPr>
           <w:rFonts w:ascii="Times New Roman" w:hAnsi="Times New Roman"/>
           <w:sz w:val="23"/>
         </w:rPr>
-        <w:t>Cosine Annealing Decay dari 0.001 hingga 1.02e-05 pada epoch ke-100.</w:t>
+        <w:t>Fungsi kerugian standar untuk klasifikasi multi-kelas dengan label one-hot.</w:t>
       </w:r>
     </w:p>
     <w:p>
@@ -2372,14 +1693,14 @@
           <w:b/>
           <w:sz w:val="23"/>
         </w:rPr>
-        <w:t xml:space="preserve">Batch Size: </w:t>
+        <w:t xml:space="preserve">Optimizer: Adam: </w:t>
       </w:r>
       <w:r>
         <w:rPr>
           <w:rFonts w:ascii="Times New Roman" w:hAnsi="Times New Roman"/>
           <w:sz w:val="23"/>
         </w:rPr>
-        <w:t>64 sampel per langkah pembaruan bobot.</w:t>
+        <w:t>Optimizer Adam dengan learning rate awal 0.001, beta_1=0.9, beta_2=0.999, dan epsilon=1e-7.</w:t>
       </w:r>
     </w:p>
     <w:p>
@@ -2394,14 +1715,14 @@
           <w:b/>
           <w:sz w:val="23"/>
         </w:rPr>
-        <w:t xml:space="preserve">Epoch Maksimum: </w:t>
+        <w:t xml:space="preserve">Learning Rate Scheduler (ReduceLROnPlateau): </w:t>
       </w:r>
       <w:r>
         <w:rPr>
           <w:rFonts w:ascii="Times New Roman" w:hAnsi="Times New Roman"/>
           <w:sz w:val="23"/>
         </w:rPr>
-        <w:t>100 epoch penuh.</w:t>
+        <w:t>Learning rate diturunkan secara dinamis sebesar faktor 0.5 jika loss validasi tidak membaik selama 4 epoch berturut-turut (ambang batas minimum lr = 1e-6).</w:t>
       </w:r>
     </w:p>
     <w:p>
@@ -2416,14 +1737,14 @@
           <w:b/>
           <w:sz w:val="23"/>
         </w:rPr>
-        <w:t xml:space="preserve">Data Augmentation: </w:t>
+        <w:t xml:space="preserve">Early Stopping &amp; ModelCheckpoint: </w:t>
       </w:r>
       <w:r>
         <w:rPr>
           <w:rFonts w:ascii="Times New Roman" w:hAnsi="Times New Roman"/>
           <w:sz w:val="23"/>
         </w:rPr>
-        <w:t>Random Horizontal Flip, Rotation (+-10 derajat), Zoom (+-10%), Translation (+-10%).</w:t>
+        <w:t>Pelatihan dihentikan secara otomatis jika loss validasi tidak menunjukkan perbaikan selama 10 epoch berturut-turut, dan bobot terbaik dipulihkan.</w:t>
       </w:r>
     </w:p>
     <w:p>
@@ -2438,14 +1759,14 @@
           <w:b/>
           <w:sz w:val="23"/>
         </w:rPr>
-        <w:t xml:space="preserve">Callbacks: </w:t>
+        <w:t xml:space="preserve">Batch Size &amp; Epochs: </w:t>
       </w:r>
       <w:r>
         <w:rPr>
           <w:rFonts w:ascii="Times New Roman" w:hAnsi="Times New Roman"/>
           <w:sz w:val="23"/>
         </w:rPr>
-        <w:t>ModelCheckpoint menyimpan bobot terbaik berdasarkan val_accuracy tertinggi.</w:t>
+        <w:t>Ukuran batch diatur pada 128 sampel dengan batas maksimum iterasi 40 epoch.</w:t>
       </w:r>
     </w:p>
     <w:p>
@@ -2474,1071 +1795,8 @@
           <w:i w:val="0"/>
           <w:sz w:val="23"/>
         </w:rPr>
-        <w:t>Sebelum dilakukan tuning, model baseline tanpa optimasi hanya menghasilkan Val Acc 11.40% dan Val Loss 4.3192. Tabel 3 mencatat progres pelatihan model CNN yang dioptimasi:</w:t>
+        <w:t>Pelatihan model cnn_3ch berlangsung secara progresif selama 40 epoch pada GPU NVIDIA RTX 2050 4GB. Pada epoch awal, loss training menurun tajam dari 1.8421 ke 0.9542, menandakan filter konvolusi mampu mempelajari pola visual tepi dan tekstur dengan cepat.</w:t>
       </w:r>
-    </w:p>
-    <w:tbl>
-      <w:tblPr>
-        <w:tblW w:type="auto" w:w="0"/>
-        <w:jc w:val="center"/>
-        <w:tblLayout w:type="fixed"/>
-        <w:tblLook w:firstColumn="1" w:firstRow="1" w:lastColumn="0" w:lastRow="0" w:noHBand="0" w:noVBand="1" w:val="04A0"/>
-        <w:tblBorders>
-          <w:top w:val="single" w:sz="4" w:space="0" w:color="555555"/>
-          <w:bottom w:val="single" w:sz="4" w:space="0" w:color="555555"/>
-          <w:left w:val="single" w:sz="4" w:space="0" w:color="555555"/>
-          <w:right w:val="single" w:sz="4" w:space="0" w:color="555555"/>
-          <w:insideH w:val="single" w:sz="4" w:space="0" w:color="555555"/>
-          <w:insideV w:val="single" w:sz="4" w:space="0" w:color="555555"/>
-        </w:tblBorders>
-      </w:tblPr>
-      <w:tblGrid>
-        <w:gridCol w:w="1505"/>
-        <w:gridCol w:w="1505"/>
-        <w:gridCol w:w="1505"/>
-        <w:gridCol w:w="1505"/>
-        <w:gridCol w:w="1505"/>
-        <w:gridCol w:w="1505"/>
-      </w:tblGrid>
-      <w:tr>
-        <w:tc>
-          <w:tcPr>
-            <w:tcW w:type="dxa" w:w="1584"/>
-            <w:shd w:fill="2E5339"/>
-            <w:tcMar>
-              <w:top w:w="110" w:type="dxa"/>
-              <w:bottom w:w="110" w:type="dxa"/>
-              <w:left w:w="130" w:type="dxa"/>
-              <w:right w:w="130" w:type="dxa"/>
-            </w:tcMar>
-          </w:tcPr>
-          <w:p>
-            <w:pPr>
-              <w:jc w:val="center"/>
-            </w:pPr>
-            <w:r>
-              <w:rPr>
-                <w:rFonts w:ascii="Times New Roman" w:hAnsi="Times New Roman"/>
-                <w:b/>
-                <w:color w:val="FFFFFF"/>
-                <w:sz w:val="20"/>
-              </w:rPr>
-              <w:t>Epoch</w:t>
-            </w:r>
-          </w:p>
-        </w:tc>
-        <w:tc>
-          <w:tcPr>
-            <w:tcW w:type="dxa" w:w="1440"/>
-            <w:shd w:fill="2E5339"/>
-            <w:tcMar>
-              <w:top w:w="110" w:type="dxa"/>
-              <w:bottom w:w="110" w:type="dxa"/>
-              <w:left w:w="130" w:type="dxa"/>
-              <w:right w:w="130" w:type="dxa"/>
-            </w:tcMar>
-          </w:tcPr>
-          <w:p>
-            <w:pPr>
-              <w:jc w:val="center"/>
-            </w:pPr>
-            <w:r>
-              <w:rPr>
-                <w:rFonts w:ascii="Times New Roman" w:hAnsi="Times New Roman"/>
-                <w:b/>
-                <w:color w:val="FFFFFF"/>
-                <w:sz w:val="20"/>
-              </w:rPr>
-              <w:t>Train Loss</w:t>
-            </w:r>
-          </w:p>
-        </w:tc>
-        <w:tc>
-          <w:tcPr>
-            <w:tcW w:type="dxa" w:w="1440"/>
-            <w:shd w:fill="2E5339"/>
-            <w:tcMar>
-              <w:top w:w="110" w:type="dxa"/>
-              <w:bottom w:w="110" w:type="dxa"/>
-              <w:left w:w="130" w:type="dxa"/>
-              <w:right w:w="130" w:type="dxa"/>
-            </w:tcMar>
-          </w:tcPr>
-          <w:p>
-            <w:pPr>
-              <w:jc w:val="center"/>
-            </w:pPr>
-            <w:r>
-              <w:rPr>
-                <w:rFonts w:ascii="Times New Roman" w:hAnsi="Times New Roman"/>
-                <w:b/>
-                <w:color w:val="FFFFFF"/>
-                <w:sz w:val="20"/>
-              </w:rPr>
-              <w:t>Train Acc</w:t>
-            </w:r>
-          </w:p>
-        </w:tc>
-        <w:tc>
-          <w:tcPr>
-            <w:tcW w:type="dxa" w:w="1440"/>
-            <w:shd w:fill="2E5339"/>
-            <w:tcMar>
-              <w:top w:w="110" w:type="dxa"/>
-              <w:bottom w:w="110" w:type="dxa"/>
-              <w:left w:w="130" w:type="dxa"/>
-              <w:right w:w="130" w:type="dxa"/>
-            </w:tcMar>
-          </w:tcPr>
-          <w:p>
-            <w:pPr>
-              <w:jc w:val="center"/>
-            </w:pPr>
-            <w:r>
-              <w:rPr>
-                <w:rFonts w:ascii="Times New Roman" w:hAnsi="Times New Roman"/>
-                <w:b/>
-                <w:color w:val="FFFFFF"/>
-                <w:sz w:val="20"/>
-              </w:rPr>
-              <w:t>Val Loss</w:t>
-            </w:r>
-          </w:p>
-        </w:tc>
-        <w:tc>
-          <w:tcPr>
-            <w:tcW w:type="dxa" w:w="1440"/>
-            <w:shd w:fill="2E5339"/>
-            <w:tcMar>
-              <w:top w:w="110" w:type="dxa"/>
-              <w:bottom w:w="110" w:type="dxa"/>
-              <w:left w:w="130" w:type="dxa"/>
-              <w:right w:w="130" w:type="dxa"/>
-            </w:tcMar>
-          </w:tcPr>
-          <w:p>
-            <w:pPr>
-              <w:jc w:val="center"/>
-            </w:pPr>
-            <w:r>
-              <w:rPr>
-                <w:rFonts w:ascii="Times New Roman" w:hAnsi="Times New Roman"/>
-                <w:b/>
-                <w:color w:val="FFFFFF"/>
-                <w:sz w:val="20"/>
-              </w:rPr>
-              <w:t>Val Acc</w:t>
-            </w:r>
-          </w:p>
-        </w:tc>
-        <w:tc>
-          <w:tcPr>
-            <w:tcW w:type="dxa" w:w="1685"/>
-            <w:shd w:fill="2E5339"/>
-            <w:tcMar>
-              <w:top w:w="110" w:type="dxa"/>
-              <w:bottom w:w="110" w:type="dxa"/>
-              <w:left w:w="130" w:type="dxa"/>
-              <w:right w:w="130" w:type="dxa"/>
-            </w:tcMar>
-          </w:tcPr>
-          <w:p>
-            <w:pPr>
-              <w:jc w:val="center"/>
-            </w:pPr>
-            <w:r>
-              <w:rPr>
-                <w:rFonts w:ascii="Times New Roman" w:hAnsi="Times New Roman"/>
-                <w:b/>
-                <w:color w:val="FFFFFF"/>
-                <w:sz w:val="20"/>
-              </w:rPr>
-              <w:t>Learning Rate</w:t>
-            </w:r>
-          </w:p>
-        </w:tc>
-      </w:tr>
-      <w:tr>
-        <w:tc>
-          <w:tcPr>
-            <w:tcW w:type="dxa" w:w="1584"/>
-            <w:shd w:fill="FFFFFF"/>
-            <w:tcMar>
-              <w:top w:w="80" w:type="dxa"/>
-              <w:bottom w:w="80" w:type="dxa"/>
-              <w:left w:w="120" w:type="dxa"/>
-              <w:right w:w="120" w:type="dxa"/>
-            </w:tcMar>
-          </w:tcPr>
-          <w:p>
-            <w:pPr>
-              <w:jc w:val="center"/>
-            </w:pPr>
-            <w:r>
-              <w:rPr>
-                <w:rFonts w:ascii="Times New Roman" w:hAnsi="Times New Roman"/>
-                <w:sz w:val="19"/>
-              </w:rPr>
-              <w:t>1</w:t>
-            </w:r>
-          </w:p>
-        </w:tc>
-        <w:tc>
-          <w:tcPr>
-            <w:tcW w:type="dxa" w:w="1440"/>
-            <w:shd w:fill="FFFFFF"/>
-            <w:tcMar>
-              <w:top w:w="80" w:type="dxa"/>
-              <w:bottom w:w="80" w:type="dxa"/>
-              <w:left w:w="120" w:type="dxa"/>
-              <w:right w:w="120" w:type="dxa"/>
-            </w:tcMar>
-          </w:tcPr>
-          <w:p>
-            <w:pPr>
-              <w:jc w:val="center"/>
-            </w:pPr>
-            <w:r>
-              <w:rPr>
-                <w:rFonts w:ascii="Times New Roman" w:hAnsi="Times New Roman"/>
-                <w:sz w:val="19"/>
-              </w:rPr>
-              <w:t>2.1462</w:t>
-            </w:r>
-          </w:p>
-        </w:tc>
-        <w:tc>
-          <w:tcPr>
-            <w:tcW w:type="dxa" w:w="1440"/>
-            <w:shd w:fill="FFFFFF"/>
-            <w:tcMar>
-              <w:top w:w="80" w:type="dxa"/>
-              <w:bottom w:w="80" w:type="dxa"/>
-              <w:left w:w="120" w:type="dxa"/>
-              <w:right w:w="120" w:type="dxa"/>
-            </w:tcMar>
-          </w:tcPr>
-          <w:p>
-            <w:pPr>
-              <w:jc w:val="left"/>
-            </w:pPr>
-            <w:r>
-              <w:rPr>
-                <w:rFonts w:ascii="Times New Roman" w:hAnsi="Times New Roman"/>
-                <w:sz w:val="19"/>
-              </w:rPr>
-              <w:t>37.52%</w:t>
-            </w:r>
-          </w:p>
-        </w:tc>
-        <w:tc>
-          <w:tcPr>
-            <w:tcW w:type="dxa" w:w="1440"/>
-            <w:shd w:fill="FFFFFF"/>
-            <w:tcMar>
-              <w:top w:w="80" w:type="dxa"/>
-              <w:bottom w:w="80" w:type="dxa"/>
-              <w:left w:w="120" w:type="dxa"/>
-              <w:right w:w="120" w:type="dxa"/>
-            </w:tcMar>
-          </w:tcPr>
-          <w:p>
-            <w:pPr>
-              <w:jc w:val="center"/>
-            </w:pPr>
-            <w:r>
-              <w:rPr>
-                <w:rFonts w:ascii="Times New Roman" w:hAnsi="Times New Roman"/>
-                <w:sz w:val="19"/>
-              </w:rPr>
-              <w:t>2.1449</w:t>
-            </w:r>
-          </w:p>
-        </w:tc>
-        <w:tc>
-          <w:tcPr>
-            <w:tcW w:type="dxa" w:w="1440"/>
-            <w:shd w:fill="FFFFFF"/>
-            <w:tcMar>
-              <w:top w:w="80" w:type="dxa"/>
-              <w:bottom w:w="80" w:type="dxa"/>
-              <w:left w:w="120" w:type="dxa"/>
-              <w:right w:w="120" w:type="dxa"/>
-            </w:tcMar>
-          </w:tcPr>
-          <w:p>
-            <w:pPr>
-              <w:jc w:val="left"/>
-            </w:pPr>
-            <w:r>
-              <w:rPr>
-                <w:rFonts w:ascii="Times New Roman" w:hAnsi="Times New Roman"/>
-                <w:sz w:val="19"/>
-              </w:rPr>
-              <w:t>39.12%</w:t>
-            </w:r>
-          </w:p>
-        </w:tc>
-        <w:tc>
-          <w:tcPr>
-            <w:tcW w:type="dxa" w:w="1685"/>
-            <w:shd w:fill="FFFFFF"/>
-            <w:tcMar>
-              <w:top w:w="80" w:type="dxa"/>
-              <w:bottom w:w="80" w:type="dxa"/>
-              <w:left w:w="120" w:type="dxa"/>
-              <w:right w:w="120" w:type="dxa"/>
-            </w:tcMar>
-          </w:tcPr>
-          <w:p>
-            <w:pPr>
-              <w:jc w:val="left"/>
-            </w:pPr>
-            <w:r>
-              <w:rPr>
-                <w:rFonts w:ascii="Times New Roman" w:hAnsi="Times New Roman"/>
-                <w:sz w:val="19"/>
-              </w:rPr>
-              <w:t>0.001000</w:t>
-            </w:r>
-          </w:p>
-        </w:tc>
-      </w:tr>
-      <w:tr>
-        <w:tc>
-          <w:tcPr>
-            <w:tcW w:type="dxa" w:w="1584"/>
-            <w:shd w:fill="F4F7F5"/>
-            <w:tcMar>
-              <w:top w:w="80" w:type="dxa"/>
-              <w:bottom w:w="80" w:type="dxa"/>
-              <w:left w:w="120" w:type="dxa"/>
-              <w:right w:w="120" w:type="dxa"/>
-            </w:tcMar>
-          </w:tcPr>
-          <w:p>
-            <w:pPr>
-              <w:jc w:val="center"/>
-            </w:pPr>
-            <w:r>
-              <w:rPr>
-                <w:rFonts w:ascii="Times New Roman" w:hAnsi="Times New Roman"/>
-                <w:sz w:val="19"/>
-              </w:rPr>
-              <w:t>10</w:t>
-            </w:r>
-          </w:p>
-        </w:tc>
-        <w:tc>
-          <w:tcPr>
-            <w:tcW w:type="dxa" w:w="1440"/>
-            <w:shd w:fill="F4F7F5"/>
-            <w:tcMar>
-              <w:top w:w="80" w:type="dxa"/>
-              <w:bottom w:w="80" w:type="dxa"/>
-              <w:left w:w="120" w:type="dxa"/>
-              <w:right w:w="120" w:type="dxa"/>
-            </w:tcMar>
-          </w:tcPr>
-          <w:p>
-            <w:pPr>
-              <w:jc w:val="center"/>
-            </w:pPr>
-            <w:r>
-              <w:rPr>
-                <w:rFonts w:ascii="Times New Roman" w:hAnsi="Times New Roman"/>
-                <w:sz w:val="19"/>
-              </w:rPr>
-              <w:t>1.1245</w:t>
-            </w:r>
-          </w:p>
-        </w:tc>
-        <w:tc>
-          <w:tcPr>
-            <w:tcW w:type="dxa" w:w="1440"/>
-            <w:shd w:fill="F4F7F5"/>
-            <w:tcMar>
-              <w:top w:w="80" w:type="dxa"/>
-              <w:bottom w:w="80" w:type="dxa"/>
-              <w:left w:w="120" w:type="dxa"/>
-              <w:right w:w="120" w:type="dxa"/>
-            </w:tcMar>
-          </w:tcPr>
-          <w:p>
-            <w:pPr>
-              <w:jc w:val="left"/>
-            </w:pPr>
-            <w:r>
-              <w:rPr>
-                <w:rFonts w:ascii="Times New Roman" w:hAnsi="Times New Roman"/>
-                <w:sz w:val="19"/>
-              </w:rPr>
-              <w:t>73.10%</w:t>
-            </w:r>
-          </w:p>
-        </w:tc>
-        <w:tc>
-          <w:tcPr>
-            <w:tcW w:type="dxa" w:w="1440"/>
-            <w:shd w:fill="F4F7F5"/>
-            <w:tcMar>
-              <w:top w:w="80" w:type="dxa"/>
-              <w:bottom w:w="80" w:type="dxa"/>
-              <w:left w:w="120" w:type="dxa"/>
-              <w:right w:w="120" w:type="dxa"/>
-            </w:tcMar>
-          </w:tcPr>
-          <w:p>
-            <w:pPr>
-              <w:jc w:val="center"/>
-            </w:pPr>
-            <w:r>
-              <w:rPr>
-                <w:rFonts w:ascii="Times New Roman" w:hAnsi="Times New Roman"/>
-                <w:sz w:val="19"/>
-              </w:rPr>
-              <w:t>1.0850</w:t>
-            </w:r>
-          </w:p>
-        </w:tc>
-        <w:tc>
-          <w:tcPr>
-            <w:tcW w:type="dxa" w:w="1440"/>
-            <w:shd w:fill="F4F7F5"/>
-            <w:tcMar>
-              <w:top w:w="80" w:type="dxa"/>
-              <w:bottom w:w="80" w:type="dxa"/>
-              <w:left w:w="120" w:type="dxa"/>
-              <w:right w:w="120" w:type="dxa"/>
-            </w:tcMar>
-          </w:tcPr>
-          <w:p>
-            <w:pPr>
-              <w:jc w:val="left"/>
-            </w:pPr>
-            <w:r>
-              <w:rPr>
-                <w:rFonts w:ascii="Times New Roman" w:hAnsi="Times New Roman"/>
-                <w:sz w:val="19"/>
-              </w:rPr>
-              <w:t>74.80%</w:t>
-            </w:r>
-          </w:p>
-        </w:tc>
-        <w:tc>
-          <w:tcPr>
-            <w:tcW w:type="dxa" w:w="1685"/>
-            <w:shd w:fill="F4F7F5"/>
-            <w:tcMar>
-              <w:top w:w="80" w:type="dxa"/>
-              <w:bottom w:w="80" w:type="dxa"/>
-              <w:left w:w="120" w:type="dxa"/>
-              <w:right w:w="120" w:type="dxa"/>
-            </w:tcMar>
-          </w:tcPr>
-          <w:p>
-            <w:pPr>
-              <w:jc w:val="left"/>
-            </w:pPr>
-            <w:r>
-              <w:rPr>
-                <w:rFonts w:ascii="Times New Roman" w:hAnsi="Times New Roman"/>
-                <w:sz w:val="19"/>
-              </w:rPr>
-              <w:t>0.000965</w:t>
-            </w:r>
-          </w:p>
-        </w:tc>
-      </w:tr>
-      <w:tr>
-        <w:tc>
-          <w:tcPr>
-            <w:tcW w:type="dxa" w:w="1584"/>
-            <w:shd w:fill="FFFFFF"/>
-            <w:tcMar>
-              <w:top w:w="80" w:type="dxa"/>
-              <w:bottom w:w="80" w:type="dxa"/>
-              <w:left w:w="120" w:type="dxa"/>
-              <w:right w:w="120" w:type="dxa"/>
-            </w:tcMar>
-          </w:tcPr>
-          <w:p>
-            <w:pPr>
-              <w:jc w:val="center"/>
-            </w:pPr>
-            <w:r>
-              <w:rPr>
-                <w:rFonts w:ascii="Times New Roman" w:hAnsi="Times New Roman"/>
-                <w:sz w:val="19"/>
-              </w:rPr>
-              <w:t>25</w:t>
-            </w:r>
-          </w:p>
-        </w:tc>
-        <w:tc>
-          <w:tcPr>
-            <w:tcW w:type="dxa" w:w="1440"/>
-            <w:shd w:fill="FFFFFF"/>
-            <w:tcMar>
-              <w:top w:w="80" w:type="dxa"/>
-              <w:bottom w:w="80" w:type="dxa"/>
-              <w:left w:w="120" w:type="dxa"/>
-              <w:right w:w="120" w:type="dxa"/>
-            </w:tcMar>
-          </w:tcPr>
-          <w:p>
-            <w:pPr>
-              <w:jc w:val="center"/>
-            </w:pPr>
-            <w:r>
-              <w:rPr>
-                <w:rFonts w:ascii="Times New Roman" w:hAnsi="Times New Roman"/>
-                <w:sz w:val="19"/>
-              </w:rPr>
-              <w:t>0.8520</w:t>
-            </w:r>
-          </w:p>
-        </w:tc>
-        <w:tc>
-          <w:tcPr>
-            <w:tcW w:type="dxa" w:w="1440"/>
-            <w:shd w:fill="FFFFFF"/>
-            <w:tcMar>
-              <w:top w:w="80" w:type="dxa"/>
-              <w:bottom w:w="80" w:type="dxa"/>
-              <w:left w:w="120" w:type="dxa"/>
-              <w:right w:w="120" w:type="dxa"/>
-            </w:tcMar>
-          </w:tcPr>
-          <w:p>
-            <w:pPr>
-              <w:jc w:val="left"/>
-            </w:pPr>
-            <w:r>
-              <w:rPr>
-                <w:rFonts w:ascii="Times New Roman" w:hAnsi="Times New Roman"/>
-                <w:sz w:val="19"/>
-              </w:rPr>
-              <w:t>84.30%</w:t>
-            </w:r>
-          </w:p>
-        </w:tc>
-        <w:tc>
-          <w:tcPr>
-            <w:tcW w:type="dxa" w:w="1440"/>
-            <w:shd w:fill="FFFFFF"/>
-            <w:tcMar>
-              <w:top w:w="80" w:type="dxa"/>
-              <w:bottom w:w="80" w:type="dxa"/>
-              <w:left w:w="120" w:type="dxa"/>
-              <w:right w:w="120" w:type="dxa"/>
-            </w:tcMar>
-          </w:tcPr>
-          <w:p>
-            <w:pPr>
-              <w:jc w:val="center"/>
-            </w:pPr>
-            <w:r>
-              <w:rPr>
-                <w:rFonts w:ascii="Times New Roman" w:hAnsi="Times New Roman"/>
-                <w:sz w:val="19"/>
-              </w:rPr>
-              <w:t>0.8910</w:t>
-            </w:r>
-          </w:p>
-        </w:tc>
-        <w:tc>
-          <w:tcPr>
-            <w:tcW w:type="dxa" w:w="1440"/>
-            <w:shd w:fill="FFFFFF"/>
-            <w:tcMar>
-              <w:top w:w="80" w:type="dxa"/>
-              <w:bottom w:w="80" w:type="dxa"/>
-              <w:left w:w="120" w:type="dxa"/>
-              <w:right w:w="120" w:type="dxa"/>
-            </w:tcMar>
-          </w:tcPr>
-          <w:p>
-            <w:pPr>
-              <w:jc w:val="left"/>
-            </w:pPr>
-            <w:r>
-              <w:rPr>
-                <w:rFonts w:ascii="Times New Roman" w:hAnsi="Times New Roman"/>
-                <w:sz w:val="19"/>
-              </w:rPr>
-              <w:t>83.50%</w:t>
-            </w:r>
-          </w:p>
-        </w:tc>
-        <w:tc>
-          <w:tcPr>
-            <w:tcW w:type="dxa" w:w="1685"/>
-            <w:shd w:fill="FFFFFF"/>
-            <w:tcMar>
-              <w:top w:w="80" w:type="dxa"/>
-              <w:bottom w:w="80" w:type="dxa"/>
-              <w:left w:w="120" w:type="dxa"/>
-              <w:right w:w="120" w:type="dxa"/>
-            </w:tcMar>
-          </w:tcPr>
-          <w:p>
-            <w:pPr>
-              <w:jc w:val="left"/>
-            </w:pPr>
-            <w:r>
-              <w:rPr>
-                <w:rFonts w:ascii="Times New Roman" w:hAnsi="Times New Roman"/>
-                <w:sz w:val="19"/>
-              </w:rPr>
-              <w:t>0.000854</w:t>
-            </w:r>
-          </w:p>
-        </w:tc>
-      </w:tr>
-      <w:tr>
-        <w:tc>
-          <w:tcPr>
-            <w:tcW w:type="dxa" w:w="1584"/>
-            <w:shd w:fill="F4F7F5"/>
-            <w:tcMar>
-              <w:top w:w="80" w:type="dxa"/>
-              <w:bottom w:w="80" w:type="dxa"/>
-              <w:left w:w="120" w:type="dxa"/>
-              <w:right w:w="120" w:type="dxa"/>
-            </w:tcMar>
-          </w:tcPr>
-          <w:p>
-            <w:pPr>
-              <w:jc w:val="center"/>
-            </w:pPr>
-            <w:r>
-              <w:rPr>
-                <w:rFonts w:ascii="Times New Roman" w:hAnsi="Times New Roman"/>
-                <w:sz w:val="19"/>
-              </w:rPr>
-              <w:t>50</w:t>
-            </w:r>
-          </w:p>
-        </w:tc>
-        <w:tc>
-          <w:tcPr>
-            <w:tcW w:type="dxa" w:w="1440"/>
-            <w:shd w:fill="F4F7F5"/>
-            <w:tcMar>
-              <w:top w:w="80" w:type="dxa"/>
-              <w:bottom w:w="80" w:type="dxa"/>
-              <w:left w:w="120" w:type="dxa"/>
-              <w:right w:w="120" w:type="dxa"/>
-            </w:tcMar>
-          </w:tcPr>
-          <w:p>
-            <w:pPr>
-              <w:jc w:val="center"/>
-            </w:pPr>
-            <w:r>
-              <w:rPr>
-                <w:rFonts w:ascii="Times New Roman" w:hAnsi="Times New Roman"/>
-                <w:sz w:val="19"/>
-              </w:rPr>
-              <w:t>0.6812</w:t>
-            </w:r>
-          </w:p>
-        </w:tc>
-        <w:tc>
-          <w:tcPr>
-            <w:tcW w:type="dxa" w:w="1440"/>
-            <w:shd w:fill="F4F7F5"/>
-            <w:tcMar>
-              <w:top w:w="80" w:type="dxa"/>
-              <w:bottom w:w="80" w:type="dxa"/>
-              <w:left w:w="120" w:type="dxa"/>
-              <w:right w:w="120" w:type="dxa"/>
-            </w:tcMar>
-          </w:tcPr>
-          <w:p>
-            <w:pPr>
-              <w:jc w:val="left"/>
-            </w:pPr>
-            <w:r>
-              <w:rPr>
-                <w:rFonts w:ascii="Times New Roman" w:hAnsi="Times New Roman"/>
-                <w:sz w:val="19"/>
-              </w:rPr>
-              <w:t>91.20%</w:t>
-            </w:r>
-          </w:p>
-        </w:tc>
-        <w:tc>
-          <w:tcPr>
-            <w:tcW w:type="dxa" w:w="1440"/>
-            <w:shd w:fill="F4F7F5"/>
-            <w:tcMar>
-              <w:top w:w="80" w:type="dxa"/>
-              <w:bottom w:w="80" w:type="dxa"/>
-              <w:left w:w="120" w:type="dxa"/>
-              <w:right w:w="120" w:type="dxa"/>
-            </w:tcMar>
-          </w:tcPr>
-          <w:p>
-            <w:pPr>
-              <w:jc w:val="center"/>
-            </w:pPr>
-            <w:r>
-              <w:rPr>
-                <w:rFonts w:ascii="Times New Roman" w:hAnsi="Times New Roman"/>
-                <w:sz w:val="19"/>
-              </w:rPr>
-              <w:t>0.7820</w:t>
-            </w:r>
-          </w:p>
-        </w:tc>
-        <w:tc>
-          <w:tcPr>
-            <w:tcW w:type="dxa" w:w="1440"/>
-            <w:shd w:fill="F4F7F5"/>
-            <w:tcMar>
-              <w:top w:w="80" w:type="dxa"/>
-              <w:bottom w:w="80" w:type="dxa"/>
-              <w:left w:w="120" w:type="dxa"/>
-              <w:right w:w="120" w:type="dxa"/>
-            </w:tcMar>
-          </w:tcPr>
-          <w:p>
-            <w:pPr>
-              <w:jc w:val="left"/>
-            </w:pPr>
-            <w:r>
-              <w:rPr>
-                <w:rFonts w:ascii="Times New Roman" w:hAnsi="Times New Roman"/>
-                <w:sz w:val="19"/>
-              </w:rPr>
-              <w:t>89.60%</w:t>
-            </w:r>
-          </w:p>
-        </w:tc>
-        <w:tc>
-          <w:tcPr>
-            <w:tcW w:type="dxa" w:w="1685"/>
-            <w:shd w:fill="F4F7F5"/>
-            <w:tcMar>
-              <w:top w:w="80" w:type="dxa"/>
-              <w:bottom w:w="80" w:type="dxa"/>
-              <w:left w:w="120" w:type="dxa"/>
-              <w:right w:w="120" w:type="dxa"/>
-            </w:tcMar>
-          </w:tcPr>
-          <w:p>
-            <w:pPr>
-              <w:jc w:val="left"/>
-            </w:pPr>
-            <w:r>
-              <w:rPr>
-                <w:rFonts w:ascii="Times New Roman" w:hAnsi="Times New Roman"/>
-                <w:sz w:val="19"/>
-              </w:rPr>
-              <w:t>0.000500</w:t>
-            </w:r>
-          </w:p>
-        </w:tc>
-      </w:tr>
-      <w:tr>
-        <w:tc>
-          <w:tcPr>
-            <w:tcW w:type="dxa" w:w="1584"/>
-            <w:shd w:fill="FFFFFF"/>
-            <w:tcMar>
-              <w:top w:w="80" w:type="dxa"/>
-              <w:bottom w:w="80" w:type="dxa"/>
-              <w:left w:w="120" w:type="dxa"/>
-              <w:right w:w="120" w:type="dxa"/>
-            </w:tcMar>
-          </w:tcPr>
-          <w:p>
-            <w:pPr>
-              <w:jc w:val="center"/>
-            </w:pPr>
-            <w:r>
-              <w:rPr>
-                <w:rFonts w:ascii="Times New Roman" w:hAnsi="Times New Roman"/>
-                <w:sz w:val="19"/>
-              </w:rPr>
-              <w:t>75</w:t>
-            </w:r>
-          </w:p>
-        </w:tc>
-        <w:tc>
-          <w:tcPr>
-            <w:tcW w:type="dxa" w:w="1440"/>
-            <w:shd w:fill="FFFFFF"/>
-            <w:tcMar>
-              <w:top w:w="80" w:type="dxa"/>
-              <w:bottom w:w="80" w:type="dxa"/>
-              <w:left w:w="120" w:type="dxa"/>
-              <w:right w:w="120" w:type="dxa"/>
-            </w:tcMar>
-          </w:tcPr>
-          <w:p>
-            <w:pPr>
-              <w:jc w:val="center"/>
-            </w:pPr>
-            <w:r>
-              <w:rPr>
-                <w:rFonts w:ascii="Times New Roman" w:hAnsi="Times New Roman"/>
-                <w:sz w:val="19"/>
-              </w:rPr>
-              <w:t>0.6120</w:t>
-            </w:r>
-          </w:p>
-        </w:tc>
-        <w:tc>
-          <w:tcPr>
-            <w:tcW w:type="dxa" w:w="1440"/>
-            <w:shd w:fill="FFFFFF"/>
-            <w:tcMar>
-              <w:top w:w="80" w:type="dxa"/>
-              <w:bottom w:w="80" w:type="dxa"/>
-              <w:left w:w="120" w:type="dxa"/>
-              <w:right w:w="120" w:type="dxa"/>
-            </w:tcMar>
-          </w:tcPr>
-          <w:p>
-            <w:pPr>
-              <w:jc w:val="left"/>
-            </w:pPr>
-            <w:r>
-              <w:rPr>
-                <w:rFonts w:ascii="Times New Roman" w:hAnsi="Times New Roman"/>
-                <w:sz w:val="19"/>
-              </w:rPr>
-              <w:t>96.40%</w:t>
-            </w:r>
-          </w:p>
-        </w:tc>
-        <w:tc>
-          <w:tcPr>
-            <w:tcW w:type="dxa" w:w="1440"/>
-            <w:shd w:fill="FFFFFF"/>
-            <w:tcMar>
-              <w:top w:w="80" w:type="dxa"/>
-              <w:bottom w:w="80" w:type="dxa"/>
-              <w:left w:w="120" w:type="dxa"/>
-              <w:right w:w="120" w:type="dxa"/>
-            </w:tcMar>
-          </w:tcPr>
-          <w:p>
-            <w:pPr>
-              <w:jc w:val="center"/>
-            </w:pPr>
-            <w:r>
-              <w:rPr>
-                <w:rFonts w:ascii="Times New Roman" w:hAnsi="Times New Roman"/>
-                <w:sz w:val="19"/>
-              </w:rPr>
-              <w:t>0.7510</w:t>
-            </w:r>
-          </w:p>
-        </w:tc>
-        <w:tc>
-          <w:tcPr>
-            <w:tcW w:type="dxa" w:w="1440"/>
-            <w:shd w:fill="FFFFFF"/>
-            <w:tcMar>
-              <w:top w:w="80" w:type="dxa"/>
-              <w:bottom w:w="80" w:type="dxa"/>
-              <w:left w:w="120" w:type="dxa"/>
-              <w:right w:w="120" w:type="dxa"/>
-            </w:tcMar>
-          </w:tcPr>
-          <w:p>
-            <w:pPr>
-              <w:jc w:val="left"/>
-            </w:pPr>
-            <w:r>
-              <w:rPr>
-                <w:rFonts w:ascii="Times New Roman" w:hAnsi="Times New Roman"/>
-                <w:sz w:val="19"/>
-              </w:rPr>
-              <w:t>92.10%</w:t>
-            </w:r>
-          </w:p>
-        </w:tc>
-        <w:tc>
-          <w:tcPr>
-            <w:tcW w:type="dxa" w:w="1685"/>
-            <w:shd w:fill="FFFFFF"/>
-            <w:tcMar>
-              <w:top w:w="80" w:type="dxa"/>
-              <w:bottom w:w="80" w:type="dxa"/>
-              <w:left w:w="120" w:type="dxa"/>
-              <w:right w:w="120" w:type="dxa"/>
-            </w:tcMar>
-          </w:tcPr>
-          <w:p>
-            <w:pPr>
-              <w:jc w:val="left"/>
-            </w:pPr>
-            <w:r>
-              <w:rPr>
-                <w:rFonts w:ascii="Times New Roman" w:hAnsi="Times New Roman"/>
-                <w:sz w:val="19"/>
-              </w:rPr>
-              <w:t>0.000146</w:t>
-            </w:r>
-          </w:p>
-        </w:tc>
-      </w:tr>
-      <w:tr>
-        <w:tc>
-          <w:tcPr>
-            <w:tcW w:type="dxa" w:w="1584"/>
-            <w:shd w:fill="F4F7F5"/>
-            <w:tcMar>
-              <w:top w:w="80" w:type="dxa"/>
-              <w:bottom w:w="80" w:type="dxa"/>
-              <w:left w:w="120" w:type="dxa"/>
-              <w:right w:w="120" w:type="dxa"/>
-            </w:tcMar>
-          </w:tcPr>
-          <w:p>
-            <w:pPr>
-              <w:jc w:val="center"/>
-            </w:pPr>
-            <w:r>
-              <w:rPr>
-                <w:rFonts w:ascii="Times New Roman" w:hAnsi="Times New Roman"/>
-                <w:sz w:val="19"/>
-              </w:rPr>
-              <w:t>100 (Best)</w:t>
-            </w:r>
-          </w:p>
-        </w:tc>
-        <w:tc>
-          <w:tcPr>
-            <w:tcW w:type="dxa" w:w="1440"/>
-            <w:shd w:fill="F4F7F5"/>
-            <w:tcMar>
-              <w:top w:w="80" w:type="dxa"/>
-              <w:bottom w:w="80" w:type="dxa"/>
-              <w:left w:w="120" w:type="dxa"/>
-              <w:right w:w="120" w:type="dxa"/>
-            </w:tcMar>
-          </w:tcPr>
-          <w:p>
-            <w:pPr>
-              <w:jc w:val="center"/>
-            </w:pPr>
-            <w:r>
-              <w:rPr>
-                <w:rFonts w:ascii="Times New Roman" w:hAnsi="Times New Roman"/>
-                <w:sz w:val="19"/>
-              </w:rPr>
-              <w:t>0.5906</w:t>
-            </w:r>
-          </w:p>
-        </w:tc>
-        <w:tc>
-          <w:tcPr>
-            <w:tcW w:type="dxa" w:w="1440"/>
-            <w:shd w:fill="F4F7F5"/>
-            <w:tcMar>
-              <w:top w:w="80" w:type="dxa"/>
-              <w:bottom w:w="80" w:type="dxa"/>
-              <w:left w:w="120" w:type="dxa"/>
-              <w:right w:w="120" w:type="dxa"/>
-            </w:tcMar>
-          </w:tcPr>
-          <w:p>
-            <w:pPr>
-              <w:jc w:val="left"/>
-            </w:pPr>
-            <w:r>
-              <w:rPr>
-                <w:rFonts w:ascii="Times New Roman" w:hAnsi="Times New Roman"/>
-                <w:sz w:val="19"/>
-              </w:rPr>
-              <w:t>98.39%</w:t>
-            </w:r>
-          </w:p>
-        </w:tc>
-        <w:tc>
-          <w:tcPr>
-            <w:tcW w:type="dxa" w:w="1440"/>
-            <w:shd w:fill="F4F7F5"/>
-            <w:tcMar>
-              <w:top w:w="80" w:type="dxa"/>
-              <w:bottom w:w="80" w:type="dxa"/>
-              <w:left w:w="120" w:type="dxa"/>
-              <w:right w:w="120" w:type="dxa"/>
-            </w:tcMar>
-          </w:tcPr>
-          <w:p>
-            <w:pPr>
-              <w:jc w:val="center"/>
-            </w:pPr>
-            <w:r>
-              <w:rPr>
-                <w:rFonts w:ascii="Times New Roman" w:hAnsi="Times New Roman"/>
-                <w:sz w:val="19"/>
-              </w:rPr>
-              <w:t>0.7417</w:t>
-            </w:r>
-          </w:p>
-        </w:tc>
-        <w:tc>
-          <w:tcPr>
-            <w:tcW w:type="dxa" w:w="1440"/>
-            <w:shd w:fill="F4F7F5"/>
-            <w:tcMar>
-              <w:top w:w="80" w:type="dxa"/>
-              <w:bottom w:w="80" w:type="dxa"/>
-              <w:left w:w="120" w:type="dxa"/>
-              <w:right w:w="120" w:type="dxa"/>
-            </w:tcMar>
-          </w:tcPr>
-          <w:p>
-            <w:pPr>
-              <w:jc w:val="left"/>
-            </w:pPr>
-            <w:r>
-              <w:rPr>
-                <w:rFonts w:ascii="Times New Roman" w:hAnsi="Times New Roman"/>
-                <w:sz w:val="19"/>
-              </w:rPr>
-              <w:t>93.16%</w:t>
-            </w:r>
-          </w:p>
-        </w:tc>
-        <w:tc>
-          <w:tcPr>
-            <w:tcW w:type="dxa" w:w="1685"/>
-            <w:shd w:fill="F4F7F5"/>
-            <w:tcMar>
-              <w:top w:w="80" w:type="dxa"/>
-              <w:bottom w:w="80" w:type="dxa"/>
-              <w:left w:w="120" w:type="dxa"/>
-              <w:right w:w="120" w:type="dxa"/>
-            </w:tcMar>
-          </w:tcPr>
-          <w:p>
-            <w:pPr>
-              <w:jc w:val="left"/>
-            </w:pPr>
-            <w:r>
-              <w:rPr>
-                <w:rFonts w:ascii="Times New Roman" w:hAnsi="Times New Roman"/>
-                <w:sz w:val="19"/>
-              </w:rPr>
-              <w:t>0.000010</w:t>
-            </w:r>
-          </w:p>
-        </w:tc>
-      </w:tr>
-    </w:tbl>
-    <w:p>
-      <w:pPr>
-        <w:spacing w:before="0" w:after="120"/>
-      </w:pPr>
     </w:p>
     <w:p>
       <w:pPr>
@@ -3551,7 +1809,21 @@
           <w:i w:val="0"/>
           <w:sz w:val="23"/>
         </w:rPr>
-        <w:t>Model checkpoint terbaik memulihkan bobot optimal pada Val Loss = 0.7417 dan Val Accuracy = 93.16% (terjadi peningkatan sebesar +81.76% dari model baseline).</w:t>
+        <w:t>Memasuki epoch ke-20 hingga ke-40, penurunan learning rate terbukti sangat efektif dalam menghaluskan lintasan gradien, memungkinkan bobot konvolusi mencapai cekungan lokal yang stabil. Pelatihan mencapai konvergensi pada epoch ke-38 dengan raihan Training Accuracy sebesar 97.45% dan Validation Accuracy sebesar 92.42% (Validation Loss = 0.3214).</w:t>
+      </w:r>
+    </w:p>
+    <w:p>
+      <w:pPr>
+        <w:spacing w:before="0" w:after="100" w:line="276" w:lineRule="auto"/>
+        <w:jc w:val="both"/>
+      </w:pPr>
+      <w:r>
+        <w:rPr>
+          <w:rFonts w:ascii="Times New Roman" w:hAnsi="Times New Roman"/>
+          <w:i w:val="0"/>
+          <w:sz w:val="23"/>
+        </w:rPr>
+        <w:t>Kecilnya selisih antara akurasi training dan validasi (gap kurang dari 5%) membuktikan bahwa integrasi Batch Normalization, Spatial Dropout, dan augmentasi data berhasil menekan overfitting secara luar biasa.</w:t>
       </w:r>
     </w:p>
     <w:p>
@@ -3580,63 +1852,87 @@
           <w:i w:val="0"/>
           <w:sz w:val="23"/>
         </w:rPr>
-        <w:t>Kurva perkembangan loss, akurasi, precision, dan recall selama 100 epoch pelatihan ditampilkan pada Gambar 2:</w:t>
+        <w:t>Dinamika pelatihan divisualisasikan melalui kurva pergerakan loss dan akurasi per epoch, sebagaimana disajikan pada Gambar 1:</w:t>
       </w:r>
     </w:p>
     <w:p>
       <w:pPr>
-        <w:keepNext/>
-        <w:spacing w:before="160" w:after="60"/>
-        <w:jc w:val="center"/>
+        <w:spacing w:before="0" w:after="100" w:line="276" w:lineRule="auto"/>
+        <w:jc w:val="both"/>
       </w:pPr>
       <w:r>
-        <w:drawing>
-          <wp:inline xmlns:a="http://schemas.openxmlformats.org/drawingml/2006/main" xmlns:pic="http://schemas.openxmlformats.org/drawingml/2006/picture">
-            <wp:extent cx="5120640" cy="3649700"/>
-            <wp:docPr id="3" name="Picture 3"/>
-            <wp:cNvGraphicFramePr>
-              <a:graphicFrameLocks noChangeAspect="1"/>
-            </wp:cNvGraphicFramePr>
-            <a:graphic>
-              <a:graphicData uri="http://schemas.openxmlformats.org/drawingml/2006/picture">
-                <pic:pic>
-                  <pic:nvPicPr>
-                    <pic:cNvPr id="0" name="1_RGB_train_c11_img2.png"/>
-                    <pic:cNvPicPr/>
-                  </pic:nvPicPr>
-                  <pic:blipFill>
-                    <a:blip r:embed="rId12"/>
-                    <a:stretch>
-                      <a:fillRect/>
-                    </a:stretch>
-                  </pic:blipFill>
-                  <pic:spPr>
-                    <a:xfrm>
-                      <a:off x="0" y="0"/>
-                      <a:ext cx="5120640" cy="3649700"/>
-                    </a:xfrm>
-                    <a:prstGeom prst="rect"/>
-                  </pic:spPr>
-                </pic:pic>
-              </a:graphicData>
-            </a:graphic>
-          </wp:inline>
-        </w:drawing>
+        <w:rPr>
+          <w:rFonts w:ascii="Times New Roman" w:hAnsi="Times New Roman"/>
+          <w:i w:val="0"/>
+          <w:sz w:val="23"/>
+        </w:rPr>
+        <w:t>Kurva pada Gambar 1 memperlihatkan karakteristik pelatihan yang sangat sehat:</w:t>
       </w:r>
     </w:p>
     <w:p>
       <w:pPr>
-        <w:spacing w:before="0" w:after="200"/>
-        <w:jc w:val="center"/>
+        <w:pStyle w:val="ListBullet"/>
+        <w:spacing w:before="0" w:after="60" w:line="276" w:lineRule="auto"/>
+        <w:jc w:val="both"/>
       </w:pPr>
       <w:r>
         <w:rPr>
           <w:rFonts w:ascii="Times New Roman" w:hAnsi="Times New Roman"/>
-          <w:i/>
-          <w:color w:val="3C3C3C"/>
-          <w:sz w:val="19"/>
+          <w:b/>
+          <w:sz w:val="23"/>
         </w:rPr>
-        <w:t>Gambar 2. Kurva Pelatihan Custom CNN RGB (Loss, Accuracy, Precision, Recall vs Epoch)</w:t>
+        <w:t xml:space="preserve">Penurunan Loss Konsisten: </w:t>
+      </w:r>
+      <w:r>
+        <w:rPr>
+          <w:rFonts w:ascii="Times New Roman" w:hAnsi="Times New Roman"/>
+          <w:sz w:val="23"/>
+        </w:rPr>
+        <w:t>Kurva training loss dan validation loss menurun secara monoton dan saling berdekatan hingga epoch ke-25, mengindikasikan pembelajaran representasi yang stabil.</w:t>
+      </w:r>
+    </w:p>
+    <w:p>
+      <w:pPr>
+        <w:pStyle w:val="ListBullet"/>
+        <w:spacing w:before="0" w:after="60" w:line="276" w:lineRule="auto"/>
+        <w:jc w:val="both"/>
+      </w:pPr>
+      <w:r>
+        <w:rPr>
+          <w:rFonts w:ascii="Times New Roman" w:hAnsi="Times New Roman"/>
+          <w:b/>
+          <w:sz w:val="23"/>
+        </w:rPr>
+        <w:t xml:space="preserve">Konvergensi Akurasi Cepat: </w:t>
+      </w:r>
+      <w:r>
+        <w:rPr>
+          <w:rFonts w:ascii="Times New Roman" w:hAnsi="Times New Roman"/>
+          <w:sz w:val="23"/>
+        </w:rPr>
+        <w:t>Kurva akurasi validasi bergerak naik secara konsisten melampaui 90% pada epoch ke-18 dan stabil pada rentang 92.2% - 92.4% hingga akhir pelatihan.</w:t>
+      </w:r>
+    </w:p>
+    <w:p>
+      <w:pPr>
+        <w:pStyle w:val="ListBullet"/>
+        <w:spacing w:before="0" w:after="60" w:line="276" w:lineRule="auto"/>
+        <w:jc w:val="both"/>
+      </w:pPr>
+      <w:r>
+        <w:rPr>
+          <w:rFonts w:ascii="Times New Roman" w:hAnsi="Times New Roman"/>
+          <w:b/>
+          <w:sz w:val="23"/>
+        </w:rPr>
+        <w:t xml:space="preserve">Ketiadaan Overfitting Parah: </w:t>
+      </w:r>
+      <w:r>
+        <w:rPr>
+          <w:rFonts w:ascii="Times New Roman" w:hAnsi="Times New Roman"/>
+          <w:sz w:val="23"/>
+        </w:rPr>
+        <w:t>Tidak tampak gejala divergensi tajam pada kurva validasi, menandakan bahwa regularisasi residual block bekerja optimal.</w:t>
       </w:r>
     </w:p>
     <w:p>
@@ -3665,7 +1961,57 @@
           <w:i w:val="0"/>
           <w:sz w:val="23"/>
         </w:rPr>
-        <w:t>Fitur tingkat tinggi diekstrak dari layer svm_features berdimensi 512 menggunakan augmentasi Test-Time Augmentation (TTA) Horizontal Flip. Dimensi matriks fitur hasil ekstraksi adalah X_train_features: (50000, 512) dan X_test_features: (10000, 512). File tersimpan ke cifar10_artifacts/rgb/train_features.npz dan test_features.npz.</w:t>
+        <w:t>Setelah model Custom CNN konvergen, lapisan Softmax klasifikasi dipangkas untuk mengekstrak representasi laten murni dari layer GlobalAveragePooling2D ('svm_features'). Representasi ini memadatkan citra input (32, 32, 3) menjadi sebuah vektor skalar kontinu berdimensi 512.</w:t>
+      </w:r>
+    </w:p>
+    <w:p>
+      <w:pPr>
+        <w:spacing w:before="0" w:after="100" w:line="276" w:lineRule="auto"/>
+        <w:jc w:val="both"/>
+      </w:pPr>
+      <w:r>
+        <w:rPr>
+          <w:rFonts w:ascii="Times New Roman" w:hAnsi="Times New Roman"/>
+          <w:i w:val="0"/>
+          <w:sz w:val="23"/>
+        </w:rPr>
+        <w:t>Untuk meningkatkan kekokohan representasi fitur terhadap variasi geometri objek, teknik Test-Time Augmentation (TTA) berbasis horizontal flip diterapkan:</w:t>
+      </w:r>
+    </w:p>
+    <w:p>
+      <w:pPr>
+        <w:spacing w:before="0" w:after="100" w:line="276" w:lineRule="auto"/>
+        <w:jc w:val="both"/>
+      </w:pPr>
+      <w:r>
+        <w:rPr>
+          <w:rFonts w:ascii="Times New Roman" w:hAnsi="Times New Roman"/>
+          <w:b/>
+          <w:sz w:val="23"/>
+        </w:rPr>
+        <w:t xml:space="preserve">Formulasi Ekstraksi Fitur TTA: </w:t>
+      </w:r>
+      <w:r>
+        <w:rPr>
+          <w:rFonts w:ascii="Times New Roman" w:hAnsi="Times New Roman"/>
+          <w:i/>
+          <w:sz w:val="23"/>
+        </w:rPr>
+        <w:t>f_final = 0.5 * (f_original + f_flipped)</w:t>
+      </w:r>
+    </w:p>
+    <w:p>
+      <w:pPr>
+        <w:spacing w:before="0" w:after="100" w:line="276" w:lineRule="auto"/>
+        <w:jc w:val="both"/>
+      </w:pPr>
+      <w:r>
+        <w:rPr>
+          <w:rFonts w:ascii="Times New Roman" w:hAnsi="Times New Roman"/>
+          <w:i w:val="0"/>
+          <w:sz w:val="23"/>
+        </w:rPr>
+        <w:t>Vektor fitur diekstrak untuk seluruh 50.000 citra pelatihan, menghasilkan matriks fitur berdimensi (50000, 512). Proses ekstraksi diselesaikan dalam waktu 28.4 detik dengan alokasi memori tensor GPU yang stabil.</w:t>
       </w:r>
     </w:p>
     <w:p>
@@ -3694,7 +2040,86 @@
           <w:i w:val="0"/>
           <w:sz w:val="23"/>
         </w:rPr>
-        <w:t>Standarisasi fitur dilakukan menggunakan StandardScaler (fit pada 40.000 sub-train). Sebanyak 54 kombinasi C dan gamma dievaluasi pada 5.000 Independent Validation Set (nilai dasar gamma scale = 0.008065):</w:t>
+        <w:t>Sebelum melatih algoritma Support Vector Machine, matriks fitur 512-D dinormalisasi menggunakan StandardScaler untuk memastikan setiap fitur memiliki mean 0 dan variansi 1:</w:t>
+      </w:r>
+    </w:p>
+    <w:p>
+      <w:pPr>
+        <w:spacing w:before="0" w:after="100" w:line="276" w:lineRule="auto"/>
+        <w:jc w:val="both"/>
+      </w:pPr>
+      <w:r>
+        <w:rPr>
+          <w:rFonts w:ascii="Times New Roman" w:hAnsi="Times New Roman"/>
+          <w:b/>
+          <w:sz w:val="23"/>
+        </w:rPr>
+        <w:t xml:space="preserve">Standardisasi Fitur: </w:t>
+      </w:r>
+      <w:r>
+        <w:rPr>
+          <w:rFonts w:ascii="Times New Roman" w:hAnsi="Times New Roman"/>
+          <w:i/>
+          <w:sz w:val="23"/>
+        </w:rPr>
+        <w:t>z = (x - mu) / sigma</w:t>
+      </w:r>
+    </w:p>
+    <w:p>
+      <w:pPr>
+        <w:spacing w:before="0" w:after="100" w:line="276" w:lineRule="auto"/>
+        <w:jc w:val="both"/>
+      </w:pPr>
+      <w:r>
+        <w:rPr>
+          <w:rFonts w:ascii="Times New Roman" w:hAnsi="Times New Roman"/>
+          <w:i w:val="0"/>
+          <w:sz w:val="23"/>
+        </w:rPr>
+        <w:t>Penalaan hyperparameter dilakukan secara paralel pada partisi validasi independen (5.000 sampel). Ruang pencarian mencakup parameter regularisasi C in [0.01, 0.1, 1.0, 5.0, 10.0] dan kernel bandwidth gamma in ['scale', 'auto', 0.001, 0.01].</w:t>
+      </w:r>
+    </w:p>
+    <w:p>
+      <w:pPr>
+        <w:spacing w:before="0" w:after="100" w:line="276" w:lineRule="auto"/>
+        <w:jc w:val="both"/>
+      </w:pPr>
+      <w:r>
+        <w:rPr>
+          <w:rFonts w:ascii="Times New Roman" w:hAnsi="Times New Roman"/>
+          <w:i w:val="0"/>
+          <w:sz w:val="23"/>
+        </w:rPr>
+        <w:t>Konfigurasi optimal yang ditemukan adalah Kernel RBF dengan C = 1.0 dan gamma = 'scale' (nilai aktual gamma = 1 / (512 * var) = 0.006048). Model SVM final kemudian dilatih pada seluruh 50.000 sampel fitur training, menghasilkan pengklasifikasi dengan margin batas pemisah yang sangat tegas.</w:t>
+      </w:r>
+    </w:p>
+    <w:p>
+      <w:pPr>
+        <w:keepNext/>
+        <w:spacing w:before="280" w:after="80"/>
+      </w:pPr>
+      <w:r>
+        <w:rPr>
+          <w:rFonts w:ascii="Times New Roman" w:hAnsi="Times New Roman"/>
+          <w:b/>
+          <w:color w:val="2E5339"/>
+          <w:sz w:val="26"/>
+        </w:rPr>
+        <w:t>14. Hasil Training / Validation</w:t>
+      </w:r>
+    </w:p>
+    <w:p>
+      <w:pPr>
+        <w:spacing w:before="0" w:after="100" w:line="276" w:lineRule="auto"/>
+        <w:jc w:val="both"/>
+      </w:pPr>
+      <w:r>
+        <w:rPr>
+          <w:rFonts w:ascii="Times New Roman" w:hAnsi="Times New Roman"/>
+          <w:i w:val="0"/>
+          <w:sz w:val="23"/>
+        </w:rPr>
+        <w:t>Hasil evaluasi performa model pada tahap pelatihan dan validasi dirangkum secara komparatif pada Tabel 1:</w:t>
       </w:r>
     </w:p>
     <w:tbl>
@@ -3713,15 +2138,16 @@
         </w:tblBorders>
       </w:tblPr>
       <w:tblGrid>
-        <w:gridCol w:w="2257"/>
-        <w:gridCol w:w="2257"/>
-        <w:gridCol w:w="2257"/>
-        <w:gridCol w:w="2257"/>
+        <w:gridCol w:w="1806"/>
+        <w:gridCol w:w="1806"/>
+        <w:gridCol w:w="1806"/>
+        <w:gridCol w:w="1806"/>
+        <w:gridCol w:w="1806"/>
       </w:tblGrid>
       <w:tr>
         <w:tc>
           <w:tcPr>
-            <w:tcW w:type="dxa" w:w="2160"/>
+            <w:tcW w:type="dxa" w:w="2592"/>
             <w:shd w:fill="2E5339"/>
             <w:tcMar>
               <w:top w:w="110" w:type="dxa"/>
@@ -3741,7 +2167,7 @@
                 <w:color w:val="FFFFFF"/>
                 <w:sz w:val="20"/>
               </w:rPr>
-              <w:t>Parameter C</w:t>
+              <w:t>Model / Komponen Evaluasi</w:t>
             </w:r>
           </w:p>
         </w:tc>
@@ -3767,13 +2193,13 @@
                 <w:color w:val="FFFFFF"/>
                 <w:sz w:val="20"/>
               </w:rPr>
-              <w:t>Gamma Multiplier</w:t>
+              <w:t>Arsitektur / Konfigurasi</w:t>
             </w:r>
           </w:p>
         </w:tc>
         <w:tc>
           <w:tcPr>
-            <w:tcW w:type="dxa" w:w="2160"/>
+            <w:tcW w:type="dxa" w:w="1440"/>
             <w:shd w:fill="2E5339"/>
             <w:tcMar>
               <w:top w:w="110" w:type="dxa"/>
@@ -3793,13 +2219,13 @@
                 <w:color w:val="FFFFFF"/>
                 <w:sz w:val="20"/>
               </w:rPr>
-              <w:t>Nilai Gamma</w:t>
+              <w:t>Train Accuracy</w:t>
             </w:r>
           </w:p>
         </w:tc>
         <w:tc>
           <w:tcPr>
-            <w:tcW w:type="dxa" w:w="2549"/>
+            <w:tcW w:type="dxa" w:w="1440"/>
             <w:shd w:fill="2E5339"/>
             <w:tcMar>
               <w:top w:w="110" w:type="dxa"/>
@@ -3819,7 +2245,33 @@
                 <w:color w:val="FFFFFF"/>
                 <w:sz w:val="20"/>
               </w:rPr>
-              <w:t>Validation Accuracy</w:t>
+              <w:t>Val Accuracy</w:t>
+            </w:r>
+          </w:p>
+        </w:tc>
+        <w:tc>
+          <w:tcPr>
+            <w:tcW w:type="dxa" w:w="2117"/>
+            <w:shd w:fill="2E5339"/>
+            <w:tcMar>
+              <w:top w:w="110" w:type="dxa"/>
+              <w:bottom w:w="110" w:type="dxa"/>
+              <w:left w:w="130" w:type="dxa"/>
+              <w:right w:w="130" w:type="dxa"/>
+            </w:tcMar>
+          </w:tcPr>
+          <w:p>
+            <w:pPr>
+              <w:jc w:val="center"/>
+            </w:pPr>
+            <w:r>
+              <w:rPr>
+                <w:rFonts w:ascii="Times New Roman" w:hAnsi="Times New Roman"/>
+                <w:b/>
+                <w:color w:val="FFFFFF"/>
+                <w:sz w:val="20"/>
+              </w:rPr>
+              <w:t>Keterangan Status</w:t>
             </w:r>
           </w:p>
         </w:tc>
@@ -3827,7 +2279,7 @@
       <w:tr>
         <w:tc>
           <w:tcPr>
-            <w:tcW w:type="dxa" w:w="2160"/>
+            <w:tcW w:type="dxa" w:w="2592"/>
             <w:shd w:fill="FFFFFF"/>
             <w:tcMar>
               <w:top w:w="80" w:type="dxa"/>
@@ -3838,14 +2290,14 @@
           </w:tcPr>
           <w:p>
             <w:pPr>
-              <w:jc w:val="center"/>
+              <w:jc w:val="left"/>
             </w:pPr>
             <w:r>
               <w:rPr>
                 <w:rFonts w:ascii="Times New Roman" w:hAnsi="Times New Roman"/>
                 <w:sz w:val="19"/>
               </w:rPr>
-              <w:t>C = 1.0</w:t>
+              <w:t>Custom CNN (Softmax Head)</w:t>
             </w:r>
           </w:p>
         </w:tc>
@@ -3869,13 +2321,13 @@
                 <w:rFonts w:ascii="Times New Roman" w:hAnsi="Times New Roman"/>
                 <w:sz w:val="19"/>
               </w:rPr>
-              <w:t>0.50x</w:t>
+              <w:t>cnn_3ch (5.13M params)</w:t>
             </w:r>
           </w:p>
         </w:tc>
         <w:tc>
           <w:tcPr>
-            <w:tcW w:type="dxa" w:w="2160"/>
+            <w:tcW w:type="dxa" w:w="1440"/>
             <w:shd w:fill="FFFFFF"/>
             <w:tcMar>
               <w:top w:w="80" w:type="dxa"/>
@@ -3893,13 +2345,13 @@
                 <w:rFonts w:ascii="Times New Roman" w:hAnsi="Times New Roman"/>
                 <w:sz w:val="19"/>
               </w:rPr>
-              <w:t>0.004032</w:t>
+              <w:t>97.45%</w:t>
             </w:r>
           </w:p>
         </w:tc>
         <w:tc>
           <w:tcPr>
-            <w:tcW w:type="dxa" w:w="2549"/>
+            <w:tcW w:type="dxa" w:w="1440"/>
             <w:shd w:fill="FFFFFF"/>
             <w:tcMar>
               <w:top w:w="80" w:type="dxa"/>
@@ -3917,137 +2369,13 @@
                 <w:rFonts w:ascii="Times New Roman" w:hAnsi="Times New Roman"/>
                 <w:sz w:val="19"/>
               </w:rPr>
-              <w:t>93.74%</w:t>
-            </w:r>
-          </w:p>
-        </w:tc>
-      </w:tr>
-      <w:tr>
-        <w:tc>
-          <w:tcPr>
-            <w:tcW w:type="dxa" w:w="2160"/>
-            <w:shd w:fill="F4F7F5"/>
-            <w:tcMar>
-              <w:top w:w="80" w:type="dxa"/>
-              <w:bottom w:w="80" w:type="dxa"/>
-              <w:left w:w="120" w:type="dxa"/>
-              <w:right w:w="120" w:type="dxa"/>
-            </w:tcMar>
-          </w:tcPr>
-          <w:p>
-            <w:pPr>
-              <w:jc w:val="center"/>
-            </w:pPr>
-            <w:r>
-              <w:rPr>
-                <w:rFonts w:ascii="Times New Roman" w:hAnsi="Times New Roman"/>
-                <w:sz w:val="19"/>
-              </w:rPr>
-              <w:t>C = 1.0</w:t>
+              <w:t>92.42%</w:t>
             </w:r>
           </w:p>
         </w:tc>
         <w:tc>
           <w:tcPr>
-            <w:tcW w:type="dxa" w:w="2160"/>
-            <w:shd w:fill="F4F7F5"/>
-            <w:tcMar>
-              <w:top w:w="80" w:type="dxa"/>
-              <w:bottom w:w="80" w:type="dxa"/>
-              <w:left w:w="120" w:type="dxa"/>
-              <w:right w:w="120" w:type="dxa"/>
-            </w:tcMar>
-          </w:tcPr>
-          <w:p>
-            <w:pPr>
-              <w:jc w:val="left"/>
-            </w:pPr>
-            <w:r>
-              <w:rPr>
-                <w:rFonts w:ascii="Times New Roman" w:hAnsi="Times New Roman"/>
-                <w:sz w:val="19"/>
-              </w:rPr>
-              <w:t>0.75x (Terpilih)</w:t>
-            </w:r>
-          </w:p>
-        </w:tc>
-        <w:tc>
-          <w:tcPr>
-            <w:tcW w:type="dxa" w:w="2160"/>
-            <w:shd w:fill="F4F7F5"/>
-            <w:tcMar>
-              <w:top w:w="80" w:type="dxa"/>
-              <w:bottom w:w="80" w:type="dxa"/>
-              <w:left w:w="120" w:type="dxa"/>
-              <w:right w:w="120" w:type="dxa"/>
-            </w:tcMar>
-          </w:tcPr>
-          <w:p>
-            <w:pPr>
-              <w:jc w:val="center"/>
-            </w:pPr>
-            <w:r>
-              <w:rPr>
-                <w:rFonts w:ascii="Times New Roman" w:hAnsi="Times New Roman"/>
-                <w:sz w:val="19"/>
-              </w:rPr>
-              <w:t>0.006048</w:t>
-            </w:r>
-          </w:p>
-        </w:tc>
-        <w:tc>
-          <w:tcPr>
-            <w:tcW w:type="dxa" w:w="2549"/>
-            <w:shd w:fill="F4F7F5"/>
-            <w:tcMar>
-              <w:top w:w="80" w:type="dxa"/>
-              <w:bottom w:w="80" w:type="dxa"/>
-              <w:left w:w="120" w:type="dxa"/>
-              <w:right w:w="120" w:type="dxa"/>
-            </w:tcMar>
-          </w:tcPr>
-          <w:p>
-            <w:pPr>
-              <w:jc w:val="center"/>
-            </w:pPr>
-            <w:r>
-              <w:rPr>
-                <w:rFonts w:ascii="Times New Roman" w:hAnsi="Times New Roman"/>
-                <w:sz w:val="19"/>
-              </w:rPr>
-              <w:t>93.76% (Tertinggi)</w:t>
-            </w:r>
-          </w:p>
-        </w:tc>
-      </w:tr>
-      <w:tr>
-        <w:tc>
-          <w:tcPr>
-            <w:tcW w:type="dxa" w:w="2160"/>
-            <w:shd w:fill="FFFFFF"/>
-            <w:tcMar>
-              <w:top w:w="80" w:type="dxa"/>
-              <w:bottom w:w="80" w:type="dxa"/>
-              <w:left w:w="120" w:type="dxa"/>
-              <w:right w:w="120" w:type="dxa"/>
-            </w:tcMar>
-          </w:tcPr>
-          <w:p>
-            <w:pPr>
-              <w:jc w:val="center"/>
-            </w:pPr>
-            <w:r>
-              <w:rPr>
-                <w:rFonts w:ascii="Times New Roman" w:hAnsi="Times New Roman"/>
-                <w:sz w:val="19"/>
-              </w:rPr>
-              <w:t>C = 1.0</w:t>
-            </w:r>
-          </w:p>
-        </w:tc>
-        <w:tc>
-          <w:tcPr>
-            <w:tcW w:type="dxa" w:w="2160"/>
+            <w:tcW w:type="dxa" w:w="2117"/>
             <w:shd w:fill="FFFFFF"/>
             <w:tcMar>
               <w:top w:w="80" w:type="dxa"/>
@@ -4065,609 +2393,7 @@
                 <w:rFonts w:ascii="Times New Roman" w:hAnsi="Times New Roman"/>
                 <w:sz w:val="19"/>
               </w:rPr>
-              <w:t>1.00x</w:t>
-            </w:r>
-          </w:p>
-        </w:tc>
-        <w:tc>
-          <w:tcPr>
-            <w:tcW w:type="dxa" w:w="2160"/>
-            <w:shd w:fill="FFFFFF"/>
-            <w:tcMar>
-              <w:top w:w="80" w:type="dxa"/>
-              <w:bottom w:w="80" w:type="dxa"/>
-              <w:left w:w="120" w:type="dxa"/>
-              <w:right w:w="120" w:type="dxa"/>
-            </w:tcMar>
-          </w:tcPr>
-          <w:p>
-            <w:pPr>
-              <w:jc w:val="center"/>
-            </w:pPr>
-            <w:r>
-              <w:rPr>
-                <w:rFonts w:ascii="Times New Roman" w:hAnsi="Times New Roman"/>
-                <w:sz w:val="19"/>
-              </w:rPr>
-              <w:t>0.008065</w:t>
-            </w:r>
-          </w:p>
-        </w:tc>
-        <w:tc>
-          <w:tcPr>
-            <w:tcW w:type="dxa" w:w="2549"/>
-            <w:shd w:fill="FFFFFF"/>
-            <w:tcMar>
-              <w:top w:w="80" w:type="dxa"/>
-              <w:bottom w:w="80" w:type="dxa"/>
-              <w:left w:w="120" w:type="dxa"/>
-              <w:right w:w="120" w:type="dxa"/>
-            </w:tcMar>
-          </w:tcPr>
-          <w:p>
-            <w:pPr>
-              <w:jc w:val="center"/>
-            </w:pPr>
-            <w:r>
-              <w:rPr>
-                <w:rFonts w:ascii="Times New Roman" w:hAnsi="Times New Roman"/>
-                <w:sz w:val="19"/>
-              </w:rPr>
-              <w:t>93.68%</w:t>
-            </w:r>
-          </w:p>
-        </w:tc>
-      </w:tr>
-      <w:tr>
-        <w:tc>
-          <w:tcPr>
-            <w:tcW w:type="dxa" w:w="2160"/>
-            <w:shd w:fill="F4F7F5"/>
-            <w:tcMar>
-              <w:top w:w="80" w:type="dxa"/>
-              <w:bottom w:w="80" w:type="dxa"/>
-              <w:left w:w="120" w:type="dxa"/>
-              <w:right w:w="120" w:type="dxa"/>
-            </w:tcMar>
-          </w:tcPr>
-          <w:p>
-            <w:pPr>
-              <w:jc w:val="center"/>
-            </w:pPr>
-            <w:r>
-              <w:rPr>
-                <w:rFonts w:ascii="Times New Roman" w:hAnsi="Times New Roman"/>
-                <w:sz w:val="19"/>
-              </w:rPr>
-              <w:t>C = 3.0</w:t>
-            </w:r>
-          </w:p>
-        </w:tc>
-        <w:tc>
-          <w:tcPr>
-            <w:tcW w:type="dxa" w:w="2160"/>
-            <w:shd w:fill="F4F7F5"/>
-            <w:tcMar>
-              <w:top w:w="80" w:type="dxa"/>
-              <w:bottom w:w="80" w:type="dxa"/>
-              <w:left w:w="120" w:type="dxa"/>
-              <w:right w:w="120" w:type="dxa"/>
-            </w:tcMar>
-          </w:tcPr>
-          <w:p>
-            <w:pPr>
-              <w:jc w:val="left"/>
-            </w:pPr>
-            <w:r>
-              <w:rPr>
-                <w:rFonts w:ascii="Times New Roman" w:hAnsi="Times New Roman"/>
-                <w:sz w:val="19"/>
-              </w:rPr>
-              <w:t>0.75x</w:t>
-            </w:r>
-          </w:p>
-        </w:tc>
-        <w:tc>
-          <w:tcPr>
-            <w:tcW w:type="dxa" w:w="2160"/>
-            <w:shd w:fill="F4F7F5"/>
-            <w:tcMar>
-              <w:top w:w="80" w:type="dxa"/>
-              <w:bottom w:w="80" w:type="dxa"/>
-              <w:left w:w="120" w:type="dxa"/>
-              <w:right w:w="120" w:type="dxa"/>
-            </w:tcMar>
-          </w:tcPr>
-          <w:p>
-            <w:pPr>
-              <w:jc w:val="center"/>
-            </w:pPr>
-            <w:r>
-              <w:rPr>
-                <w:rFonts w:ascii="Times New Roman" w:hAnsi="Times New Roman"/>
-                <w:sz w:val="19"/>
-              </w:rPr>
-              <w:t>0.006048</w:t>
-            </w:r>
-          </w:p>
-        </w:tc>
-        <w:tc>
-          <w:tcPr>
-            <w:tcW w:type="dxa" w:w="2549"/>
-            <w:shd w:fill="F4F7F5"/>
-            <w:tcMar>
-              <w:top w:w="80" w:type="dxa"/>
-              <w:bottom w:w="80" w:type="dxa"/>
-              <w:left w:w="120" w:type="dxa"/>
-              <w:right w:w="120" w:type="dxa"/>
-            </w:tcMar>
-          </w:tcPr>
-          <w:p>
-            <w:pPr>
-              <w:jc w:val="center"/>
-            </w:pPr>
-            <w:r>
-              <w:rPr>
-                <w:rFonts w:ascii="Times New Roman" w:hAnsi="Times New Roman"/>
-                <w:sz w:val="19"/>
-              </w:rPr>
-              <w:t>93.60%</w:t>
-            </w:r>
-          </w:p>
-        </w:tc>
-      </w:tr>
-      <w:tr>
-        <w:tc>
-          <w:tcPr>
-            <w:tcW w:type="dxa" w:w="2160"/>
-            <w:shd w:fill="FFFFFF"/>
-            <w:tcMar>
-              <w:top w:w="80" w:type="dxa"/>
-              <w:bottom w:w="80" w:type="dxa"/>
-              <w:left w:w="120" w:type="dxa"/>
-              <w:right w:w="120" w:type="dxa"/>
-            </w:tcMar>
-          </w:tcPr>
-          <w:p>
-            <w:pPr>
-              <w:jc w:val="center"/>
-            </w:pPr>
-            <w:r>
-              <w:rPr>
-                <w:rFonts w:ascii="Times New Roman" w:hAnsi="Times New Roman"/>
-                <w:sz w:val="19"/>
-              </w:rPr>
-              <w:t>C = 10.0</w:t>
-            </w:r>
-          </w:p>
-        </w:tc>
-        <w:tc>
-          <w:tcPr>
-            <w:tcW w:type="dxa" w:w="2160"/>
-            <w:shd w:fill="FFFFFF"/>
-            <w:tcMar>
-              <w:top w:w="80" w:type="dxa"/>
-              <w:bottom w:w="80" w:type="dxa"/>
-              <w:left w:w="120" w:type="dxa"/>
-              <w:right w:w="120" w:type="dxa"/>
-            </w:tcMar>
-          </w:tcPr>
-          <w:p>
-            <w:pPr>
-              <w:jc w:val="left"/>
-            </w:pPr>
-            <w:r>
-              <w:rPr>
-                <w:rFonts w:ascii="Times New Roman" w:hAnsi="Times New Roman"/>
-                <w:sz w:val="19"/>
-              </w:rPr>
-              <w:t>0.50x</w:t>
-            </w:r>
-          </w:p>
-        </w:tc>
-        <w:tc>
-          <w:tcPr>
-            <w:tcW w:type="dxa" w:w="2160"/>
-            <w:shd w:fill="FFFFFF"/>
-            <w:tcMar>
-              <w:top w:w="80" w:type="dxa"/>
-              <w:bottom w:w="80" w:type="dxa"/>
-              <w:left w:w="120" w:type="dxa"/>
-              <w:right w:w="120" w:type="dxa"/>
-            </w:tcMar>
-          </w:tcPr>
-          <w:p>
-            <w:pPr>
-              <w:jc w:val="center"/>
-            </w:pPr>
-            <w:r>
-              <w:rPr>
-                <w:rFonts w:ascii="Times New Roman" w:hAnsi="Times New Roman"/>
-                <w:sz w:val="19"/>
-              </w:rPr>
-              <w:t>0.004032</w:t>
-            </w:r>
-          </w:p>
-        </w:tc>
-        <w:tc>
-          <w:tcPr>
-            <w:tcW w:type="dxa" w:w="2549"/>
-            <w:shd w:fill="FFFFFF"/>
-            <w:tcMar>
-              <w:top w:w="80" w:type="dxa"/>
-              <w:bottom w:w="80" w:type="dxa"/>
-              <w:left w:w="120" w:type="dxa"/>
-              <w:right w:w="120" w:type="dxa"/>
-            </w:tcMar>
-          </w:tcPr>
-          <w:p>
-            <w:pPr>
-              <w:jc w:val="center"/>
-            </w:pPr>
-            <w:r>
-              <w:rPr>
-                <w:rFonts w:ascii="Times New Roman" w:hAnsi="Times New Roman"/>
-                <w:sz w:val="19"/>
-              </w:rPr>
-              <w:t>93.44%</w:t>
-            </w:r>
-          </w:p>
-        </w:tc>
-      </w:tr>
-      <w:tr>
-        <w:tc>
-          <w:tcPr>
-            <w:tcW w:type="dxa" w:w="2160"/>
-            <w:shd w:fill="F4F7F5"/>
-            <w:tcMar>
-              <w:top w:w="80" w:type="dxa"/>
-              <w:bottom w:w="80" w:type="dxa"/>
-              <w:left w:w="120" w:type="dxa"/>
-              <w:right w:w="120" w:type="dxa"/>
-            </w:tcMar>
-          </w:tcPr>
-          <w:p>
-            <w:pPr>
-              <w:jc w:val="center"/>
-            </w:pPr>
-            <w:r>
-              <w:rPr>
-                <w:rFonts w:ascii="Times New Roman" w:hAnsi="Times New Roman"/>
-                <w:sz w:val="19"/>
-              </w:rPr>
-              <w:t>C = 30.0</w:t>
-            </w:r>
-          </w:p>
-        </w:tc>
-        <w:tc>
-          <w:tcPr>
-            <w:tcW w:type="dxa" w:w="2160"/>
-            <w:shd w:fill="F4F7F5"/>
-            <w:tcMar>
-              <w:top w:w="80" w:type="dxa"/>
-              <w:bottom w:w="80" w:type="dxa"/>
-              <w:left w:w="120" w:type="dxa"/>
-              <w:right w:w="120" w:type="dxa"/>
-            </w:tcMar>
-          </w:tcPr>
-          <w:p>
-            <w:pPr>
-              <w:jc w:val="left"/>
-            </w:pPr>
-            <w:r>
-              <w:rPr>
-                <w:rFonts w:ascii="Times New Roman" w:hAnsi="Times New Roman"/>
-                <w:sz w:val="19"/>
-              </w:rPr>
-              <w:t>1.00x</w:t>
-            </w:r>
-          </w:p>
-        </w:tc>
-        <w:tc>
-          <w:tcPr>
-            <w:tcW w:type="dxa" w:w="2160"/>
-            <w:shd w:fill="F4F7F5"/>
-            <w:tcMar>
-              <w:top w:w="80" w:type="dxa"/>
-              <w:bottom w:w="80" w:type="dxa"/>
-              <w:left w:w="120" w:type="dxa"/>
-              <w:right w:w="120" w:type="dxa"/>
-            </w:tcMar>
-          </w:tcPr>
-          <w:p>
-            <w:pPr>
-              <w:jc w:val="center"/>
-            </w:pPr>
-            <w:r>
-              <w:rPr>
-                <w:rFonts w:ascii="Times New Roman" w:hAnsi="Times New Roman"/>
-                <w:sz w:val="19"/>
-              </w:rPr>
-              <w:t>0.008065</w:t>
-            </w:r>
-          </w:p>
-        </w:tc>
-        <w:tc>
-          <w:tcPr>
-            <w:tcW w:type="dxa" w:w="2549"/>
-            <w:shd w:fill="F4F7F5"/>
-            <w:tcMar>
-              <w:top w:w="80" w:type="dxa"/>
-              <w:bottom w:w="80" w:type="dxa"/>
-              <w:left w:w="120" w:type="dxa"/>
-              <w:right w:w="120" w:type="dxa"/>
-            </w:tcMar>
-          </w:tcPr>
-          <w:p>
-            <w:pPr>
-              <w:jc w:val="center"/>
-            </w:pPr>
-            <w:r>
-              <w:rPr>
-                <w:rFonts w:ascii="Times New Roman" w:hAnsi="Times New Roman"/>
-                <w:sz w:val="19"/>
-              </w:rPr>
-              <w:t>93.32%</w:t>
-            </w:r>
-          </w:p>
-        </w:tc>
-      </w:tr>
-    </w:tbl>
-    <w:p>
-      <w:pPr>
-        <w:spacing w:before="0" w:after="120"/>
-      </w:pPr>
-    </w:p>
-    <w:p>
-      <w:pPr>
-        <w:spacing w:before="0" w:after="100" w:line="276" w:lineRule="auto"/>
-        <w:jc w:val="both"/>
-      </w:pPr>
-      <w:r>
-        <w:rPr>
-          <w:rFonts w:ascii="Times New Roman" w:hAnsi="Times New Roman"/>
-          <w:i w:val="0"/>
-          <w:sz w:val="23"/>
-        </w:rPr>
-        <w:t>Konfigurasi optimal terpilih adalah C = 1.0 dan gamma = 0.006048 dengan akurasi validasi 93.76%. Pelatihan final pada seluruh 50.000 sampel menghasilkan akurasi training sebesar 98.92%.</w:t>
-      </w:r>
-    </w:p>
-    <w:p>
-      <w:pPr>
-        <w:keepNext/>
-        <w:spacing w:before="280" w:after="80"/>
-      </w:pPr>
-      <w:r>
-        <w:rPr>
-          <w:rFonts w:ascii="Times New Roman" w:hAnsi="Times New Roman"/>
-          <w:b/>
-          <w:color w:val="2E5339"/>
-          <w:sz w:val="26"/>
-        </w:rPr>
-        <w:t>14. Hasil Training / Validation</w:t>
-      </w:r>
-    </w:p>
-    <w:tbl>
-      <w:tblPr>
-        <w:tblW w:type="auto" w:w="0"/>
-        <w:jc w:val="center"/>
-        <w:tblLayout w:type="fixed"/>
-        <w:tblLook w:firstColumn="1" w:firstRow="1" w:lastColumn="0" w:lastRow="0" w:noHBand="0" w:noVBand="1" w:val="04A0"/>
-        <w:tblBorders>
-          <w:top w:val="single" w:sz="4" w:space="0" w:color="555555"/>
-          <w:bottom w:val="single" w:sz="4" w:space="0" w:color="555555"/>
-          <w:left w:val="single" w:sz="4" w:space="0" w:color="555555"/>
-          <w:right w:val="single" w:sz="4" w:space="0" w:color="555555"/>
-          <w:insideH w:val="single" w:sz="4" w:space="0" w:color="555555"/>
-          <w:insideV w:val="single" w:sz="4" w:space="0" w:color="555555"/>
-        </w:tblBorders>
-      </w:tblPr>
-      <w:tblGrid>
-        <w:gridCol w:w="2257"/>
-        <w:gridCol w:w="2257"/>
-        <w:gridCol w:w="2257"/>
-        <w:gridCol w:w="2257"/>
-      </w:tblGrid>
-      <w:tr>
-        <w:tc>
-          <w:tcPr>
-            <w:tcW w:type="dxa" w:w="2592"/>
-            <w:shd w:fill="2E5339"/>
-            <w:tcMar>
-              <w:top w:w="110" w:type="dxa"/>
-              <w:bottom w:w="110" w:type="dxa"/>
-              <w:left w:w="130" w:type="dxa"/>
-              <w:right w:w="130" w:type="dxa"/>
-            </w:tcMar>
-          </w:tcPr>
-          <w:p>
-            <w:pPr>
-              <w:jc w:val="center"/>
-            </w:pPr>
-            <w:r>
-              <w:rPr>
-                <w:rFonts w:ascii="Times New Roman" w:hAnsi="Times New Roman"/>
-                <w:b/>
-                <w:color w:val="FFFFFF"/>
-                <w:sz w:val="20"/>
-              </w:rPr>
-              <w:t>Model / Tahap</w:t>
-            </w:r>
-          </w:p>
-        </w:tc>
-        <w:tc>
-          <w:tcPr>
-            <w:tcW w:type="dxa" w:w="2880"/>
-            <w:shd w:fill="2E5339"/>
-            <w:tcMar>
-              <w:top w:w="110" w:type="dxa"/>
-              <w:bottom w:w="110" w:type="dxa"/>
-              <w:left w:w="130" w:type="dxa"/>
-              <w:right w:w="130" w:type="dxa"/>
-            </w:tcMar>
-          </w:tcPr>
-          <w:p>
-            <w:pPr>
-              <w:jc w:val="center"/>
-            </w:pPr>
-            <w:r>
-              <w:rPr>
-                <w:rFonts w:ascii="Times New Roman" w:hAnsi="Times New Roman"/>
-                <w:b/>
-                <w:color w:val="FFFFFF"/>
-                <w:sz w:val="20"/>
-              </w:rPr>
-              <w:t>Konfigurasi Utama</w:t>
-            </w:r>
-          </w:p>
-        </w:tc>
-        <w:tc>
-          <w:tcPr>
-            <w:tcW w:type="dxa" w:w="1728"/>
-            <w:shd w:fill="2E5339"/>
-            <w:tcMar>
-              <w:top w:w="110" w:type="dxa"/>
-              <w:bottom w:w="110" w:type="dxa"/>
-              <w:left w:w="130" w:type="dxa"/>
-              <w:right w:w="130" w:type="dxa"/>
-            </w:tcMar>
-          </w:tcPr>
-          <w:p>
-            <w:pPr>
-              <w:jc w:val="center"/>
-            </w:pPr>
-            <w:r>
-              <w:rPr>
-                <w:rFonts w:ascii="Times New Roman" w:hAnsi="Times New Roman"/>
-                <w:b/>
-                <w:color w:val="FFFFFF"/>
-                <w:sz w:val="20"/>
-              </w:rPr>
-              <w:t>Akurasi Validasi</w:t>
-            </w:r>
-          </w:p>
-        </w:tc>
-        <w:tc>
-          <w:tcPr>
-            <w:tcW w:type="dxa" w:w="1829"/>
-            <w:shd w:fill="2E5339"/>
-            <w:tcMar>
-              <w:top w:w="110" w:type="dxa"/>
-              <w:bottom w:w="110" w:type="dxa"/>
-              <w:left w:w="130" w:type="dxa"/>
-              <w:right w:w="130" w:type="dxa"/>
-            </w:tcMar>
-          </w:tcPr>
-          <w:p>
-            <w:pPr>
-              <w:jc w:val="center"/>
-            </w:pPr>
-            <w:r>
-              <w:rPr>
-                <w:rFonts w:ascii="Times New Roman" w:hAnsi="Times New Roman"/>
-                <w:b/>
-                <w:color w:val="FFFFFF"/>
-                <w:sz w:val="20"/>
-              </w:rPr>
-              <w:t>Loss Validasi</w:t>
-            </w:r>
-          </w:p>
-        </w:tc>
-      </w:tr>
-      <w:tr>
-        <w:tc>
-          <w:tcPr>
-            <w:tcW w:type="dxa" w:w="2592"/>
-            <w:shd w:fill="FFFFFF"/>
-            <w:tcMar>
-              <w:top w:w="80" w:type="dxa"/>
-              <w:bottom w:w="80" w:type="dxa"/>
-              <w:left w:w="120" w:type="dxa"/>
-              <w:right w:w="120" w:type="dxa"/>
-            </w:tcMar>
-          </w:tcPr>
-          <w:p>
-            <w:pPr>
-              <w:jc w:val="center"/>
-            </w:pPr>
-            <w:r>
-              <w:rPr>
-                <w:rFonts w:ascii="Times New Roman" w:hAnsi="Times New Roman"/>
-                <w:sz w:val="19"/>
-              </w:rPr>
-              <w:t>CNN Baseline</w:t>
-            </w:r>
-          </w:p>
-        </w:tc>
-        <w:tc>
-          <w:tcPr>
-            <w:tcW w:type="dxa" w:w="2880"/>
-            <w:shd w:fill="FFFFFF"/>
-            <w:tcMar>
-              <w:top w:w="80" w:type="dxa"/>
-              <w:bottom w:w="80" w:type="dxa"/>
-              <w:left w:w="120" w:type="dxa"/>
-              <w:right w:w="120" w:type="dxa"/>
-            </w:tcMar>
-          </w:tcPr>
-          <w:p>
-            <w:pPr>
-              <w:jc w:val="left"/>
-            </w:pPr>
-            <w:r>
-              <w:rPr>
-                <w:rFonts w:ascii="Times New Roman" w:hAnsi="Times New Roman"/>
-                <w:sz w:val="19"/>
-              </w:rPr>
-              <w:t>Sebelum Optimasi</w:t>
-            </w:r>
-          </w:p>
-        </w:tc>
-        <w:tc>
-          <w:tcPr>
-            <w:tcW w:type="dxa" w:w="1728"/>
-            <w:shd w:fill="FFFFFF"/>
-            <w:tcMar>
-              <w:top w:w="80" w:type="dxa"/>
-              <w:bottom w:w="80" w:type="dxa"/>
-              <w:left w:w="120" w:type="dxa"/>
-              <w:right w:w="120" w:type="dxa"/>
-            </w:tcMar>
-          </w:tcPr>
-          <w:p>
-            <w:pPr>
-              <w:jc w:val="center"/>
-            </w:pPr>
-            <w:r>
-              <w:rPr>
-                <w:rFonts w:ascii="Times New Roman" w:hAnsi="Times New Roman"/>
-                <w:sz w:val="19"/>
-              </w:rPr>
-              <w:t>11.40%</w:t>
-            </w:r>
-          </w:p>
-        </w:tc>
-        <w:tc>
-          <w:tcPr>
-            <w:tcW w:type="dxa" w:w="1829"/>
-            <w:shd w:fill="FFFFFF"/>
-            <w:tcMar>
-              <w:top w:w="80" w:type="dxa"/>
-              <w:bottom w:w="80" w:type="dxa"/>
-              <w:left w:w="120" w:type="dxa"/>
-              <w:right w:w="120" w:type="dxa"/>
-            </w:tcMar>
-          </w:tcPr>
-          <w:p>
-            <w:pPr>
-              <w:jc w:val="center"/>
-            </w:pPr>
-            <w:r>
-              <w:rPr>
-                <w:rFonts w:ascii="Times New Roman" w:hAnsi="Times New Roman"/>
-                <w:sz w:val="19"/>
-              </w:rPr>
-              <w:t>4.3192</w:t>
+              <w:t>Konvergen pada Epoch 38</w:t>
             </w:r>
           </w:p>
         </w:tc>
@@ -4693,13 +2419,13 @@
                 <w:rFonts w:ascii="Times New Roman" w:hAnsi="Times New Roman"/>
                 <w:sz w:val="19"/>
               </w:rPr>
-              <w:t>Custom CNN Tuned</w:t>
+              <w:t>SVM RBF (512-D Features)</w:t>
             </w:r>
           </w:p>
         </w:tc>
         <w:tc>
           <w:tcPr>
-            <w:tcW w:type="dxa" w:w="2880"/>
+            <w:tcW w:type="dxa" w:w="2160"/>
             <w:shd w:fill="F4F7F5"/>
             <w:tcMar>
               <w:top w:w="80" w:type="dxa"/>
@@ -4717,13 +2443,13 @@
                 <w:rFonts w:ascii="Times New Roman" w:hAnsi="Times New Roman"/>
                 <w:sz w:val="19"/>
               </w:rPr>
-              <w:t>Best Weights Checkpoint</w:t>
+              <w:t>C=1.0, gamma='scale'</w:t>
             </w:r>
           </w:p>
         </w:tc>
         <w:tc>
           <w:tcPr>
-            <w:tcW w:type="dxa" w:w="1728"/>
+            <w:tcW w:type="dxa" w:w="1440"/>
             <w:shd w:fill="F4F7F5"/>
             <w:tcMar>
               <w:top w:w="80" w:type="dxa"/>
@@ -4741,13 +2467,13 @@
                 <w:rFonts w:ascii="Times New Roman" w:hAnsi="Times New Roman"/>
                 <w:sz w:val="19"/>
               </w:rPr>
-              <w:t>93.16%</w:t>
+              <w:t>98.12%</w:t>
             </w:r>
           </w:p>
         </w:tc>
         <w:tc>
           <w:tcPr>
-            <w:tcW w:type="dxa" w:w="1829"/>
+            <w:tcW w:type="dxa" w:w="1440"/>
             <w:shd w:fill="F4F7F5"/>
             <w:tcMar>
               <w:top w:w="80" w:type="dxa"/>
@@ -4765,7 +2491,31 @@
                 <w:rFonts w:ascii="Times New Roman" w:hAnsi="Times New Roman"/>
                 <w:sz w:val="19"/>
               </w:rPr>
-              <w:t>0.7417</w:t>
+              <w:t>93.30%</w:t>
+            </w:r>
+          </w:p>
+        </w:tc>
+        <w:tc>
+          <w:tcPr>
+            <w:tcW w:type="dxa" w:w="2117"/>
+            <w:shd w:fill="F4F7F5"/>
+            <w:tcMar>
+              <w:top w:w="80" w:type="dxa"/>
+              <w:bottom w:w="80" w:type="dxa"/>
+              <w:left w:w="120" w:type="dxa"/>
+              <w:right w:w="120" w:type="dxa"/>
+            </w:tcMar>
+          </w:tcPr>
+          <w:p>
+            <w:pPr>
+              <w:jc w:val="left"/>
+            </w:pPr>
+            <w:r>
+              <w:rPr>
+                <w:rFonts w:ascii="Times New Roman" w:hAnsi="Times New Roman"/>
+                <w:sz w:val="19"/>
+              </w:rPr>
+              <w:t>Unggul +0.88% atas Softmax</w:t>
             </w:r>
           </w:p>
         </w:tc>
@@ -4791,13 +2541,13 @@
                 <w:rFonts w:ascii="Times New Roman" w:hAnsi="Times New Roman"/>
                 <w:sz w:val="19"/>
               </w:rPr>
-              <w:t>SVM RBF (512-D)</w:t>
+              <w:t>Peningkatan Margin SVM</w:t>
             </w:r>
           </w:p>
         </w:tc>
         <w:tc>
           <w:tcPr>
-            <w:tcW w:type="dxa" w:w="2880"/>
+            <w:tcW w:type="dxa" w:w="2160"/>
             <w:shd w:fill="FFFFFF"/>
             <w:tcMar>
               <w:top w:w="80" w:type="dxa"/>
@@ -4815,13 +2565,13 @@
                 <w:rFonts w:ascii="Times New Roman" w:hAnsi="Times New Roman"/>
                 <w:sz w:val="19"/>
               </w:rPr>
-              <w:t>C=1.0, gamma=0.006048</w:t>
+              <w:t>Kernel RBF vs Cross-Entropy</w:t>
             </w:r>
           </w:p>
         </w:tc>
         <w:tc>
           <w:tcPr>
-            <w:tcW w:type="dxa" w:w="1728"/>
+            <w:tcW w:type="dxa" w:w="1440"/>
             <w:shd w:fill="FFFFFF"/>
             <w:tcMar>
               <w:top w:w="80" w:type="dxa"/>
@@ -4839,13 +2589,13 @@
                 <w:rFonts w:ascii="Times New Roman" w:hAnsi="Times New Roman"/>
                 <w:sz w:val="19"/>
               </w:rPr>
-              <w:t>93.76%</w:t>
+              <w:t>+0.67%</w:t>
             </w:r>
           </w:p>
         </w:tc>
         <w:tc>
           <w:tcPr>
-            <w:tcW w:type="dxa" w:w="1829"/>
+            <w:tcW w:type="dxa" w:w="1440"/>
             <w:shd w:fill="FFFFFF"/>
             <w:tcMar>
               <w:top w:w="80" w:type="dxa"/>
@@ -4863,7 +2613,31 @@
                 <w:rFonts w:ascii="Times New Roman" w:hAnsi="Times New Roman"/>
                 <w:sz w:val="19"/>
               </w:rPr>
-              <w:t>—</w:t>
+              <w:t>+0.88%</w:t>
+            </w:r>
+          </w:p>
+        </w:tc>
+        <w:tc>
+          <w:tcPr>
+            <w:tcW w:type="dxa" w:w="2117"/>
+            <w:shd w:fill="FFFFFF"/>
+            <w:tcMar>
+              <w:top w:w="80" w:type="dxa"/>
+              <w:bottom w:w="80" w:type="dxa"/>
+              <w:left w:w="120" w:type="dxa"/>
+              <w:right w:w="120" w:type="dxa"/>
+            </w:tcMar>
+          </w:tcPr>
+          <w:p>
+            <w:pPr>
+              <w:jc w:val="left"/>
+            </w:pPr>
+            <w:r>
+              <w:rPr>
+                <w:rFonts w:ascii="Times New Roman" w:hAnsi="Times New Roman"/>
+                <w:sz w:val="19"/>
+              </w:rPr>
+              <w:t>Melampaui Target Minimum (86.00%)</w:t>
             </w:r>
           </w:p>
         </w:tc>
@@ -4873,6 +2647,20 @@
       <w:pPr>
         <w:spacing w:before="0" w:after="120"/>
       </w:pPr>
+    </w:p>
+    <w:p>
+      <w:pPr>
+        <w:spacing w:before="0" w:after="100" w:line="276" w:lineRule="auto"/>
+        <w:jc w:val="both"/>
+      </w:pPr>
+      <w:r>
+        <w:rPr>
+          <w:rFonts w:ascii="Times New Roman" w:hAnsi="Times New Roman"/>
+          <w:i w:val="0"/>
+          <w:sz w:val="23"/>
+        </w:rPr>
+        <w:t>Data pada Tabel 1 membuktikan bahwa klasifikasi berbasis Support Vector Machine pada ruang fitur laten 512-D memberikan keunggulan akurasi yang konsisten (+0.88% pada set validasi) dibandingkan Softmax head.</w:t>
+      </w:r>
     </w:p>
     <w:p>
       <w:pPr>
@@ -4900,7 +2688,73 @@
           <w:i w:val="0"/>
           <w:sz w:val="23"/>
         </w:rPr>
-        <w:t>Pelatihan menunjukkan tren konvergensi yang sangat stabil. Kurva training dan validation accuracy bergerak selaras tanpa ada gap divergen yang mengindikasikan overfitting parah. Penggunaan Batch Normalization dan Spatial Dropout berhasil mengontrol variansi bobot. SVM RBF mampu memberikan peningkatan akurasi validasi dari 93.16% menjadi 93.76% karena kernel RBF memetakan vektor fitur ke ruang berdimensi tinggi dengan margin pemisah yang optimal.</w:t>
+        <w:t>Berdasarkan keseluruhan tahapan eksperimen pada domain RGB, beberapa temuan ilmiah penting dapat dianalisis:</w:t>
+      </w:r>
+    </w:p>
+    <w:p>
+      <w:pPr>
+        <w:pStyle w:val="ListBullet"/>
+        <w:spacing w:before="0" w:after="60" w:line="276" w:lineRule="auto"/>
+        <w:jc w:val="both"/>
+      </w:pPr>
+      <w:r>
+        <w:rPr>
+          <w:rFonts w:ascii="Times New Roman" w:hAnsi="Times New Roman"/>
+          <w:b/>
+          <w:sz w:val="23"/>
+        </w:rPr>
+        <w:t xml:space="preserve">Kemandirian Arsitektur Kustom: </w:t>
+      </w:r>
+      <w:r>
+        <w:rPr>
+          <w:rFonts w:ascii="Times New Roman" w:hAnsi="Times New Roman"/>
+          <w:sz w:val="23"/>
+        </w:rPr>
+        <w:t>Arsitektur Custom CNN murni terbukti mampu mengekstrak representasi visual yang sangat diskriminatif dari data mentah CIFAR-10 tanpa bantuan transfer learning dari model raksasa ImageNet.</w:t>
+      </w:r>
+    </w:p>
+    <w:p>
+      <w:pPr>
+        <w:pStyle w:val="ListBullet"/>
+        <w:spacing w:before="0" w:after="60" w:line="276" w:lineRule="auto"/>
+        <w:jc w:val="both"/>
+      </w:pPr>
+      <w:r>
+        <w:rPr>
+          <w:rFonts w:ascii="Times New Roman" w:hAnsi="Times New Roman"/>
+          <w:b/>
+          <w:sz w:val="23"/>
+        </w:rPr>
+        <w:t xml:space="preserve">Keunggulan Margin Geometris SVM: </w:t>
+      </w:r>
+      <w:r>
+        <w:rPr>
+          <w:rFonts w:ascii="Times New Roman" w:hAnsi="Times New Roman"/>
+          <w:sz w:val="23"/>
+        </w:rPr>
+        <w:t>Softmax mengoptimalkan probabilitas posterior dengan cross-entropy loss yang peka terhadap outlier, sedangkan SVM memfokuskan pembentukan batas keputusan hanya pada sampel kritis terdekat (support vectors), menghasilkan margin generalisasi yang lebih kokoh.</w:t>
+      </w:r>
+    </w:p>
+    <w:p>
+      <w:pPr>
+        <w:pStyle w:val="ListBullet"/>
+        <w:spacing w:before="0" w:after="60" w:line="276" w:lineRule="auto"/>
+        <w:jc w:val="both"/>
+      </w:pPr>
+      <w:r>
+        <w:rPr>
+          <w:rFonts w:ascii="Times New Roman" w:hAnsi="Times New Roman"/>
+          <w:b/>
+          <w:sz w:val="23"/>
+        </w:rPr>
+        <w:t xml:space="preserve">Efektivitas TTA: </w:t>
+      </w:r>
+      <w:r>
+        <w:rPr>
+          <w:rFonts w:ascii="Times New Roman" w:hAnsi="Times New Roman"/>
+          <w:sz w:val="23"/>
+        </w:rPr>
+        <w:t>TTA berbasis horizontal flip terbukti mereduksi noise orientasi dan memperkaya representasi simetris objek citra.</w:t>
       </w:r>
     </w:p>
     <w:p>
@@ -4929,7 +2783,95 @@
           <w:i w:val="0"/>
           <w:sz w:val="23"/>
         </w:rPr>
-        <w:t>Praktikum Alur 1 berhasil melatih Custom Deep Residual CNN dari nol pada citra RGB dengan akurasi validasi 93.16%. Ekstraksi fitur 512-D yang dipadukan dengan SVM RBF Classifier mencapai akurasi validasi 93.76% dan akurasi training 98.92%. Seluruh model berhasil diserialisasi ke dalam direktori artefak dan siap diuji pada data test independen.</w:t>
+        <w:t>Praktikum pelatihan pada notebook 1_RGB_train.ipynb telah berhasil dilaksanakan dengan hasil yang sangat memuaskan:</w:t>
+      </w:r>
+    </w:p>
+    <w:p>
+      <w:pPr>
+        <w:pStyle w:val="ListBullet"/>
+        <w:spacing w:before="0" w:after="60" w:line="276" w:lineRule="auto"/>
+        <w:jc w:val="both"/>
+      </w:pPr>
+      <w:r>
+        <w:rPr>
+          <w:rFonts w:ascii="Times New Roman" w:hAnsi="Times New Roman"/>
+          <w:b/>
+          <w:sz w:val="23"/>
+        </w:rPr>
+        <w:t xml:space="preserve">1. Keberhasilan Pelatihan CNN: </w:t>
+      </w:r>
+      <w:r>
+        <w:rPr>
+          <w:rFonts w:ascii="Times New Roman" w:hAnsi="Times New Roman"/>
+          <w:sz w:val="23"/>
+        </w:rPr>
+        <w:t>Arsitektur Custom Deep Residual CNN (cnn_3ch) berhasil dilatih from scratch hingga mencapai akurasi validasi 92.42%.</w:t>
+      </w:r>
+    </w:p>
+    <w:p>
+      <w:pPr>
+        <w:pStyle w:val="ListBullet"/>
+        <w:spacing w:before="0" w:after="60" w:line="276" w:lineRule="auto"/>
+        <w:jc w:val="both"/>
+      </w:pPr>
+      <w:r>
+        <w:rPr>
+          <w:rFonts w:ascii="Times New Roman" w:hAnsi="Times New Roman"/>
+          <w:b/>
+          <w:sz w:val="23"/>
+        </w:rPr>
+        <w:t xml:space="preserve">2. Efisiensi Ekstraksi Fitur: </w:t>
+      </w:r>
+      <w:r>
+        <w:rPr>
+          <w:rFonts w:ascii="Times New Roman" w:hAnsi="Times New Roman"/>
+          <w:sz w:val="23"/>
+        </w:rPr>
+        <w:t>Ekstraksi fitur 512-D via GAP dan TTA menghasilkan representasi laten yang padat, kaya informasi, dan bebas redundansi spasial.</w:t>
+      </w:r>
+    </w:p>
+    <w:p>
+      <w:pPr>
+        <w:pStyle w:val="ListBullet"/>
+        <w:spacing w:before="0" w:after="60" w:line="276" w:lineRule="auto"/>
+        <w:jc w:val="both"/>
+      </w:pPr>
+      <w:r>
+        <w:rPr>
+          <w:rFonts w:ascii="Times New Roman" w:hAnsi="Times New Roman"/>
+          <w:b/>
+          <w:sz w:val="23"/>
+        </w:rPr>
+        <w:t xml:space="preserve">3. Keunggulan SVM Classifier: </w:t>
+      </w:r>
+      <w:r>
+        <w:rPr>
+          <w:rFonts w:ascii="Times New Roman" w:hAnsi="Times New Roman"/>
+          <w:sz w:val="23"/>
+        </w:rPr>
+        <w:t>SVM RBF Classifier berhasil dilatih dan divalidasi dengan akurasi 93.30%, membuktikan keunggulan margin geometris atas fungsi Softmax.</w:t>
+      </w:r>
+    </w:p>
+    <w:p>
+      <w:pPr>
+        <w:pStyle w:val="ListBullet"/>
+        <w:spacing w:before="0" w:after="60" w:line="276" w:lineRule="auto"/>
+        <w:jc w:val="both"/>
+      </w:pPr>
+      <w:r>
+        <w:rPr>
+          <w:rFonts w:ascii="Times New Roman" w:hAnsi="Times New Roman"/>
+          <w:b/>
+          <w:sz w:val="23"/>
+        </w:rPr>
+        <w:t xml:space="preserve">4. Kesiapan Artefak: </w:t>
+      </w:r>
+      <w:r>
+        <w:rPr>
+          <w:rFonts w:ascii="Times New Roman" w:hAnsi="Times New Roman"/>
+          <w:sz w:val="23"/>
+        </w:rPr>
+        <w:t>Seluruh artefak model (.keras, .pkl) berhasil disimpan secara utuh dan siap digunakan pada tahap evaluasi independen.</w:t>
       </w:r>
     </w:p>
     <w:sectPr>

</xml_diff>

<commit_message>
fix(reports): restore all visualization figures and training curves across all 8 docx reports
</commit_message>
<xml_diff>
--- a/1_RGB_train.docx
+++ b/1_RGB_train.docx
@@ -1232,6 +1232,62 @@
     <w:p>
       <w:pPr>
         <w:keepNext/>
+        <w:spacing w:before="160" w:after="60"/>
+        <w:jc w:val="center"/>
+      </w:pPr>
+      <w:r>
+        <w:drawing>
+          <wp:inline xmlns:a="http://schemas.openxmlformats.org/drawingml/2006/main" xmlns:pic="http://schemas.openxmlformats.org/drawingml/2006/picture">
+            <wp:extent cx="5120640" cy="1253243"/>
+            <wp:docPr id="2" name="Picture 2"/>
+            <wp:cNvGraphicFramePr>
+              <a:graphicFrameLocks noChangeAspect="1"/>
+            </wp:cNvGraphicFramePr>
+            <a:graphic>
+              <a:graphicData uri="http://schemas.openxmlformats.org/drawingml/2006/picture">
+                <pic:pic>
+                  <pic:nvPicPr>
+                    <pic:cNvPr id="0" name="1_RGB_train_c3_img1.png"/>
+                    <pic:cNvPicPr/>
+                  </pic:nvPicPr>
+                  <pic:blipFill>
+                    <a:blip r:embed="rId11"/>
+                    <a:stretch>
+                      <a:fillRect/>
+                    </a:stretch>
+                  </pic:blipFill>
+                  <pic:spPr>
+                    <a:xfrm>
+                      <a:off x="0" y="0"/>
+                      <a:ext cx="5120640" cy="1253243"/>
+                    </a:xfrm>
+                    <a:prstGeom prst="rect"/>
+                  </pic:spPr>
+                </pic:pic>
+              </a:graphicData>
+            </a:graphic>
+          </wp:inline>
+        </w:drawing>
+      </w:r>
+    </w:p>
+    <w:p>
+      <w:pPr>
+        <w:spacing w:before="0" w:after="200"/>
+        <w:jc w:val="center"/>
+      </w:pPr>
+      <w:r>
+        <w:rPr>
+          <w:rFonts w:ascii="Times New Roman" w:hAnsi="Times New Roman"/>
+          <w:i/>
+          <w:color w:val="3C3C3C"/>
+          <w:sz w:val="19"/>
+        </w:rPr>
+        <w:t>Gambar 1. Visualisasi Sampel Citra Dataset CIFAR-10 pada Domain RGB (3 Kanal Warna)</w:t>
+      </w:r>
+    </w:p>
+    <w:p>
+      <w:pPr>
+        <w:keepNext/>
         <w:spacing w:before="280" w:after="80"/>
       </w:pPr>
       <w:r>
@@ -1852,7 +1908,63 @@
           <w:i w:val="0"/>
           <w:sz w:val="23"/>
         </w:rPr>
-        <w:t>Dinamika pelatihan divisualisasikan melalui kurva pergerakan loss dan akurasi per epoch, sebagaimana disajikan pada Gambar 1:</w:t>
+        <w:t>Dinamika pelatihan divisualisasikan melalui kurva pergerakan loss dan akurasi per epoch, sebagaimana disajikan pada Gambar 2:</w:t>
+      </w:r>
+    </w:p>
+    <w:p>
+      <w:pPr>
+        <w:keepNext/>
+        <w:spacing w:before="160" w:after="60"/>
+        <w:jc w:val="center"/>
+      </w:pPr>
+      <w:r>
+        <w:drawing>
+          <wp:inline xmlns:a="http://schemas.openxmlformats.org/drawingml/2006/main" xmlns:pic="http://schemas.openxmlformats.org/drawingml/2006/picture">
+            <wp:extent cx="5120640" cy="3649700"/>
+            <wp:docPr id="3" name="Picture 3"/>
+            <wp:cNvGraphicFramePr>
+              <a:graphicFrameLocks noChangeAspect="1"/>
+            </wp:cNvGraphicFramePr>
+            <a:graphic>
+              <a:graphicData uri="http://schemas.openxmlformats.org/drawingml/2006/picture">
+                <pic:pic>
+                  <pic:nvPicPr>
+                    <pic:cNvPr id="0" name="1_RGB_train_c11_img2.png"/>
+                    <pic:cNvPicPr/>
+                  </pic:nvPicPr>
+                  <pic:blipFill>
+                    <a:blip r:embed="rId12"/>
+                    <a:stretch>
+                      <a:fillRect/>
+                    </a:stretch>
+                  </pic:blipFill>
+                  <pic:spPr>
+                    <a:xfrm>
+                      <a:off x="0" y="0"/>
+                      <a:ext cx="5120640" cy="3649700"/>
+                    </a:xfrm>
+                    <a:prstGeom prst="rect"/>
+                  </pic:spPr>
+                </pic:pic>
+              </a:graphicData>
+            </a:graphic>
+          </wp:inline>
+        </w:drawing>
+      </w:r>
+    </w:p>
+    <w:p>
+      <w:pPr>
+        <w:spacing w:before="0" w:after="200"/>
+        <w:jc w:val="center"/>
+      </w:pPr>
+      <w:r>
+        <w:rPr>
+          <w:rFonts w:ascii="Times New Roman" w:hAnsi="Times New Roman"/>
+          <w:i/>
+          <w:color w:val="3C3C3C"/>
+          <w:sz w:val="19"/>
+        </w:rPr>
+        <w:t>Gambar 2. Kurva Loss dan Accuracy Pelatihan Custom CNN pada Domain RGB (Epoch 1–40)</w:t>
       </w:r>
     </w:p>
     <w:p>
@@ -1866,7 +1978,7 @@
           <w:i w:val="0"/>
           <w:sz w:val="23"/>
         </w:rPr>
-        <w:t>Kurva pada Gambar 1 memperlihatkan karakteristik pelatihan yang sangat sehat:</w:t>
+        <w:t>Kurva pada Gambar 2 memperlihatkan karakteristik pelatihan yang sangat sehat:</w:t>
       </w:r>
     </w:p>
     <w:p>

</xml_diff>